<commit_message>
Updated cheat sheet as well as improved index.
</commit_message>
<xml_diff>
--- a/downloads/Critical_Care_Billing_Cheat_Sheet_2026.docx
+++ b/downloads/Critical_Care_Billing_Cheat_Sheet_2026.docx
@@ -212,6 +212,166 @@
           <w:szCs w:val="20"/>
         </w:rPr>
         <w:t xml:space="preserve">The dollar figures throughout this sheet use national, unadjusted total facility RVUs × $33.40. Your local payment will vary with GPCI. wRVU columns are what most productivity / compensation models track.</w:t>
+      </w:r>
+    </w:p>
+    <w:p>
+      <w:pPr>
+        <w:pStyle w:val="Heading2"/>
+      </w:pPr>
+      <w:r>
+        <w:t xml:space="preserve">Facility vs professional — two separate money streams</w:t>
+      </w:r>
+    </w:p>
+    <w:p>
+      <w:pPr>
+        <w:spacing w:after="80"/>
+      </w:pPr>
+      <w:r>
+        <w:rPr>
+          <w:b w:val="false"/>
+          <w:bCs w:val="false"/>
+          <w:i w:val="false"/>
+          <w:iCs w:val="false"/>
+          <w:sz w:val="20"/>
+          <w:szCs w:val="20"/>
+        </w:rPr>
+        <w:t xml:space="preserve">One ICU stay generates two independent bills that never come out of each other. The hospital is paid one MS-DRG under Medicare Part A (IPPS); your professional work is billed separately under Medicare Part B (Physician Fee Schedule, CPT codes). Two claims, separate deductibles — the physician fee is not carved out of the DRG.</w:t>
+      </w:r>
+    </w:p>
+    <w:p>
+      <w:pPr>
+        <w:pStyle w:val="Heading2"/>
+      </w:pPr>
+      <w:r>
+        <w:t xml:space="preserve">Common questions — facility vs professional</w:t>
+      </w:r>
+    </w:p>
+    <w:p>
+      <w:pPr>
+        <w:spacing w:after="40"/>
+      </w:pPr>
+      <w:r>
+        <w:rPr>
+          <w:b/>
+          <w:bCs/>
+          <w:i w:val="false"/>
+          <w:iCs w:val="false"/>
+          <w:sz w:val="20"/>
+          <w:szCs w:val="20"/>
+        </w:rPr>
+        <w:t xml:space="preserve">Can a hospital be reimbursed for multiple DRGs in one hospitalization?</w:t>
+      </w:r>
+    </w:p>
+    <w:p>
+      <w:pPr>
+        <w:spacing w:after="100"/>
+      </w:pPr>
+      <w:r>
+        <w:rPr>
+          <w:b w:val="false"/>
+          <w:bCs w:val="false"/>
+          <w:i w:val="false"/>
+          <w:iCs w:val="false"/>
+          <w:sz w:val="20"/>
+          <w:szCs w:val="20"/>
+        </w:rPr>
+        <w:t xml:space="preserve">Generally no — one MS-DRG per discharge. The entire stay groups to a single DRG. Outlier payments, New Technology Add-On Payments (NTAP), and DSH/IME adjustments can increase that one payment but are not additional DRGs. Genuinely separate admissions are separate DRGs; a same-day, same-hospital readmission for a related condition must be combined onto one claim; a transferring hospital is usually paid a reduced per-diem rather than the full DRG.</w:t>
+      </w:r>
+    </w:p>
+    <w:p>
+      <w:pPr>
+        <w:spacing w:after="40"/>
+      </w:pPr>
+      <w:r>
+        <w:rPr>
+          <w:b/>
+          <w:bCs/>
+          <w:i w:val="false"/>
+          <w:iCs w:val="false"/>
+          <w:sz w:val="20"/>
+          <w:szCs w:val="20"/>
+        </w:rPr>
+        <w:t xml:space="preserve">Is the DRG billed separately from the physician component, or does the physician fee come out of the DRG?</w:t>
+      </w:r>
+    </w:p>
+    <w:p>
+      <w:pPr>
+        <w:spacing w:after="100"/>
+      </w:pPr>
+      <w:r>
+        <w:rPr>
+          <w:b w:val="false"/>
+          <w:bCs w:val="false"/>
+          <w:i w:val="false"/>
+          <w:iCs w:val="false"/>
+          <w:sz w:val="20"/>
+          <w:szCs w:val="20"/>
+        </w:rPr>
+        <w:t xml:space="preserve">Separate — the physician fee does not come out of the DRG. The DRG is the hospital's facility payment under Part A; your professional work is billed independently under Part B. As an employed academic attending, your Part B payment may flow to the faculty practice plan, but it is still a distinct claim, never part of the DRG.</w:t>
+      </w:r>
+    </w:p>
+    <w:p>
+      <w:pPr>
+        <w:spacing w:after="40"/>
+      </w:pPr>
+      <w:r>
+        <w:rPr>
+          <w:b/>
+          <w:bCs/>
+          <w:i w:val="false"/>
+          <w:iCs w:val="false"/>
+          <w:sz w:val="20"/>
+          <w:szCs w:val="20"/>
+        </w:rPr>
+        <w:t xml:space="preserve">What costs come out of the DRG?</w:t>
+      </w:r>
+    </w:p>
+    <w:p>
+      <w:pPr>
+        <w:spacing w:after="100"/>
+      </w:pPr>
+      <w:r>
+        <w:rPr>
+          <w:b w:val="false"/>
+          <w:bCs w:val="false"/>
+          <w:i w:val="false"/>
+          <w:iCs w:val="false"/>
+          <w:sz w:val="20"/>
+          <w:szCs w:val="20"/>
+        </w:rPr>
+        <w:t xml:space="preserve">The facility's cost of the stay: room/bed and ICU overhead, nursing, drugs and supplies, blood products, implanted devices, and the technical component of labs and imaging. NOT physician professional services, which are billed separately under Part B.</w:t>
+      </w:r>
+    </w:p>
+    <w:p>
+      <w:pPr>
+        <w:spacing w:after="40"/>
+      </w:pPr>
+      <w:r>
+        <w:rPr>
+          <w:b/>
+          <w:bCs/>
+          <w:i w:val="false"/>
+          <w:iCs w:val="false"/>
+          <w:sz w:val="20"/>
+          <w:szCs w:val="20"/>
+        </w:rPr>
+        <w:t xml:space="preserve">Once you've captured a single MCC, is there any point to capturing more CCs?</w:t>
+      </w:r>
+    </w:p>
+    <w:p>
+      <w:pPr>
+        <w:spacing w:after="100"/>
+      </w:pPr>
+      <w:r>
+        <w:rPr>
+          <w:b w:val="false"/>
+          <w:bCs w:val="false"/>
+          <w:i w:val="false"/>
+          <w:iCs w:val="false"/>
+          <w:sz w:val="20"/>
+          <w:szCs w:val="20"/>
+        </w:rPr>
+        <w:t xml:space="preserve">For this stay's Medicare MS-DRG payment, no extra dollars — one MCC already maxes the severity tier. But keep capturing them: APR-DRG / SOI-ROM systems (many commercial, Medicaid, and pediatric payers) escalate with each additional secondary diagnosis; risk adjustment, expected mortality, O:E ratios and profiling depend on full comorbidity capture; and a second MCC/CC protects the tier if the first is denied, recoded, or turns out to be the principal diagnosis.</w:t>
       </w:r>
     </w:p>
     <w:p>
@@ -7310,7 +7470,3208 @@
         <w:pStyle w:val="Heading1"/>
       </w:pPr>
       <w:r>
-        <w:t xml:space="preserve">6. Common ICU Diagnoses (ICD-10) &amp; Specificity</w:t>
+        <w:t xml:space="preserve">6. Procedures That Drive the DRG — ICD-10-PCS</w:t>
+      </w:r>
+    </w:p>
+    <w:p>
+      <w:pPr>
+        <w:spacing w:after="80"/>
+      </w:pPr>
+      <w:r>
+        <w:rPr>
+          <w:b w:val="false"/>
+          <w:bCs w:val="false"/>
+          <w:i w:val="false"/>
+          <w:iCs w:val="false"/>
+          <w:sz w:val="20"/>
+          <w:szCs w:val="20"/>
+        </w:rPr>
+        <w:t xml:space="preserve">ICD-10-PCS is the facility procedure code set on the hospital claim — separate from the CPT codes you bill professionally (the same event, e.g. intubation, can carry both). Every PCS code is 7 characters, each an independent axis: section, body system, root operation, body part, approach, device/duration, qualifier. The coder builds it only from provider documentation and cannot infer a missing axis — so what you write decides which code lands and which DRG the case reaches.</w:t>
+      </w:r>
+    </w:p>
+    <w:p>
+      <w:pPr>
+        <w:pStyle w:val="Heading2"/>
+      </w:pPr>
+      <w:r>
+        <w:t xml:space="preserve">Worked example 1 — mechanical ventilation (5A1955Z, &gt;96h)</w:t>
+      </w:r>
+    </w:p>
+    <w:tbl>
+      <w:tblPr>
+        <w:tblW w:type="dxa" w:w="9360"/>
+        <w:tblBorders>
+          <w:top w:val="single" w:color="auto" w:sz="4"/>
+          <w:left w:val="single" w:color="auto" w:sz="4"/>
+          <w:bottom w:val="single" w:color="auto" w:sz="4"/>
+          <w:right w:val="single" w:color="auto" w:sz="4"/>
+          <w:insideH w:val="single" w:color="auto" w:sz="4"/>
+          <w:insideV w:val="single" w:color="auto" w:sz="4"/>
+        </w:tblBorders>
+      </w:tblPr>
+      <w:tblGrid>
+        <w:gridCol w:w="700"/>
+        <w:gridCol w:w="700"/>
+        <w:gridCol w:w="2200"/>
+        <w:gridCol w:w="5760"/>
+      </w:tblGrid>
+      <w:tr>
+        <w:trPr>
+          <w:tblHeader/>
+        </w:trPr>
+        <w:tc>
+          <w:tcPr>
+            <w:tcW w:type="dxa" w:w="700"/>
+            <w:tcBorders>
+              <w:top w:val="single" w:color="B7C6DA" w:sz="1"/>
+              <w:left w:val="single" w:color="B7C6DA" w:sz="1"/>
+              <w:bottom w:val="single" w:color="B7C6DA" w:sz="1"/>
+              <w:right w:val="single" w:color="B7C6DA" w:sz="1"/>
+            </w:tcBorders>
+            <w:shd w:fill="1F3864" w:val="clear"/>
+            <w:tcMar>
+              <w:top w:type="dxa" w:w="60"/>
+              <w:left w:type="dxa" w:w="110"/>
+              <w:bottom w:type="dxa" w:w="60"/>
+              <w:right w:type="dxa" w:w="110"/>
+            </w:tcMar>
+            <w:vAlign w:val="center"/>
+          </w:tcPr>
+          <w:p>
+            <w:r>
+              <w:rPr>
+                <w:b/>
+                <w:bCs/>
+                <w:color w:val="FFFFFF"/>
+                <w:sz w:val="18"/>
+                <w:szCs w:val="18"/>
+              </w:rPr>
+              <w:t xml:space="preserve">Char</w:t>
+            </w:r>
+          </w:p>
+        </w:tc>
+        <w:tc>
+          <w:tcPr>
+            <w:tcW w:type="dxa" w:w="700"/>
+            <w:tcBorders>
+              <w:top w:val="single" w:color="B7C6DA" w:sz="1"/>
+              <w:left w:val="single" w:color="B7C6DA" w:sz="1"/>
+              <w:bottom w:val="single" w:color="B7C6DA" w:sz="1"/>
+              <w:right w:val="single" w:color="B7C6DA" w:sz="1"/>
+            </w:tcBorders>
+            <w:shd w:fill="1F3864" w:val="clear"/>
+            <w:tcMar>
+              <w:top w:type="dxa" w:w="60"/>
+              <w:left w:type="dxa" w:w="110"/>
+              <w:bottom w:type="dxa" w:w="60"/>
+              <w:right w:type="dxa" w:w="110"/>
+            </w:tcMar>
+            <w:vAlign w:val="center"/>
+          </w:tcPr>
+          <w:p>
+            <w:r>
+              <w:rPr>
+                <w:b/>
+                <w:bCs/>
+                <w:color w:val="FFFFFF"/>
+                <w:sz w:val="18"/>
+                <w:szCs w:val="18"/>
+              </w:rPr>
+              <w:t xml:space="preserve">Value</w:t>
+            </w:r>
+          </w:p>
+        </w:tc>
+        <w:tc>
+          <w:tcPr>
+            <w:tcW w:type="dxa" w:w="2200"/>
+            <w:tcBorders>
+              <w:top w:val="single" w:color="B7C6DA" w:sz="1"/>
+              <w:left w:val="single" w:color="B7C6DA" w:sz="1"/>
+              <w:bottom w:val="single" w:color="B7C6DA" w:sz="1"/>
+              <w:right w:val="single" w:color="B7C6DA" w:sz="1"/>
+            </w:tcBorders>
+            <w:shd w:fill="1F3864" w:val="clear"/>
+            <w:tcMar>
+              <w:top w:type="dxa" w:w="60"/>
+              <w:left w:type="dxa" w:w="110"/>
+              <w:bottom w:type="dxa" w:w="60"/>
+              <w:right w:type="dxa" w:w="110"/>
+            </w:tcMar>
+            <w:vAlign w:val="center"/>
+          </w:tcPr>
+          <w:p>
+            <w:r>
+              <w:rPr>
+                <w:b/>
+                <w:bCs/>
+                <w:color w:val="FFFFFF"/>
+                <w:sz w:val="18"/>
+                <w:szCs w:val="18"/>
+              </w:rPr>
+              <w:t xml:space="preserve">Axis</w:t>
+            </w:r>
+          </w:p>
+        </w:tc>
+        <w:tc>
+          <w:tcPr>
+            <w:tcW w:type="dxa" w:w="5760"/>
+            <w:tcBorders>
+              <w:top w:val="single" w:color="B7C6DA" w:sz="1"/>
+              <w:left w:val="single" w:color="B7C6DA" w:sz="1"/>
+              <w:bottom w:val="single" w:color="B7C6DA" w:sz="1"/>
+              <w:right w:val="single" w:color="B7C6DA" w:sz="1"/>
+            </w:tcBorders>
+            <w:shd w:fill="1F3864" w:val="clear"/>
+            <w:tcMar>
+              <w:top w:type="dxa" w:w="60"/>
+              <w:left w:type="dxa" w:w="110"/>
+              <w:bottom w:type="dxa" w:w="60"/>
+              <w:right w:type="dxa" w:w="110"/>
+            </w:tcMar>
+            <w:vAlign w:val="center"/>
+          </w:tcPr>
+          <w:p>
+            <w:r>
+              <w:rPr>
+                <w:b/>
+                <w:bCs/>
+                <w:color w:val="FFFFFF"/>
+                <w:sz w:val="18"/>
+                <w:szCs w:val="18"/>
+              </w:rPr>
+              <w:t xml:space="preserve">Meaning</w:t>
+            </w:r>
+          </w:p>
+        </w:tc>
+      </w:tr>
+      <w:tr>
+        <w:tc>
+          <w:tcPr>
+            <w:tcW w:type="dxa" w:w="700"/>
+            <w:tcBorders>
+              <w:top w:val="single" w:color="B7C6DA" w:sz="1"/>
+              <w:left w:val="single" w:color="B7C6DA" w:sz="1"/>
+              <w:bottom w:val="single" w:color="B7C6DA" w:sz="1"/>
+              <w:right w:val="single" w:color="B7C6DA" w:sz="1"/>
+            </w:tcBorders>
+            <w:shd w:fill="FFFFFF" w:val="clear"/>
+            <w:tcMar>
+              <w:top w:type="dxa" w:w="60"/>
+              <w:left w:type="dxa" w:w="110"/>
+              <w:bottom w:type="dxa" w:w="60"/>
+              <w:right w:type="dxa" w:w="110"/>
+            </w:tcMar>
+            <w:vAlign w:val="center"/>
+          </w:tcPr>
+          <w:p>
+            <w:r>
+              <w:rPr>
+                <w:b w:val="false"/>
+                <w:bCs w:val="false"/>
+                <w:sz w:val="18"/>
+                <w:szCs w:val="18"/>
+              </w:rPr>
+              <w:t xml:space="preserve">1</w:t>
+            </w:r>
+          </w:p>
+        </w:tc>
+        <w:tc>
+          <w:tcPr>
+            <w:tcW w:type="dxa" w:w="700"/>
+            <w:tcBorders>
+              <w:top w:val="single" w:color="B7C6DA" w:sz="1"/>
+              <w:left w:val="single" w:color="B7C6DA" w:sz="1"/>
+              <w:bottom w:val="single" w:color="B7C6DA" w:sz="1"/>
+              <w:right w:val="single" w:color="B7C6DA" w:sz="1"/>
+            </w:tcBorders>
+            <w:shd w:fill="FFFFFF" w:val="clear"/>
+            <w:tcMar>
+              <w:top w:type="dxa" w:w="60"/>
+              <w:left w:type="dxa" w:w="110"/>
+              <w:bottom w:type="dxa" w:w="60"/>
+              <w:right w:type="dxa" w:w="110"/>
+            </w:tcMar>
+            <w:vAlign w:val="center"/>
+          </w:tcPr>
+          <w:p>
+            <w:r>
+              <w:rPr>
+                <w:b w:val="false"/>
+                <w:bCs w:val="false"/>
+                <w:sz w:val="18"/>
+                <w:szCs w:val="18"/>
+              </w:rPr>
+              <w:t xml:space="preserve">5</w:t>
+            </w:r>
+          </w:p>
+        </w:tc>
+        <w:tc>
+          <w:tcPr>
+            <w:tcW w:type="dxa" w:w="2200"/>
+            <w:tcBorders>
+              <w:top w:val="single" w:color="B7C6DA" w:sz="1"/>
+              <w:left w:val="single" w:color="B7C6DA" w:sz="1"/>
+              <w:bottom w:val="single" w:color="B7C6DA" w:sz="1"/>
+              <w:right w:val="single" w:color="B7C6DA" w:sz="1"/>
+            </w:tcBorders>
+            <w:shd w:fill="FFFFFF" w:val="clear"/>
+            <w:tcMar>
+              <w:top w:type="dxa" w:w="60"/>
+              <w:left w:type="dxa" w:w="110"/>
+              <w:bottom w:type="dxa" w:w="60"/>
+              <w:right w:type="dxa" w:w="110"/>
+            </w:tcMar>
+            <w:vAlign w:val="center"/>
+          </w:tcPr>
+          <w:p>
+            <w:r>
+              <w:rPr>
+                <w:b w:val="false"/>
+                <w:bCs w:val="false"/>
+                <w:sz w:val="18"/>
+                <w:szCs w:val="18"/>
+              </w:rPr>
+              <w:t xml:space="preserve">Section</w:t>
+            </w:r>
+          </w:p>
+        </w:tc>
+        <w:tc>
+          <w:tcPr>
+            <w:tcW w:type="dxa" w:w="5760"/>
+            <w:tcBorders>
+              <w:top w:val="single" w:color="B7C6DA" w:sz="1"/>
+              <w:left w:val="single" w:color="B7C6DA" w:sz="1"/>
+              <w:bottom w:val="single" w:color="B7C6DA" w:sz="1"/>
+              <w:right w:val="single" w:color="B7C6DA" w:sz="1"/>
+            </w:tcBorders>
+            <w:shd w:fill="FFFFFF" w:val="clear"/>
+            <w:tcMar>
+              <w:top w:type="dxa" w:w="60"/>
+              <w:left w:type="dxa" w:w="110"/>
+              <w:bottom w:type="dxa" w:w="60"/>
+              <w:right w:type="dxa" w:w="110"/>
+            </w:tcMar>
+            <w:vAlign w:val="center"/>
+          </w:tcPr>
+          <w:p>
+            <w:r>
+              <w:rPr>
+                <w:b w:val="false"/>
+                <w:bCs w:val="false"/>
+                <w:sz w:val="18"/>
+                <w:szCs w:val="18"/>
+              </w:rPr>
+              <w:t xml:space="preserve">Extracorporeal or Systemic Assistance and Performance</w:t>
+            </w:r>
+          </w:p>
+        </w:tc>
+      </w:tr>
+      <w:tr>
+        <w:tc>
+          <w:tcPr>
+            <w:tcW w:type="dxa" w:w="700"/>
+            <w:tcBorders>
+              <w:top w:val="single" w:color="B7C6DA" w:sz="1"/>
+              <w:left w:val="single" w:color="B7C6DA" w:sz="1"/>
+              <w:bottom w:val="single" w:color="B7C6DA" w:sz="1"/>
+              <w:right w:val="single" w:color="B7C6DA" w:sz="1"/>
+            </w:tcBorders>
+            <w:shd w:fill="EAF1F8" w:val="clear"/>
+            <w:tcMar>
+              <w:top w:type="dxa" w:w="60"/>
+              <w:left w:type="dxa" w:w="110"/>
+              <w:bottom w:type="dxa" w:w="60"/>
+              <w:right w:type="dxa" w:w="110"/>
+            </w:tcMar>
+            <w:vAlign w:val="center"/>
+          </w:tcPr>
+          <w:p>
+            <w:r>
+              <w:rPr>
+                <w:b w:val="false"/>
+                <w:bCs w:val="false"/>
+                <w:sz w:val="18"/>
+                <w:szCs w:val="18"/>
+              </w:rPr>
+              <w:t xml:space="preserve">2</w:t>
+            </w:r>
+          </w:p>
+        </w:tc>
+        <w:tc>
+          <w:tcPr>
+            <w:tcW w:type="dxa" w:w="700"/>
+            <w:tcBorders>
+              <w:top w:val="single" w:color="B7C6DA" w:sz="1"/>
+              <w:left w:val="single" w:color="B7C6DA" w:sz="1"/>
+              <w:bottom w:val="single" w:color="B7C6DA" w:sz="1"/>
+              <w:right w:val="single" w:color="B7C6DA" w:sz="1"/>
+            </w:tcBorders>
+            <w:shd w:fill="EAF1F8" w:val="clear"/>
+            <w:tcMar>
+              <w:top w:type="dxa" w:w="60"/>
+              <w:left w:type="dxa" w:w="110"/>
+              <w:bottom w:type="dxa" w:w="60"/>
+              <w:right w:type="dxa" w:w="110"/>
+            </w:tcMar>
+            <w:vAlign w:val="center"/>
+          </w:tcPr>
+          <w:p>
+            <w:r>
+              <w:rPr>
+                <w:b w:val="false"/>
+                <w:bCs w:val="false"/>
+                <w:sz w:val="18"/>
+                <w:szCs w:val="18"/>
+              </w:rPr>
+              <w:t xml:space="preserve">A</w:t>
+            </w:r>
+          </w:p>
+        </w:tc>
+        <w:tc>
+          <w:tcPr>
+            <w:tcW w:type="dxa" w:w="2200"/>
+            <w:tcBorders>
+              <w:top w:val="single" w:color="B7C6DA" w:sz="1"/>
+              <w:left w:val="single" w:color="B7C6DA" w:sz="1"/>
+              <w:bottom w:val="single" w:color="B7C6DA" w:sz="1"/>
+              <w:right w:val="single" w:color="B7C6DA" w:sz="1"/>
+            </w:tcBorders>
+            <w:shd w:fill="EAF1F8" w:val="clear"/>
+            <w:tcMar>
+              <w:top w:type="dxa" w:w="60"/>
+              <w:left w:type="dxa" w:w="110"/>
+              <w:bottom w:type="dxa" w:w="60"/>
+              <w:right w:type="dxa" w:w="110"/>
+            </w:tcMar>
+            <w:vAlign w:val="center"/>
+          </w:tcPr>
+          <w:p>
+            <w:r>
+              <w:rPr>
+                <w:b w:val="false"/>
+                <w:bCs w:val="false"/>
+                <w:sz w:val="18"/>
+                <w:szCs w:val="18"/>
+              </w:rPr>
+              <w:t xml:space="preserve">Body System</w:t>
+            </w:r>
+          </w:p>
+        </w:tc>
+        <w:tc>
+          <w:tcPr>
+            <w:tcW w:type="dxa" w:w="5760"/>
+            <w:tcBorders>
+              <w:top w:val="single" w:color="B7C6DA" w:sz="1"/>
+              <w:left w:val="single" w:color="B7C6DA" w:sz="1"/>
+              <w:bottom w:val="single" w:color="B7C6DA" w:sz="1"/>
+              <w:right w:val="single" w:color="B7C6DA" w:sz="1"/>
+            </w:tcBorders>
+            <w:shd w:fill="EAF1F8" w:val="clear"/>
+            <w:tcMar>
+              <w:top w:type="dxa" w:w="60"/>
+              <w:left w:type="dxa" w:w="110"/>
+              <w:bottom w:type="dxa" w:w="60"/>
+              <w:right w:type="dxa" w:w="110"/>
+            </w:tcMar>
+            <w:vAlign w:val="center"/>
+          </w:tcPr>
+          <w:p>
+            <w:r>
+              <w:rPr>
+                <w:b w:val="false"/>
+                <w:bCs w:val="false"/>
+                <w:sz w:val="18"/>
+                <w:szCs w:val="18"/>
+              </w:rPr>
+              <w:t xml:space="preserve">Physiological Systems</w:t>
+            </w:r>
+          </w:p>
+        </w:tc>
+      </w:tr>
+      <w:tr>
+        <w:tc>
+          <w:tcPr>
+            <w:tcW w:type="dxa" w:w="700"/>
+            <w:tcBorders>
+              <w:top w:val="single" w:color="B7C6DA" w:sz="1"/>
+              <w:left w:val="single" w:color="B7C6DA" w:sz="1"/>
+              <w:bottom w:val="single" w:color="B7C6DA" w:sz="1"/>
+              <w:right w:val="single" w:color="B7C6DA" w:sz="1"/>
+            </w:tcBorders>
+            <w:shd w:fill="FFFFFF" w:val="clear"/>
+            <w:tcMar>
+              <w:top w:type="dxa" w:w="60"/>
+              <w:left w:type="dxa" w:w="110"/>
+              <w:bottom w:type="dxa" w:w="60"/>
+              <w:right w:type="dxa" w:w="110"/>
+            </w:tcMar>
+            <w:vAlign w:val="center"/>
+          </w:tcPr>
+          <w:p>
+            <w:r>
+              <w:rPr>
+                <w:b w:val="false"/>
+                <w:bCs w:val="false"/>
+                <w:sz w:val="18"/>
+                <w:szCs w:val="18"/>
+              </w:rPr>
+              <w:t xml:space="preserve">3</w:t>
+            </w:r>
+          </w:p>
+        </w:tc>
+        <w:tc>
+          <w:tcPr>
+            <w:tcW w:type="dxa" w:w="700"/>
+            <w:tcBorders>
+              <w:top w:val="single" w:color="B7C6DA" w:sz="1"/>
+              <w:left w:val="single" w:color="B7C6DA" w:sz="1"/>
+              <w:bottom w:val="single" w:color="B7C6DA" w:sz="1"/>
+              <w:right w:val="single" w:color="B7C6DA" w:sz="1"/>
+            </w:tcBorders>
+            <w:shd w:fill="FFFFFF" w:val="clear"/>
+            <w:tcMar>
+              <w:top w:type="dxa" w:w="60"/>
+              <w:left w:type="dxa" w:w="110"/>
+              <w:bottom w:type="dxa" w:w="60"/>
+              <w:right w:type="dxa" w:w="110"/>
+            </w:tcMar>
+            <w:vAlign w:val="center"/>
+          </w:tcPr>
+          <w:p>
+            <w:r>
+              <w:rPr>
+                <w:b w:val="false"/>
+                <w:bCs w:val="false"/>
+                <w:sz w:val="18"/>
+                <w:szCs w:val="18"/>
+              </w:rPr>
+              <w:t xml:space="preserve">1</w:t>
+            </w:r>
+          </w:p>
+        </w:tc>
+        <w:tc>
+          <w:tcPr>
+            <w:tcW w:type="dxa" w:w="2200"/>
+            <w:tcBorders>
+              <w:top w:val="single" w:color="B7C6DA" w:sz="1"/>
+              <w:left w:val="single" w:color="B7C6DA" w:sz="1"/>
+              <w:bottom w:val="single" w:color="B7C6DA" w:sz="1"/>
+              <w:right w:val="single" w:color="B7C6DA" w:sz="1"/>
+            </w:tcBorders>
+            <w:shd w:fill="FFFFFF" w:val="clear"/>
+            <w:tcMar>
+              <w:top w:type="dxa" w:w="60"/>
+              <w:left w:type="dxa" w:w="110"/>
+              <w:bottom w:type="dxa" w:w="60"/>
+              <w:right w:type="dxa" w:w="110"/>
+            </w:tcMar>
+            <w:vAlign w:val="center"/>
+          </w:tcPr>
+          <w:p>
+            <w:r>
+              <w:rPr>
+                <w:b w:val="false"/>
+                <w:bCs w:val="false"/>
+                <w:sz w:val="18"/>
+                <w:szCs w:val="18"/>
+              </w:rPr>
+              <w:t xml:space="preserve">Root Operation</w:t>
+            </w:r>
+          </w:p>
+        </w:tc>
+        <w:tc>
+          <w:tcPr>
+            <w:tcW w:type="dxa" w:w="5760"/>
+            <w:tcBorders>
+              <w:top w:val="single" w:color="B7C6DA" w:sz="1"/>
+              <w:left w:val="single" w:color="B7C6DA" w:sz="1"/>
+              <w:bottom w:val="single" w:color="B7C6DA" w:sz="1"/>
+              <w:right w:val="single" w:color="B7C6DA" w:sz="1"/>
+            </w:tcBorders>
+            <w:shd w:fill="FFFFFF" w:val="clear"/>
+            <w:tcMar>
+              <w:top w:type="dxa" w:w="60"/>
+              <w:left w:type="dxa" w:w="110"/>
+              <w:bottom w:type="dxa" w:w="60"/>
+              <w:right w:type="dxa" w:w="110"/>
+            </w:tcMar>
+            <w:vAlign w:val="center"/>
+          </w:tcPr>
+          <w:p>
+            <w:r>
+              <w:rPr>
+                <w:b w:val="false"/>
+                <w:bCs w:val="false"/>
+                <w:sz w:val="18"/>
+                <w:szCs w:val="18"/>
+              </w:rPr>
+              <w:t xml:space="preserve">Performance</w:t>
+            </w:r>
+          </w:p>
+        </w:tc>
+      </w:tr>
+      <w:tr>
+        <w:tc>
+          <w:tcPr>
+            <w:tcW w:type="dxa" w:w="700"/>
+            <w:tcBorders>
+              <w:top w:val="single" w:color="B7C6DA" w:sz="1"/>
+              <w:left w:val="single" w:color="B7C6DA" w:sz="1"/>
+              <w:bottom w:val="single" w:color="B7C6DA" w:sz="1"/>
+              <w:right w:val="single" w:color="B7C6DA" w:sz="1"/>
+            </w:tcBorders>
+            <w:shd w:fill="EAF1F8" w:val="clear"/>
+            <w:tcMar>
+              <w:top w:type="dxa" w:w="60"/>
+              <w:left w:type="dxa" w:w="110"/>
+              <w:bottom w:type="dxa" w:w="60"/>
+              <w:right w:type="dxa" w:w="110"/>
+            </w:tcMar>
+            <w:vAlign w:val="center"/>
+          </w:tcPr>
+          <w:p>
+            <w:r>
+              <w:rPr>
+                <w:b w:val="false"/>
+                <w:bCs w:val="false"/>
+                <w:sz w:val="18"/>
+                <w:szCs w:val="18"/>
+              </w:rPr>
+              <w:t xml:space="preserve">4</w:t>
+            </w:r>
+          </w:p>
+        </w:tc>
+        <w:tc>
+          <w:tcPr>
+            <w:tcW w:type="dxa" w:w="700"/>
+            <w:tcBorders>
+              <w:top w:val="single" w:color="B7C6DA" w:sz="1"/>
+              <w:left w:val="single" w:color="B7C6DA" w:sz="1"/>
+              <w:bottom w:val="single" w:color="B7C6DA" w:sz="1"/>
+              <w:right w:val="single" w:color="B7C6DA" w:sz="1"/>
+            </w:tcBorders>
+            <w:shd w:fill="EAF1F8" w:val="clear"/>
+            <w:tcMar>
+              <w:top w:type="dxa" w:w="60"/>
+              <w:left w:type="dxa" w:w="110"/>
+              <w:bottom w:type="dxa" w:w="60"/>
+              <w:right w:type="dxa" w:w="110"/>
+            </w:tcMar>
+            <w:vAlign w:val="center"/>
+          </w:tcPr>
+          <w:p>
+            <w:r>
+              <w:rPr>
+                <w:b w:val="false"/>
+                <w:bCs w:val="false"/>
+                <w:sz w:val="18"/>
+                <w:szCs w:val="18"/>
+              </w:rPr>
+              <w:t xml:space="preserve">9</w:t>
+            </w:r>
+          </w:p>
+        </w:tc>
+        <w:tc>
+          <w:tcPr>
+            <w:tcW w:type="dxa" w:w="2200"/>
+            <w:tcBorders>
+              <w:top w:val="single" w:color="B7C6DA" w:sz="1"/>
+              <w:left w:val="single" w:color="B7C6DA" w:sz="1"/>
+              <w:bottom w:val="single" w:color="B7C6DA" w:sz="1"/>
+              <w:right w:val="single" w:color="B7C6DA" w:sz="1"/>
+            </w:tcBorders>
+            <w:shd w:fill="EAF1F8" w:val="clear"/>
+            <w:tcMar>
+              <w:top w:type="dxa" w:w="60"/>
+              <w:left w:type="dxa" w:w="110"/>
+              <w:bottom w:type="dxa" w:w="60"/>
+              <w:right w:type="dxa" w:w="110"/>
+            </w:tcMar>
+            <w:vAlign w:val="center"/>
+          </w:tcPr>
+          <w:p>
+            <w:r>
+              <w:rPr>
+                <w:b w:val="false"/>
+                <w:bCs w:val="false"/>
+                <w:sz w:val="18"/>
+                <w:szCs w:val="18"/>
+              </w:rPr>
+              <w:t xml:space="preserve">Body Function</w:t>
+            </w:r>
+          </w:p>
+        </w:tc>
+        <w:tc>
+          <w:tcPr>
+            <w:tcW w:type="dxa" w:w="5760"/>
+            <w:tcBorders>
+              <w:top w:val="single" w:color="B7C6DA" w:sz="1"/>
+              <w:left w:val="single" w:color="B7C6DA" w:sz="1"/>
+              <w:bottom w:val="single" w:color="B7C6DA" w:sz="1"/>
+              <w:right w:val="single" w:color="B7C6DA" w:sz="1"/>
+            </w:tcBorders>
+            <w:shd w:fill="EAF1F8" w:val="clear"/>
+            <w:tcMar>
+              <w:top w:type="dxa" w:w="60"/>
+              <w:left w:type="dxa" w:w="110"/>
+              <w:bottom w:type="dxa" w:w="60"/>
+              <w:right w:type="dxa" w:w="110"/>
+            </w:tcMar>
+            <w:vAlign w:val="center"/>
+          </w:tcPr>
+          <w:p>
+            <w:r>
+              <w:rPr>
+                <w:b w:val="false"/>
+                <w:bCs w:val="false"/>
+                <w:sz w:val="18"/>
+                <w:szCs w:val="18"/>
+              </w:rPr>
+              <w:t xml:space="preserve">Respiratory</w:t>
+            </w:r>
+          </w:p>
+        </w:tc>
+      </w:tr>
+      <w:tr>
+        <w:tc>
+          <w:tcPr>
+            <w:tcW w:type="dxa" w:w="700"/>
+            <w:tcBorders>
+              <w:top w:val="single" w:color="B7C6DA" w:sz="1"/>
+              <w:left w:val="single" w:color="B7C6DA" w:sz="1"/>
+              <w:bottom w:val="single" w:color="B7C6DA" w:sz="1"/>
+              <w:right w:val="single" w:color="B7C6DA" w:sz="1"/>
+            </w:tcBorders>
+            <w:shd w:fill="FFFFFF" w:val="clear"/>
+            <w:tcMar>
+              <w:top w:type="dxa" w:w="60"/>
+              <w:left w:type="dxa" w:w="110"/>
+              <w:bottom w:type="dxa" w:w="60"/>
+              <w:right w:type="dxa" w:w="110"/>
+            </w:tcMar>
+            <w:vAlign w:val="center"/>
+          </w:tcPr>
+          <w:p>
+            <w:r>
+              <w:rPr>
+                <w:b/>
+                <w:bCs/>
+                <w:sz w:val="18"/>
+                <w:szCs w:val="18"/>
+              </w:rPr>
+              <w:t xml:space="preserve">5</w:t>
+            </w:r>
+          </w:p>
+        </w:tc>
+        <w:tc>
+          <w:tcPr>
+            <w:tcW w:type="dxa" w:w="700"/>
+            <w:tcBorders>
+              <w:top w:val="single" w:color="B7C6DA" w:sz="1"/>
+              <w:left w:val="single" w:color="B7C6DA" w:sz="1"/>
+              <w:bottom w:val="single" w:color="B7C6DA" w:sz="1"/>
+              <w:right w:val="single" w:color="B7C6DA" w:sz="1"/>
+            </w:tcBorders>
+            <w:shd w:fill="FFFFFF" w:val="clear"/>
+            <w:tcMar>
+              <w:top w:type="dxa" w:w="60"/>
+              <w:left w:type="dxa" w:w="110"/>
+              <w:bottom w:type="dxa" w:w="60"/>
+              <w:right w:type="dxa" w:w="110"/>
+            </w:tcMar>
+            <w:vAlign w:val="center"/>
+          </w:tcPr>
+          <w:p>
+            <w:r>
+              <w:rPr>
+                <w:b/>
+                <w:bCs/>
+                <w:sz w:val="18"/>
+                <w:szCs w:val="18"/>
+              </w:rPr>
+              <w:t xml:space="preserve">5</w:t>
+            </w:r>
+          </w:p>
+        </w:tc>
+        <w:tc>
+          <w:tcPr>
+            <w:tcW w:type="dxa" w:w="2200"/>
+            <w:tcBorders>
+              <w:top w:val="single" w:color="B7C6DA" w:sz="1"/>
+              <w:left w:val="single" w:color="B7C6DA" w:sz="1"/>
+              <w:bottom w:val="single" w:color="B7C6DA" w:sz="1"/>
+              <w:right w:val="single" w:color="B7C6DA" w:sz="1"/>
+            </w:tcBorders>
+            <w:shd w:fill="FFFFFF" w:val="clear"/>
+            <w:tcMar>
+              <w:top w:type="dxa" w:w="60"/>
+              <w:left w:type="dxa" w:w="110"/>
+              <w:bottom w:type="dxa" w:w="60"/>
+              <w:right w:type="dxa" w:w="110"/>
+            </w:tcMar>
+            <w:vAlign w:val="center"/>
+          </w:tcPr>
+          <w:p>
+            <w:r>
+              <w:rPr>
+                <w:b/>
+                <w:bCs/>
+                <w:sz w:val="18"/>
+                <w:szCs w:val="18"/>
+              </w:rPr>
+              <w:t xml:space="preserve">Duration</w:t>
+            </w:r>
+          </w:p>
+        </w:tc>
+        <w:tc>
+          <w:tcPr>
+            <w:tcW w:type="dxa" w:w="5760"/>
+            <w:tcBorders>
+              <w:top w:val="single" w:color="B7C6DA" w:sz="1"/>
+              <w:left w:val="single" w:color="B7C6DA" w:sz="1"/>
+              <w:bottom w:val="single" w:color="B7C6DA" w:sz="1"/>
+              <w:right w:val="single" w:color="B7C6DA" w:sz="1"/>
+            </w:tcBorders>
+            <w:shd w:fill="FFFFFF" w:val="clear"/>
+            <w:tcMar>
+              <w:top w:type="dxa" w:w="60"/>
+              <w:left w:type="dxa" w:w="110"/>
+              <w:bottom w:type="dxa" w:w="60"/>
+              <w:right w:type="dxa" w:w="110"/>
+            </w:tcMar>
+            <w:vAlign w:val="center"/>
+          </w:tcPr>
+          <w:p>
+            <w:r>
+              <w:rPr>
+                <w:b/>
+                <w:bCs/>
+                <w:sz w:val="18"/>
+                <w:szCs w:val="18"/>
+              </w:rPr>
+              <w:t xml:space="preserve">&gt;96 consecutive hours  ← the lever</w:t>
+            </w:r>
+          </w:p>
+        </w:tc>
+      </w:tr>
+      <w:tr>
+        <w:tc>
+          <w:tcPr>
+            <w:tcW w:type="dxa" w:w="700"/>
+            <w:tcBorders>
+              <w:top w:val="single" w:color="B7C6DA" w:sz="1"/>
+              <w:left w:val="single" w:color="B7C6DA" w:sz="1"/>
+              <w:bottom w:val="single" w:color="B7C6DA" w:sz="1"/>
+              <w:right w:val="single" w:color="B7C6DA" w:sz="1"/>
+            </w:tcBorders>
+            <w:shd w:fill="EAF1F8" w:val="clear"/>
+            <w:tcMar>
+              <w:top w:type="dxa" w:w="60"/>
+              <w:left w:type="dxa" w:w="110"/>
+              <w:bottom w:type="dxa" w:w="60"/>
+              <w:right w:type="dxa" w:w="110"/>
+            </w:tcMar>
+            <w:vAlign w:val="center"/>
+          </w:tcPr>
+          <w:p>
+            <w:r>
+              <w:rPr>
+                <w:b w:val="false"/>
+                <w:bCs w:val="false"/>
+                <w:sz w:val="18"/>
+                <w:szCs w:val="18"/>
+              </w:rPr>
+              <w:t xml:space="preserve">6</w:t>
+            </w:r>
+          </w:p>
+        </w:tc>
+        <w:tc>
+          <w:tcPr>
+            <w:tcW w:type="dxa" w:w="700"/>
+            <w:tcBorders>
+              <w:top w:val="single" w:color="B7C6DA" w:sz="1"/>
+              <w:left w:val="single" w:color="B7C6DA" w:sz="1"/>
+              <w:bottom w:val="single" w:color="B7C6DA" w:sz="1"/>
+              <w:right w:val="single" w:color="B7C6DA" w:sz="1"/>
+            </w:tcBorders>
+            <w:shd w:fill="EAF1F8" w:val="clear"/>
+            <w:tcMar>
+              <w:top w:type="dxa" w:w="60"/>
+              <w:left w:type="dxa" w:w="110"/>
+              <w:bottom w:type="dxa" w:w="60"/>
+              <w:right w:type="dxa" w:w="110"/>
+            </w:tcMar>
+            <w:vAlign w:val="center"/>
+          </w:tcPr>
+          <w:p>
+            <w:r>
+              <w:rPr>
+                <w:b w:val="false"/>
+                <w:bCs w:val="false"/>
+                <w:sz w:val="18"/>
+                <w:szCs w:val="18"/>
+              </w:rPr>
+              <w:t xml:space="preserve">5</w:t>
+            </w:r>
+          </w:p>
+        </w:tc>
+        <w:tc>
+          <w:tcPr>
+            <w:tcW w:type="dxa" w:w="2200"/>
+            <w:tcBorders>
+              <w:top w:val="single" w:color="B7C6DA" w:sz="1"/>
+              <w:left w:val="single" w:color="B7C6DA" w:sz="1"/>
+              <w:bottom w:val="single" w:color="B7C6DA" w:sz="1"/>
+              <w:right w:val="single" w:color="B7C6DA" w:sz="1"/>
+            </w:tcBorders>
+            <w:shd w:fill="EAF1F8" w:val="clear"/>
+            <w:tcMar>
+              <w:top w:type="dxa" w:w="60"/>
+              <w:left w:type="dxa" w:w="110"/>
+              <w:bottom w:type="dxa" w:w="60"/>
+              <w:right w:type="dxa" w:w="110"/>
+            </w:tcMar>
+            <w:vAlign w:val="center"/>
+          </w:tcPr>
+          <w:p>
+            <w:r>
+              <w:rPr>
+                <w:b w:val="false"/>
+                <w:bCs w:val="false"/>
+                <w:sz w:val="18"/>
+                <w:szCs w:val="18"/>
+              </w:rPr>
+              <w:t xml:space="preserve">Function</w:t>
+            </w:r>
+          </w:p>
+        </w:tc>
+        <w:tc>
+          <w:tcPr>
+            <w:tcW w:type="dxa" w:w="5760"/>
+            <w:tcBorders>
+              <w:top w:val="single" w:color="B7C6DA" w:sz="1"/>
+              <w:left w:val="single" w:color="B7C6DA" w:sz="1"/>
+              <w:bottom w:val="single" w:color="B7C6DA" w:sz="1"/>
+              <w:right w:val="single" w:color="B7C6DA" w:sz="1"/>
+            </w:tcBorders>
+            <w:shd w:fill="EAF1F8" w:val="clear"/>
+            <w:tcMar>
+              <w:top w:type="dxa" w:w="60"/>
+              <w:left w:type="dxa" w:w="110"/>
+              <w:bottom w:type="dxa" w:w="60"/>
+              <w:right w:type="dxa" w:w="110"/>
+            </w:tcMar>
+            <w:vAlign w:val="center"/>
+          </w:tcPr>
+          <w:p>
+            <w:r>
+              <w:rPr>
+                <w:b w:val="false"/>
+                <w:bCs w:val="false"/>
+                <w:sz w:val="18"/>
+                <w:szCs w:val="18"/>
+              </w:rPr>
+              <w:t xml:space="preserve">Ventilation</w:t>
+            </w:r>
+          </w:p>
+        </w:tc>
+      </w:tr>
+      <w:tr>
+        <w:tc>
+          <w:tcPr>
+            <w:tcW w:type="dxa" w:w="700"/>
+            <w:tcBorders>
+              <w:top w:val="single" w:color="B7C6DA" w:sz="1"/>
+              <w:left w:val="single" w:color="B7C6DA" w:sz="1"/>
+              <w:bottom w:val="single" w:color="B7C6DA" w:sz="1"/>
+              <w:right w:val="single" w:color="B7C6DA" w:sz="1"/>
+            </w:tcBorders>
+            <w:shd w:fill="FFFFFF" w:val="clear"/>
+            <w:tcMar>
+              <w:top w:type="dxa" w:w="60"/>
+              <w:left w:type="dxa" w:w="110"/>
+              <w:bottom w:type="dxa" w:w="60"/>
+              <w:right w:type="dxa" w:w="110"/>
+            </w:tcMar>
+            <w:vAlign w:val="center"/>
+          </w:tcPr>
+          <w:p>
+            <w:r>
+              <w:rPr>
+                <w:b w:val="false"/>
+                <w:bCs w:val="false"/>
+                <w:sz w:val="18"/>
+                <w:szCs w:val="18"/>
+              </w:rPr>
+              <w:t xml:space="preserve">7</w:t>
+            </w:r>
+          </w:p>
+        </w:tc>
+        <w:tc>
+          <w:tcPr>
+            <w:tcW w:type="dxa" w:w="700"/>
+            <w:tcBorders>
+              <w:top w:val="single" w:color="B7C6DA" w:sz="1"/>
+              <w:left w:val="single" w:color="B7C6DA" w:sz="1"/>
+              <w:bottom w:val="single" w:color="B7C6DA" w:sz="1"/>
+              <w:right w:val="single" w:color="B7C6DA" w:sz="1"/>
+            </w:tcBorders>
+            <w:shd w:fill="FFFFFF" w:val="clear"/>
+            <w:tcMar>
+              <w:top w:type="dxa" w:w="60"/>
+              <w:left w:type="dxa" w:w="110"/>
+              <w:bottom w:type="dxa" w:w="60"/>
+              <w:right w:type="dxa" w:w="110"/>
+            </w:tcMar>
+            <w:vAlign w:val="center"/>
+          </w:tcPr>
+          <w:p>
+            <w:r>
+              <w:rPr>
+                <w:b w:val="false"/>
+                <w:bCs w:val="false"/>
+                <w:sz w:val="18"/>
+                <w:szCs w:val="18"/>
+              </w:rPr>
+              <w:t xml:space="preserve">Z</w:t>
+            </w:r>
+          </w:p>
+        </w:tc>
+        <w:tc>
+          <w:tcPr>
+            <w:tcW w:type="dxa" w:w="2200"/>
+            <w:tcBorders>
+              <w:top w:val="single" w:color="B7C6DA" w:sz="1"/>
+              <w:left w:val="single" w:color="B7C6DA" w:sz="1"/>
+              <w:bottom w:val="single" w:color="B7C6DA" w:sz="1"/>
+              <w:right w:val="single" w:color="B7C6DA" w:sz="1"/>
+            </w:tcBorders>
+            <w:shd w:fill="FFFFFF" w:val="clear"/>
+            <w:tcMar>
+              <w:top w:type="dxa" w:w="60"/>
+              <w:left w:type="dxa" w:w="110"/>
+              <w:bottom w:type="dxa" w:w="60"/>
+              <w:right w:type="dxa" w:w="110"/>
+            </w:tcMar>
+            <w:vAlign w:val="center"/>
+          </w:tcPr>
+          <w:p>
+            <w:r>
+              <w:rPr>
+                <w:b w:val="false"/>
+                <w:bCs w:val="false"/>
+                <w:sz w:val="18"/>
+                <w:szCs w:val="18"/>
+              </w:rPr>
+              <w:t xml:space="preserve">Qualifier</w:t>
+            </w:r>
+          </w:p>
+        </w:tc>
+        <w:tc>
+          <w:tcPr>
+            <w:tcW w:type="dxa" w:w="5760"/>
+            <w:tcBorders>
+              <w:top w:val="single" w:color="B7C6DA" w:sz="1"/>
+              <w:left w:val="single" w:color="B7C6DA" w:sz="1"/>
+              <w:bottom w:val="single" w:color="B7C6DA" w:sz="1"/>
+              <w:right w:val="single" w:color="B7C6DA" w:sz="1"/>
+            </w:tcBorders>
+            <w:shd w:fill="FFFFFF" w:val="clear"/>
+            <w:tcMar>
+              <w:top w:type="dxa" w:w="60"/>
+              <w:left w:type="dxa" w:w="110"/>
+              <w:bottom w:type="dxa" w:w="60"/>
+              <w:right w:type="dxa" w:w="110"/>
+            </w:tcMar>
+            <w:vAlign w:val="center"/>
+          </w:tcPr>
+          <w:p>
+            <w:r>
+              <w:rPr>
+                <w:b w:val="false"/>
+                <w:bCs w:val="false"/>
+                <w:sz w:val="18"/>
+                <w:szCs w:val="18"/>
+              </w:rPr>
+              <w:t xml:space="preserve">None</w:t>
+            </w:r>
+          </w:p>
+        </w:tc>
+      </w:tr>
+    </w:tbl>
+    <w:p>
+      <w:pPr>
+        <w:spacing w:after="100"/>
+      </w:pPr>
+      <w:r>
+        <w:rPr>
+          <w:b w:val="false"/>
+          <w:bCs w:val="false"/>
+          <w:i/>
+          <w:iCs/>
+          <w:sz w:val="20"/>
+          <w:szCs w:val="20"/>
+        </w:rPr>
+        <w:t xml:space="preserve">Character 5 alone moves the DRG. With a respiratory principal diagnosis: &gt;96h → MS-DRG 207 (FY2026 weight 6.4347 ≈ $43,450) vs ≤96h → MS-DRG 208 (weight 2.7487 ≈ $18,562) at a $6,752.61 base rate — about a $24,900 swing at the 96-hour line. Count continuous hours from intubation to extubation; the note needs times, not “on the vent for days.” BiPAP/NIPPV is a different code and does not count toward these hours.</w:t>
+      </w:r>
+    </w:p>
+    <w:p>
+      <w:pPr>
+        <w:pStyle w:val="Heading2"/>
+      </w:pPr>
+      <w:r>
+        <w:t xml:space="preserve">Worked example 2 — CRRT (5A1D90Z, continuous)</w:t>
+      </w:r>
+    </w:p>
+    <w:tbl>
+      <w:tblPr>
+        <w:tblW w:type="dxa" w:w="9360"/>
+        <w:tblBorders>
+          <w:top w:val="single" w:color="auto" w:sz="4"/>
+          <w:left w:val="single" w:color="auto" w:sz="4"/>
+          <w:bottom w:val="single" w:color="auto" w:sz="4"/>
+          <w:right w:val="single" w:color="auto" w:sz="4"/>
+          <w:insideH w:val="single" w:color="auto" w:sz="4"/>
+          <w:insideV w:val="single" w:color="auto" w:sz="4"/>
+        </w:tblBorders>
+      </w:tblPr>
+      <w:tblGrid>
+        <w:gridCol w:w="700"/>
+        <w:gridCol w:w="700"/>
+        <w:gridCol w:w="2200"/>
+        <w:gridCol w:w="5760"/>
+      </w:tblGrid>
+      <w:tr>
+        <w:trPr>
+          <w:tblHeader/>
+        </w:trPr>
+        <w:tc>
+          <w:tcPr>
+            <w:tcW w:type="dxa" w:w="700"/>
+            <w:tcBorders>
+              <w:top w:val="single" w:color="B7C6DA" w:sz="1"/>
+              <w:left w:val="single" w:color="B7C6DA" w:sz="1"/>
+              <w:bottom w:val="single" w:color="B7C6DA" w:sz="1"/>
+              <w:right w:val="single" w:color="B7C6DA" w:sz="1"/>
+            </w:tcBorders>
+            <w:shd w:fill="1F3864" w:val="clear"/>
+            <w:tcMar>
+              <w:top w:type="dxa" w:w="60"/>
+              <w:left w:type="dxa" w:w="110"/>
+              <w:bottom w:type="dxa" w:w="60"/>
+              <w:right w:type="dxa" w:w="110"/>
+            </w:tcMar>
+            <w:vAlign w:val="center"/>
+          </w:tcPr>
+          <w:p>
+            <w:r>
+              <w:rPr>
+                <w:b/>
+                <w:bCs/>
+                <w:color w:val="FFFFFF"/>
+                <w:sz w:val="18"/>
+                <w:szCs w:val="18"/>
+              </w:rPr>
+              <w:t xml:space="preserve">Char</w:t>
+            </w:r>
+          </w:p>
+        </w:tc>
+        <w:tc>
+          <w:tcPr>
+            <w:tcW w:type="dxa" w:w="700"/>
+            <w:tcBorders>
+              <w:top w:val="single" w:color="B7C6DA" w:sz="1"/>
+              <w:left w:val="single" w:color="B7C6DA" w:sz="1"/>
+              <w:bottom w:val="single" w:color="B7C6DA" w:sz="1"/>
+              <w:right w:val="single" w:color="B7C6DA" w:sz="1"/>
+            </w:tcBorders>
+            <w:shd w:fill="1F3864" w:val="clear"/>
+            <w:tcMar>
+              <w:top w:type="dxa" w:w="60"/>
+              <w:left w:type="dxa" w:w="110"/>
+              <w:bottom w:type="dxa" w:w="60"/>
+              <w:right w:type="dxa" w:w="110"/>
+            </w:tcMar>
+            <w:vAlign w:val="center"/>
+          </w:tcPr>
+          <w:p>
+            <w:r>
+              <w:rPr>
+                <w:b/>
+                <w:bCs/>
+                <w:color w:val="FFFFFF"/>
+                <w:sz w:val="18"/>
+                <w:szCs w:val="18"/>
+              </w:rPr>
+              <w:t xml:space="preserve">Value</w:t>
+            </w:r>
+          </w:p>
+        </w:tc>
+        <w:tc>
+          <w:tcPr>
+            <w:tcW w:type="dxa" w:w="2200"/>
+            <w:tcBorders>
+              <w:top w:val="single" w:color="B7C6DA" w:sz="1"/>
+              <w:left w:val="single" w:color="B7C6DA" w:sz="1"/>
+              <w:bottom w:val="single" w:color="B7C6DA" w:sz="1"/>
+              <w:right w:val="single" w:color="B7C6DA" w:sz="1"/>
+            </w:tcBorders>
+            <w:shd w:fill="1F3864" w:val="clear"/>
+            <w:tcMar>
+              <w:top w:type="dxa" w:w="60"/>
+              <w:left w:type="dxa" w:w="110"/>
+              <w:bottom w:type="dxa" w:w="60"/>
+              <w:right w:type="dxa" w:w="110"/>
+            </w:tcMar>
+            <w:vAlign w:val="center"/>
+          </w:tcPr>
+          <w:p>
+            <w:r>
+              <w:rPr>
+                <w:b/>
+                <w:bCs/>
+                <w:color w:val="FFFFFF"/>
+                <w:sz w:val="18"/>
+                <w:szCs w:val="18"/>
+              </w:rPr>
+              <w:t xml:space="preserve">Axis</w:t>
+            </w:r>
+          </w:p>
+        </w:tc>
+        <w:tc>
+          <w:tcPr>
+            <w:tcW w:type="dxa" w:w="5760"/>
+            <w:tcBorders>
+              <w:top w:val="single" w:color="B7C6DA" w:sz="1"/>
+              <w:left w:val="single" w:color="B7C6DA" w:sz="1"/>
+              <w:bottom w:val="single" w:color="B7C6DA" w:sz="1"/>
+              <w:right w:val="single" w:color="B7C6DA" w:sz="1"/>
+            </w:tcBorders>
+            <w:shd w:fill="1F3864" w:val="clear"/>
+            <w:tcMar>
+              <w:top w:type="dxa" w:w="60"/>
+              <w:left w:type="dxa" w:w="110"/>
+              <w:bottom w:type="dxa" w:w="60"/>
+              <w:right w:type="dxa" w:w="110"/>
+            </w:tcMar>
+            <w:vAlign w:val="center"/>
+          </w:tcPr>
+          <w:p>
+            <w:r>
+              <w:rPr>
+                <w:b/>
+                <w:bCs/>
+                <w:color w:val="FFFFFF"/>
+                <w:sz w:val="18"/>
+                <w:szCs w:val="18"/>
+              </w:rPr>
+              <w:t xml:space="preserve">Meaning</w:t>
+            </w:r>
+          </w:p>
+        </w:tc>
+      </w:tr>
+      <w:tr>
+        <w:tc>
+          <w:tcPr>
+            <w:tcW w:type="dxa" w:w="700"/>
+            <w:tcBorders>
+              <w:top w:val="single" w:color="B7C6DA" w:sz="1"/>
+              <w:left w:val="single" w:color="B7C6DA" w:sz="1"/>
+              <w:bottom w:val="single" w:color="B7C6DA" w:sz="1"/>
+              <w:right w:val="single" w:color="B7C6DA" w:sz="1"/>
+            </w:tcBorders>
+            <w:shd w:fill="FFFFFF" w:val="clear"/>
+            <w:tcMar>
+              <w:top w:type="dxa" w:w="60"/>
+              <w:left w:type="dxa" w:w="110"/>
+              <w:bottom w:type="dxa" w:w="60"/>
+              <w:right w:type="dxa" w:w="110"/>
+            </w:tcMar>
+            <w:vAlign w:val="center"/>
+          </w:tcPr>
+          <w:p>
+            <w:r>
+              <w:rPr>
+                <w:b w:val="false"/>
+                <w:bCs w:val="false"/>
+                <w:sz w:val="18"/>
+                <w:szCs w:val="18"/>
+              </w:rPr>
+              <w:t xml:space="preserve">1</w:t>
+            </w:r>
+          </w:p>
+        </w:tc>
+        <w:tc>
+          <w:tcPr>
+            <w:tcW w:type="dxa" w:w="700"/>
+            <w:tcBorders>
+              <w:top w:val="single" w:color="B7C6DA" w:sz="1"/>
+              <w:left w:val="single" w:color="B7C6DA" w:sz="1"/>
+              <w:bottom w:val="single" w:color="B7C6DA" w:sz="1"/>
+              <w:right w:val="single" w:color="B7C6DA" w:sz="1"/>
+            </w:tcBorders>
+            <w:shd w:fill="FFFFFF" w:val="clear"/>
+            <w:tcMar>
+              <w:top w:type="dxa" w:w="60"/>
+              <w:left w:type="dxa" w:w="110"/>
+              <w:bottom w:type="dxa" w:w="60"/>
+              <w:right w:type="dxa" w:w="110"/>
+            </w:tcMar>
+            <w:vAlign w:val="center"/>
+          </w:tcPr>
+          <w:p>
+            <w:r>
+              <w:rPr>
+                <w:b w:val="false"/>
+                <w:bCs w:val="false"/>
+                <w:sz w:val="18"/>
+                <w:szCs w:val="18"/>
+              </w:rPr>
+              <w:t xml:space="preserve">5</w:t>
+            </w:r>
+          </w:p>
+        </w:tc>
+        <w:tc>
+          <w:tcPr>
+            <w:tcW w:type="dxa" w:w="2200"/>
+            <w:tcBorders>
+              <w:top w:val="single" w:color="B7C6DA" w:sz="1"/>
+              <w:left w:val="single" w:color="B7C6DA" w:sz="1"/>
+              <w:bottom w:val="single" w:color="B7C6DA" w:sz="1"/>
+              <w:right w:val="single" w:color="B7C6DA" w:sz="1"/>
+            </w:tcBorders>
+            <w:shd w:fill="FFFFFF" w:val="clear"/>
+            <w:tcMar>
+              <w:top w:type="dxa" w:w="60"/>
+              <w:left w:type="dxa" w:w="110"/>
+              <w:bottom w:type="dxa" w:w="60"/>
+              <w:right w:type="dxa" w:w="110"/>
+            </w:tcMar>
+            <w:vAlign w:val="center"/>
+          </w:tcPr>
+          <w:p>
+            <w:r>
+              <w:rPr>
+                <w:b w:val="false"/>
+                <w:bCs w:val="false"/>
+                <w:sz w:val="18"/>
+                <w:szCs w:val="18"/>
+              </w:rPr>
+              <w:t xml:space="preserve">Section</w:t>
+            </w:r>
+          </w:p>
+        </w:tc>
+        <w:tc>
+          <w:tcPr>
+            <w:tcW w:type="dxa" w:w="5760"/>
+            <w:tcBorders>
+              <w:top w:val="single" w:color="B7C6DA" w:sz="1"/>
+              <w:left w:val="single" w:color="B7C6DA" w:sz="1"/>
+              <w:bottom w:val="single" w:color="B7C6DA" w:sz="1"/>
+              <w:right w:val="single" w:color="B7C6DA" w:sz="1"/>
+            </w:tcBorders>
+            <w:shd w:fill="FFFFFF" w:val="clear"/>
+            <w:tcMar>
+              <w:top w:type="dxa" w:w="60"/>
+              <w:left w:type="dxa" w:w="110"/>
+              <w:bottom w:type="dxa" w:w="60"/>
+              <w:right w:type="dxa" w:w="110"/>
+            </w:tcMar>
+            <w:vAlign w:val="center"/>
+          </w:tcPr>
+          <w:p>
+            <w:r>
+              <w:rPr>
+                <w:b w:val="false"/>
+                <w:bCs w:val="false"/>
+                <w:sz w:val="18"/>
+                <w:szCs w:val="18"/>
+              </w:rPr>
+              <w:t xml:space="preserve">Extracorporeal or Systemic Assistance and Performance</w:t>
+            </w:r>
+          </w:p>
+        </w:tc>
+      </w:tr>
+      <w:tr>
+        <w:tc>
+          <w:tcPr>
+            <w:tcW w:type="dxa" w:w="700"/>
+            <w:tcBorders>
+              <w:top w:val="single" w:color="B7C6DA" w:sz="1"/>
+              <w:left w:val="single" w:color="B7C6DA" w:sz="1"/>
+              <w:bottom w:val="single" w:color="B7C6DA" w:sz="1"/>
+              <w:right w:val="single" w:color="B7C6DA" w:sz="1"/>
+            </w:tcBorders>
+            <w:shd w:fill="EAF1F8" w:val="clear"/>
+            <w:tcMar>
+              <w:top w:type="dxa" w:w="60"/>
+              <w:left w:type="dxa" w:w="110"/>
+              <w:bottom w:type="dxa" w:w="60"/>
+              <w:right w:type="dxa" w:w="110"/>
+            </w:tcMar>
+            <w:vAlign w:val="center"/>
+          </w:tcPr>
+          <w:p>
+            <w:r>
+              <w:rPr>
+                <w:b w:val="false"/>
+                <w:bCs w:val="false"/>
+                <w:sz w:val="18"/>
+                <w:szCs w:val="18"/>
+              </w:rPr>
+              <w:t xml:space="preserve">2</w:t>
+            </w:r>
+          </w:p>
+        </w:tc>
+        <w:tc>
+          <w:tcPr>
+            <w:tcW w:type="dxa" w:w="700"/>
+            <w:tcBorders>
+              <w:top w:val="single" w:color="B7C6DA" w:sz="1"/>
+              <w:left w:val="single" w:color="B7C6DA" w:sz="1"/>
+              <w:bottom w:val="single" w:color="B7C6DA" w:sz="1"/>
+              <w:right w:val="single" w:color="B7C6DA" w:sz="1"/>
+            </w:tcBorders>
+            <w:shd w:fill="EAF1F8" w:val="clear"/>
+            <w:tcMar>
+              <w:top w:type="dxa" w:w="60"/>
+              <w:left w:type="dxa" w:w="110"/>
+              <w:bottom w:type="dxa" w:w="60"/>
+              <w:right w:type="dxa" w:w="110"/>
+            </w:tcMar>
+            <w:vAlign w:val="center"/>
+          </w:tcPr>
+          <w:p>
+            <w:r>
+              <w:rPr>
+                <w:b w:val="false"/>
+                <w:bCs w:val="false"/>
+                <w:sz w:val="18"/>
+                <w:szCs w:val="18"/>
+              </w:rPr>
+              <w:t xml:space="preserve">A</w:t>
+            </w:r>
+          </w:p>
+        </w:tc>
+        <w:tc>
+          <w:tcPr>
+            <w:tcW w:type="dxa" w:w="2200"/>
+            <w:tcBorders>
+              <w:top w:val="single" w:color="B7C6DA" w:sz="1"/>
+              <w:left w:val="single" w:color="B7C6DA" w:sz="1"/>
+              <w:bottom w:val="single" w:color="B7C6DA" w:sz="1"/>
+              <w:right w:val="single" w:color="B7C6DA" w:sz="1"/>
+            </w:tcBorders>
+            <w:shd w:fill="EAF1F8" w:val="clear"/>
+            <w:tcMar>
+              <w:top w:type="dxa" w:w="60"/>
+              <w:left w:type="dxa" w:w="110"/>
+              <w:bottom w:type="dxa" w:w="60"/>
+              <w:right w:type="dxa" w:w="110"/>
+            </w:tcMar>
+            <w:vAlign w:val="center"/>
+          </w:tcPr>
+          <w:p>
+            <w:r>
+              <w:rPr>
+                <w:b w:val="false"/>
+                <w:bCs w:val="false"/>
+                <w:sz w:val="18"/>
+                <w:szCs w:val="18"/>
+              </w:rPr>
+              <w:t xml:space="preserve">Body System</w:t>
+            </w:r>
+          </w:p>
+        </w:tc>
+        <w:tc>
+          <w:tcPr>
+            <w:tcW w:type="dxa" w:w="5760"/>
+            <w:tcBorders>
+              <w:top w:val="single" w:color="B7C6DA" w:sz="1"/>
+              <w:left w:val="single" w:color="B7C6DA" w:sz="1"/>
+              <w:bottom w:val="single" w:color="B7C6DA" w:sz="1"/>
+              <w:right w:val="single" w:color="B7C6DA" w:sz="1"/>
+            </w:tcBorders>
+            <w:shd w:fill="EAF1F8" w:val="clear"/>
+            <w:tcMar>
+              <w:top w:type="dxa" w:w="60"/>
+              <w:left w:type="dxa" w:w="110"/>
+              <w:bottom w:type="dxa" w:w="60"/>
+              <w:right w:type="dxa" w:w="110"/>
+            </w:tcMar>
+            <w:vAlign w:val="center"/>
+          </w:tcPr>
+          <w:p>
+            <w:r>
+              <w:rPr>
+                <w:b w:val="false"/>
+                <w:bCs w:val="false"/>
+                <w:sz w:val="18"/>
+                <w:szCs w:val="18"/>
+              </w:rPr>
+              <w:t xml:space="preserve">Physiological Systems</w:t>
+            </w:r>
+          </w:p>
+        </w:tc>
+      </w:tr>
+      <w:tr>
+        <w:tc>
+          <w:tcPr>
+            <w:tcW w:type="dxa" w:w="700"/>
+            <w:tcBorders>
+              <w:top w:val="single" w:color="B7C6DA" w:sz="1"/>
+              <w:left w:val="single" w:color="B7C6DA" w:sz="1"/>
+              <w:bottom w:val="single" w:color="B7C6DA" w:sz="1"/>
+              <w:right w:val="single" w:color="B7C6DA" w:sz="1"/>
+            </w:tcBorders>
+            <w:shd w:fill="FFFFFF" w:val="clear"/>
+            <w:tcMar>
+              <w:top w:type="dxa" w:w="60"/>
+              <w:left w:type="dxa" w:w="110"/>
+              <w:bottom w:type="dxa" w:w="60"/>
+              <w:right w:type="dxa" w:w="110"/>
+            </w:tcMar>
+            <w:vAlign w:val="center"/>
+          </w:tcPr>
+          <w:p>
+            <w:r>
+              <w:rPr>
+                <w:b w:val="false"/>
+                <w:bCs w:val="false"/>
+                <w:sz w:val="18"/>
+                <w:szCs w:val="18"/>
+              </w:rPr>
+              <w:t xml:space="preserve">3</w:t>
+            </w:r>
+          </w:p>
+        </w:tc>
+        <w:tc>
+          <w:tcPr>
+            <w:tcW w:type="dxa" w:w="700"/>
+            <w:tcBorders>
+              <w:top w:val="single" w:color="B7C6DA" w:sz="1"/>
+              <w:left w:val="single" w:color="B7C6DA" w:sz="1"/>
+              <w:bottom w:val="single" w:color="B7C6DA" w:sz="1"/>
+              <w:right w:val="single" w:color="B7C6DA" w:sz="1"/>
+            </w:tcBorders>
+            <w:shd w:fill="FFFFFF" w:val="clear"/>
+            <w:tcMar>
+              <w:top w:type="dxa" w:w="60"/>
+              <w:left w:type="dxa" w:w="110"/>
+              <w:bottom w:type="dxa" w:w="60"/>
+              <w:right w:type="dxa" w:w="110"/>
+            </w:tcMar>
+            <w:vAlign w:val="center"/>
+          </w:tcPr>
+          <w:p>
+            <w:r>
+              <w:rPr>
+                <w:b w:val="false"/>
+                <w:bCs w:val="false"/>
+                <w:sz w:val="18"/>
+                <w:szCs w:val="18"/>
+              </w:rPr>
+              <w:t xml:space="preserve">1</w:t>
+            </w:r>
+          </w:p>
+        </w:tc>
+        <w:tc>
+          <w:tcPr>
+            <w:tcW w:type="dxa" w:w="2200"/>
+            <w:tcBorders>
+              <w:top w:val="single" w:color="B7C6DA" w:sz="1"/>
+              <w:left w:val="single" w:color="B7C6DA" w:sz="1"/>
+              <w:bottom w:val="single" w:color="B7C6DA" w:sz="1"/>
+              <w:right w:val="single" w:color="B7C6DA" w:sz="1"/>
+            </w:tcBorders>
+            <w:shd w:fill="FFFFFF" w:val="clear"/>
+            <w:tcMar>
+              <w:top w:type="dxa" w:w="60"/>
+              <w:left w:type="dxa" w:w="110"/>
+              <w:bottom w:type="dxa" w:w="60"/>
+              <w:right w:type="dxa" w:w="110"/>
+            </w:tcMar>
+            <w:vAlign w:val="center"/>
+          </w:tcPr>
+          <w:p>
+            <w:r>
+              <w:rPr>
+                <w:b w:val="false"/>
+                <w:bCs w:val="false"/>
+                <w:sz w:val="18"/>
+                <w:szCs w:val="18"/>
+              </w:rPr>
+              <w:t xml:space="preserve">Root Operation</w:t>
+            </w:r>
+          </w:p>
+        </w:tc>
+        <w:tc>
+          <w:tcPr>
+            <w:tcW w:type="dxa" w:w="5760"/>
+            <w:tcBorders>
+              <w:top w:val="single" w:color="B7C6DA" w:sz="1"/>
+              <w:left w:val="single" w:color="B7C6DA" w:sz="1"/>
+              <w:bottom w:val="single" w:color="B7C6DA" w:sz="1"/>
+              <w:right w:val="single" w:color="B7C6DA" w:sz="1"/>
+            </w:tcBorders>
+            <w:shd w:fill="FFFFFF" w:val="clear"/>
+            <w:tcMar>
+              <w:top w:type="dxa" w:w="60"/>
+              <w:left w:type="dxa" w:w="110"/>
+              <w:bottom w:type="dxa" w:w="60"/>
+              <w:right w:type="dxa" w:w="110"/>
+            </w:tcMar>
+            <w:vAlign w:val="center"/>
+          </w:tcPr>
+          <w:p>
+            <w:r>
+              <w:rPr>
+                <w:b w:val="false"/>
+                <w:bCs w:val="false"/>
+                <w:sz w:val="18"/>
+                <w:szCs w:val="18"/>
+              </w:rPr>
+              <w:t xml:space="preserve">Performance</w:t>
+            </w:r>
+          </w:p>
+        </w:tc>
+      </w:tr>
+      <w:tr>
+        <w:tc>
+          <w:tcPr>
+            <w:tcW w:type="dxa" w:w="700"/>
+            <w:tcBorders>
+              <w:top w:val="single" w:color="B7C6DA" w:sz="1"/>
+              <w:left w:val="single" w:color="B7C6DA" w:sz="1"/>
+              <w:bottom w:val="single" w:color="B7C6DA" w:sz="1"/>
+              <w:right w:val="single" w:color="B7C6DA" w:sz="1"/>
+            </w:tcBorders>
+            <w:shd w:fill="EAF1F8" w:val="clear"/>
+            <w:tcMar>
+              <w:top w:type="dxa" w:w="60"/>
+              <w:left w:type="dxa" w:w="110"/>
+              <w:bottom w:type="dxa" w:w="60"/>
+              <w:right w:type="dxa" w:w="110"/>
+            </w:tcMar>
+            <w:vAlign w:val="center"/>
+          </w:tcPr>
+          <w:p>
+            <w:r>
+              <w:rPr>
+                <w:b w:val="false"/>
+                <w:bCs w:val="false"/>
+                <w:sz w:val="18"/>
+                <w:szCs w:val="18"/>
+              </w:rPr>
+              <w:t xml:space="preserve">4</w:t>
+            </w:r>
+          </w:p>
+        </w:tc>
+        <w:tc>
+          <w:tcPr>
+            <w:tcW w:type="dxa" w:w="700"/>
+            <w:tcBorders>
+              <w:top w:val="single" w:color="B7C6DA" w:sz="1"/>
+              <w:left w:val="single" w:color="B7C6DA" w:sz="1"/>
+              <w:bottom w:val="single" w:color="B7C6DA" w:sz="1"/>
+              <w:right w:val="single" w:color="B7C6DA" w:sz="1"/>
+            </w:tcBorders>
+            <w:shd w:fill="EAF1F8" w:val="clear"/>
+            <w:tcMar>
+              <w:top w:type="dxa" w:w="60"/>
+              <w:left w:type="dxa" w:w="110"/>
+              <w:bottom w:type="dxa" w:w="60"/>
+              <w:right w:type="dxa" w:w="110"/>
+            </w:tcMar>
+            <w:vAlign w:val="center"/>
+          </w:tcPr>
+          <w:p>
+            <w:r>
+              <w:rPr>
+                <w:b w:val="false"/>
+                <w:bCs w:val="false"/>
+                <w:sz w:val="18"/>
+                <w:szCs w:val="18"/>
+              </w:rPr>
+              <w:t xml:space="preserve">D</w:t>
+            </w:r>
+          </w:p>
+        </w:tc>
+        <w:tc>
+          <w:tcPr>
+            <w:tcW w:type="dxa" w:w="2200"/>
+            <w:tcBorders>
+              <w:top w:val="single" w:color="B7C6DA" w:sz="1"/>
+              <w:left w:val="single" w:color="B7C6DA" w:sz="1"/>
+              <w:bottom w:val="single" w:color="B7C6DA" w:sz="1"/>
+              <w:right w:val="single" w:color="B7C6DA" w:sz="1"/>
+            </w:tcBorders>
+            <w:shd w:fill="EAF1F8" w:val="clear"/>
+            <w:tcMar>
+              <w:top w:type="dxa" w:w="60"/>
+              <w:left w:type="dxa" w:w="110"/>
+              <w:bottom w:type="dxa" w:w="60"/>
+              <w:right w:type="dxa" w:w="110"/>
+            </w:tcMar>
+            <w:vAlign w:val="center"/>
+          </w:tcPr>
+          <w:p>
+            <w:r>
+              <w:rPr>
+                <w:b w:val="false"/>
+                <w:bCs w:val="false"/>
+                <w:sz w:val="18"/>
+                <w:szCs w:val="18"/>
+              </w:rPr>
+              <w:t xml:space="preserve">Body System</w:t>
+            </w:r>
+          </w:p>
+        </w:tc>
+        <w:tc>
+          <w:tcPr>
+            <w:tcW w:type="dxa" w:w="5760"/>
+            <w:tcBorders>
+              <w:top w:val="single" w:color="B7C6DA" w:sz="1"/>
+              <w:left w:val="single" w:color="B7C6DA" w:sz="1"/>
+              <w:bottom w:val="single" w:color="B7C6DA" w:sz="1"/>
+              <w:right w:val="single" w:color="B7C6DA" w:sz="1"/>
+            </w:tcBorders>
+            <w:shd w:fill="EAF1F8" w:val="clear"/>
+            <w:tcMar>
+              <w:top w:type="dxa" w:w="60"/>
+              <w:left w:type="dxa" w:w="110"/>
+              <w:bottom w:type="dxa" w:w="60"/>
+              <w:right w:type="dxa" w:w="110"/>
+            </w:tcMar>
+            <w:vAlign w:val="center"/>
+          </w:tcPr>
+          <w:p>
+            <w:r>
+              <w:rPr>
+                <w:b w:val="false"/>
+                <w:bCs w:val="false"/>
+                <w:sz w:val="18"/>
+                <w:szCs w:val="18"/>
+              </w:rPr>
+              <w:t xml:space="preserve">Urinary</w:t>
+            </w:r>
+          </w:p>
+        </w:tc>
+      </w:tr>
+      <w:tr>
+        <w:tc>
+          <w:tcPr>
+            <w:tcW w:type="dxa" w:w="700"/>
+            <w:tcBorders>
+              <w:top w:val="single" w:color="B7C6DA" w:sz="1"/>
+              <w:left w:val="single" w:color="B7C6DA" w:sz="1"/>
+              <w:bottom w:val="single" w:color="B7C6DA" w:sz="1"/>
+              <w:right w:val="single" w:color="B7C6DA" w:sz="1"/>
+            </w:tcBorders>
+            <w:shd w:fill="FFFFFF" w:val="clear"/>
+            <w:tcMar>
+              <w:top w:type="dxa" w:w="60"/>
+              <w:left w:type="dxa" w:w="110"/>
+              <w:bottom w:type="dxa" w:w="60"/>
+              <w:right w:type="dxa" w:w="110"/>
+            </w:tcMar>
+            <w:vAlign w:val="center"/>
+          </w:tcPr>
+          <w:p>
+            <w:r>
+              <w:rPr>
+                <w:b/>
+                <w:bCs/>
+                <w:sz w:val="18"/>
+                <w:szCs w:val="18"/>
+              </w:rPr>
+              <w:t xml:space="preserve">5</w:t>
+            </w:r>
+          </w:p>
+        </w:tc>
+        <w:tc>
+          <w:tcPr>
+            <w:tcW w:type="dxa" w:w="700"/>
+            <w:tcBorders>
+              <w:top w:val="single" w:color="B7C6DA" w:sz="1"/>
+              <w:left w:val="single" w:color="B7C6DA" w:sz="1"/>
+              <w:bottom w:val="single" w:color="B7C6DA" w:sz="1"/>
+              <w:right w:val="single" w:color="B7C6DA" w:sz="1"/>
+            </w:tcBorders>
+            <w:shd w:fill="FFFFFF" w:val="clear"/>
+            <w:tcMar>
+              <w:top w:type="dxa" w:w="60"/>
+              <w:left w:type="dxa" w:w="110"/>
+              <w:bottom w:type="dxa" w:w="60"/>
+              <w:right w:type="dxa" w:w="110"/>
+            </w:tcMar>
+            <w:vAlign w:val="center"/>
+          </w:tcPr>
+          <w:p>
+            <w:r>
+              <w:rPr>
+                <w:b/>
+                <w:bCs/>
+                <w:sz w:val="18"/>
+                <w:szCs w:val="18"/>
+              </w:rPr>
+              <w:t xml:space="preserve">9</w:t>
+            </w:r>
+          </w:p>
+        </w:tc>
+        <w:tc>
+          <w:tcPr>
+            <w:tcW w:type="dxa" w:w="2200"/>
+            <w:tcBorders>
+              <w:top w:val="single" w:color="B7C6DA" w:sz="1"/>
+              <w:left w:val="single" w:color="B7C6DA" w:sz="1"/>
+              <w:bottom w:val="single" w:color="B7C6DA" w:sz="1"/>
+              <w:right w:val="single" w:color="B7C6DA" w:sz="1"/>
+            </w:tcBorders>
+            <w:shd w:fill="FFFFFF" w:val="clear"/>
+            <w:tcMar>
+              <w:top w:type="dxa" w:w="60"/>
+              <w:left w:type="dxa" w:w="110"/>
+              <w:bottom w:type="dxa" w:w="60"/>
+              <w:right w:type="dxa" w:w="110"/>
+            </w:tcMar>
+            <w:vAlign w:val="center"/>
+          </w:tcPr>
+          <w:p>
+            <w:r>
+              <w:rPr>
+                <w:b/>
+                <w:bCs/>
+                <w:sz w:val="18"/>
+                <w:szCs w:val="18"/>
+              </w:rPr>
+              <w:t xml:space="preserve">Duration</w:t>
+            </w:r>
+          </w:p>
+        </w:tc>
+        <w:tc>
+          <w:tcPr>
+            <w:tcW w:type="dxa" w:w="5760"/>
+            <w:tcBorders>
+              <w:top w:val="single" w:color="B7C6DA" w:sz="1"/>
+              <w:left w:val="single" w:color="B7C6DA" w:sz="1"/>
+              <w:bottom w:val="single" w:color="B7C6DA" w:sz="1"/>
+              <w:right w:val="single" w:color="B7C6DA" w:sz="1"/>
+            </w:tcBorders>
+            <w:shd w:fill="FFFFFF" w:val="clear"/>
+            <w:tcMar>
+              <w:top w:type="dxa" w:w="60"/>
+              <w:left w:type="dxa" w:w="110"/>
+              <w:bottom w:type="dxa" w:w="60"/>
+              <w:right w:type="dxa" w:w="110"/>
+            </w:tcMar>
+            <w:vAlign w:val="center"/>
+          </w:tcPr>
+          <w:p>
+            <w:r>
+              <w:rPr>
+                <w:b/>
+                <w:bCs/>
+                <w:sz w:val="18"/>
+                <w:szCs w:val="18"/>
+              </w:rPr>
+              <w:t xml:space="preserve">Continuous (&gt;18 hrs/day)  ← intermittent = 7</w:t>
+            </w:r>
+          </w:p>
+        </w:tc>
+      </w:tr>
+      <w:tr>
+        <w:tc>
+          <w:tcPr>
+            <w:tcW w:type="dxa" w:w="700"/>
+            <w:tcBorders>
+              <w:top w:val="single" w:color="B7C6DA" w:sz="1"/>
+              <w:left w:val="single" w:color="B7C6DA" w:sz="1"/>
+              <w:bottom w:val="single" w:color="B7C6DA" w:sz="1"/>
+              <w:right w:val="single" w:color="B7C6DA" w:sz="1"/>
+            </w:tcBorders>
+            <w:shd w:fill="EAF1F8" w:val="clear"/>
+            <w:tcMar>
+              <w:top w:type="dxa" w:w="60"/>
+              <w:left w:type="dxa" w:w="110"/>
+              <w:bottom w:type="dxa" w:w="60"/>
+              <w:right w:type="dxa" w:w="110"/>
+            </w:tcMar>
+            <w:vAlign w:val="center"/>
+          </w:tcPr>
+          <w:p>
+            <w:r>
+              <w:rPr>
+                <w:b w:val="false"/>
+                <w:bCs w:val="false"/>
+                <w:sz w:val="18"/>
+                <w:szCs w:val="18"/>
+              </w:rPr>
+              <w:t xml:space="preserve">6</w:t>
+            </w:r>
+          </w:p>
+        </w:tc>
+        <w:tc>
+          <w:tcPr>
+            <w:tcW w:type="dxa" w:w="700"/>
+            <w:tcBorders>
+              <w:top w:val="single" w:color="B7C6DA" w:sz="1"/>
+              <w:left w:val="single" w:color="B7C6DA" w:sz="1"/>
+              <w:bottom w:val="single" w:color="B7C6DA" w:sz="1"/>
+              <w:right w:val="single" w:color="B7C6DA" w:sz="1"/>
+            </w:tcBorders>
+            <w:shd w:fill="EAF1F8" w:val="clear"/>
+            <w:tcMar>
+              <w:top w:type="dxa" w:w="60"/>
+              <w:left w:type="dxa" w:w="110"/>
+              <w:bottom w:type="dxa" w:w="60"/>
+              <w:right w:type="dxa" w:w="110"/>
+            </w:tcMar>
+            <w:vAlign w:val="center"/>
+          </w:tcPr>
+          <w:p>
+            <w:r>
+              <w:rPr>
+                <w:b w:val="false"/>
+                <w:bCs w:val="false"/>
+                <w:sz w:val="18"/>
+                <w:szCs w:val="18"/>
+              </w:rPr>
+              <w:t xml:space="preserve">0</w:t>
+            </w:r>
+          </w:p>
+        </w:tc>
+        <w:tc>
+          <w:tcPr>
+            <w:tcW w:type="dxa" w:w="2200"/>
+            <w:tcBorders>
+              <w:top w:val="single" w:color="B7C6DA" w:sz="1"/>
+              <w:left w:val="single" w:color="B7C6DA" w:sz="1"/>
+              <w:bottom w:val="single" w:color="B7C6DA" w:sz="1"/>
+              <w:right w:val="single" w:color="B7C6DA" w:sz="1"/>
+            </w:tcBorders>
+            <w:shd w:fill="EAF1F8" w:val="clear"/>
+            <w:tcMar>
+              <w:top w:type="dxa" w:w="60"/>
+              <w:left w:type="dxa" w:w="110"/>
+              <w:bottom w:type="dxa" w:w="60"/>
+              <w:right w:type="dxa" w:w="110"/>
+            </w:tcMar>
+            <w:vAlign w:val="center"/>
+          </w:tcPr>
+          <w:p>
+            <w:r>
+              <w:rPr>
+                <w:b w:val="false"/>
+                <w:bCs w:val="false"/>
+                <w:sz w:val="18"/>
+                <w:szCs w:val="18"/>
+              </w:rPr>
+              <w:t xml:space="preserve">Function</w:t>
+            </w:r>
+          </w:p>
+        </w:tc>
+        <w:tc>
+          <w:tcPr>
+            <w:tcW w:type="dxa" w:w="5760"/>
+            <w:tcBorders>
+              <w:top w:val="single" w:color="B7C6DA" w:sz="1"/>
+              <w:left w:val="single" w:color="B7C6DA" w:sz="1"/>
+              <w:bottom w:val="single" w:color="B7C6DA" w:sz="1"/>
+              <w:right w:val="single" w:color="B7C6DA" w:sz="1"/>
+            </w:tcBorders>
+            <w:shd w:fill="EAF1F8" w:val="clear"/>
+            <w:tcMar>
+              <w:top w:type="dxa" w:w="60"/>
+              <w:left w:type="dxa" w:w="110"/>
+              <w:bottom w:type="dxa" w:w="60"/>
+              <w:right w:type="dxa" w:w="110"/>
+            </w:tcMar>
+            <w:vAlign w:val="center"/>
+          </w:tcPr>
+          <w:p>
+            <w:r>
+              <w:rPr>
+                <w:b w:val="false"/>
+                <w:bCs w:val="false"/>
+                <w:sz w:val="18"/>
+                <w:szCs w:val="18"/>
+              </w:rPr>
+              <w:t xml:space="preserve">Filtration</w:t>
+            </w:r>
+          </w:p>
+        </w:tc>
+      </w:tr>
+      <w:tr>
+        <w:tc>
+          <w:tcPr>
+            <w:tcW w:type="dxa" w:w="700"/>
+            <w:tcBorders>
+              <w:top w:val="single" w:color="B7C6DA" w:sz="1"/>
+              <w:left w:val="single" w:color="B7C6DA" w:sz="1"/>
+              <w:bottom w:val="single" w:color="B7C6DA" w:sz="1"/>
+              <w:right w:val="single" w:color="B7C6DA" w:sz="1"/>
+            </w:tcBorders>
+            <w:shd w:fill="FFFFFF" w:val="clear"/>
+            <w:tcMar>
+              <w:top w:type="dxa" w:w="60"/>
+              <w:left w:type="dxa" w:w="110"/>
+              <w:bottom w:type="dxa" w:w="60"/>
+              <w:right w:type="dxa" w:w="110"/>
+            </w:tcMar>
+            <w:vAlign w:val="center"/>
+          </w:tcPr>
+          <w:p>
+            <w:r>
+              <w:rPr>
+                <w:b w:val="false"/>
+                <w:bCs w:val="false"/>
+                <w:sz w:val="18"/>
+                <w:szCs w:val="18"/>
+              </w:rPr>
+              <w:t xml:space="preserve">7</w:t>
+            </w:r>
+          </w:p>
+        </w:tc>
+        <w:tc>
+          <w:tcPr>
+            <w:tcW w:type="dxa" w:w="700"/>
+            <w:tcBorders>
+              <w:top w:val="single" w:color="B7C6DA" w:sz="1"/>
+              <w:left w:val="single" w:color="B7C6DA" w:sz="1"/>
+              <w:bottom w:val="single" w:color="B7C6DA" w:sz="1"/>
+              <w:right w:val="single" w:color="B7C6DA" w:sz="1"/>
+            </w:tcBorders>
+            <w:shd w:fill="FFFFFF" w:val="clear"/>
+            <w:tcMar>
+              <w:top w:type="dxa" w:w="60"/>
+              <w:left w:type="dxa" w:w="110"/>
+              <w:bottom w:type="dxa" w:w="60"/>
+              <w:right w:type="dxa" w:w="110"/>
+            </w:tcMar>
+            <w:vAlign w:val="center"/>
+          </w:tcPr>
+          <w:p>
+            <w:r>
+              <w:rPr>
+                <w:b w:val="false"/>
+                <w:bCs w:val="false"/>
+                <w:sz w:val="18"/>
+                <w:szCs w:val="18"/>
+              </w:rPr>
+              <w:t xml:space="preserve">Z</w:t>
+            </w:r>
+          </w:p>
+        </w:tc>
+        <w:tc>
+          <w:tcPr>
+            <w:tcW w:type="dxa" w:w="2200"/>
+            <w:tcBorders>
+              <w:top w:val="single" w:color="B7C6DA" w:sz="1"/>
+              <w:left w:val="single" w:color="B7C6DA" w:sz="1"/>
+              <w:bottom w:val="single" w:color="B7C6DA" w:sz="1"/>
+              <w:right w:val="single" w:color="B7C6DA" w:sz="1"/>
+            </w:tcBorders>
+            <w:shd w:fill="FFFFFF" w:val="clear"/>
+            <w:tcMar>
+              <w:top w:type="dxa" w:w="60"/>
+              <w:left w:type="dxa" w:w="110"/>
+              <w:bottom w:type="dxa" w:w="60"/>
+              <w:right w:type="dxa" w:w="110"/>
+            </w:tcMar>
+            <w:vAlign w:val="center"/>
+          </w:tcPr>
+          <w:p>
+            <w:r>
+              <w:rPr>
+                <w:b w:val="false"/>
+                <w:bCs w:val="false"/>
+                <w:sz w:val="18"/>
+                <w:szCs w:val="18"/>
+              </w:rPr>
+              <w:t xml:space="preserve">Qualifier</w:t>
+            </w:r>
+          </w:p>
+        </w:tc>
+        <w:tc>
+          <w:tcPr>
+            <w:tcW w:type="dxa" w:w="5760"/>
+            <w:tcBorders>
+              <w:top w:val="single" w:color="B7C6DA" w:sz="1"/>
+              <w:left w:val="single" w:color="B7C6DA" w:sz="1"/>
+              <w:bottom w:val="single" w:color="B7C6DA" w:sz="1"/>
+              <w:right w:val="single" w:color="B7C6DA" w:sz="1"/>
+            </w:tcBorders>
+            <w:shd w:fill="FFFFFF" w:val="clear"/>
+            <w:tcMar>
+              <w:top w:type="dxa" w:w="60"/>
+              <w:left w:type="dxa" w:w="110"/>
+              <w:bottom w:type="dxa" w:w="60"/>
+              <w:right w:type="dxa" w:w="110"/>
+            </w:tcMar>
+            <w:vAlign w:val="center"/>
+          </w:tcPr>
+          <w:p>
+            <w:r>
+              <w:rPr>
+                <w:b w:val="false"/>
+                <w:bCs w:val="false"/>
+                <w:sz w:val="18"/>
+                <w:szCs w:val="18"/>
+              </w:rPr>
+              <w:t xml:space="preserve">None</w:t>
+            </w:r>
+          </w:p>
+        </w:tc>
+      </w:tr>
+    </w:tbl>
+    <w:p>
+      <w:pPr>
+        <w:spacing w:after="100"/>
+      </w:pPr>
+      <w:r>
+        <w:rPr>
+          <w:b w:val="false"/>
+          <w:bCs w:val="false"/>
+          <w:i/>
+          <w:iCs/>
+          <w:sz w:val="20"/>
+          <w:szCs w:val="20"/>
+        </w:rPr>
+        <w:t xml:space="preserve">Unlike ventilation, the CRRT procedure is not an O.R. procedure and barely moves the DRG on its own. The lever is the diagnosis it treats: documenting acute kidney failure / ATN (N17.x, a CC) can lift a DRG tier (without CC/MCC → with CC), typically worth ~$1,200–$3,000. So capture both the continuous modality (5A1D90Z vs intermittent 5A1D70Z) and the linked acute kidney failure diagnosis.</w:t>
+      </w:r>
+    </w:p>
+    <w:p>
+      <w:pPr>
+        <w:pStyle w:val="Heading2"/>
+      </w:pPr>
+      <w:r>
+        <w:t xml:space="preserve">ICU procedures ranked by DRG leverage</w:t>
+      </w:r>
+    </w:p>
+    <w:tbl>
+      <w:tblPr>
+        <w:tblW w:type="dxa" w:w="9360"/>
+        <w:tblBorders>
+          <w:top w:val="single" w:color="auto" w:sz="4"/>
+          <w:left w:val="single" w:color="auto" w:sz="4"/>
+          <w:bottom w:val="single" w:color="auto" w:sz="4"/>
+          <w:right w:val="single" w:color="auto" w:sz="4"/>
+          <w:insideH w:val="single" w:color="auto" w:sz="4"/>
+          <w:insideV w:val="single" w:color="auto" w:sz="4"/>
+        </w:tblBorders>
+      </w:tblPr>
+      <w:tblGrid>
+        <w:gridCol w:w="2300"/>
+        <w:gridCol w:w="2660"/>
+        <w:gridCol w:w="1900"/>
+        <w:gridCol w:w="2500"/>
+      </w:tblGrid>
+      <w:tr>
+        <w:trPr>
+          <w:tblHeader/>
+        </w:trPr>
+        <w:tc>
+          <w:tcPr>
+            <w:tcW w:type="dxa" w:w="2300"/>
+            <w:tcBorders>
+              <w:top w:val="single" w:color="B7C6DA" w:sz="1"/>
+              <w:left w:val="single" w:color="B7C6DA" w:sz="1"/>
+              <w:bottom w:val="single" w:color="B7C6DA" w:sz="1"/>
+              <w:right w:val="single" w:color="B7C6DA" w:sz="1"/>
+            </w:tcBorders>
+            <w:shd w:fill="1F3864" w:val="clear"/>
+            <w:tcMar>
+              <w:top w:type="dxa" w:w="60"/>
+              <w:left w:type="dxa" w:w="110"/>
+              <w:bottom w:type="dxa" w:w="60"/>
+              <w:right w:type="dxa" w:w="110"/>
+            </w:tcMar>
+            <w:vAlign w:val="center"/>
+          </w:tcPr>
+          <w:p>
+            <w:r>
+              <w:rPr>
+                <w:b/>
+                <w:bCs/>
+                <w:color w:val="FFFFFF"/>
+                <w:sz w:val="18"/>
+                <w:szCs w:val="18"/>
+              </w:rPr>
+              <w:t xml:space="preserve">Procedure</w:t>
+            </w:r>
+          </w:p>
+        </w:tc>
+        <w:tc>
+          <w:tcPr>
+            <w:tcW w:type="dxa" w:w="2660"/>
+            <w:tcBorders>
+              <w:top w:val="single" w:color="B7C6DA" w:sz="1"/>
+              <w:left w:val="single" w:color="B7C6DA" w:sz="1"/>
+              <w:bottom w:val="single" w:color="B7C6DA" w:sz="1"/>
+              <w:right w:val="single" w:color="B7C6DA" w:sz="1"/>
+            </w:tcBorders>
+            <w:shd w:fill="1F3864" w:val="clear"/>
+            <w:tcMar>
+              <w:top w:type="dxa" w:w="60"/>
+              <w:left w:type="dxa" w:w="110"/>
+              <w:bottom w:type="dxa" w:w="60"/>
+              <w:right w:type="dxa" w:w="110"/>
+            </w:tcMar>
+            <w:vAlign w:val="center"/>
+          </w:tcPr>
+          <w:p>
+            <w:r>
+              <w:rPr>
+                <w:b/>
+                <w:bCs/>
+                <w:color w:val="FFFFFF"/>
+                <w:sz w:val="18"/>
+                <w:szCs w:val="18"/>
+              </w:rPr>
+              <w:t xml:space="preserve">Example PCS code(s)</w:t>
+            </w:r>
+          </w:p>
+        </w:tc>
+        <w:tc>
+          <w:tcPr>
+            <w:tcW w:type="dxa" w:w="1900"/>
+            <w:tcBorders>
+              <w:top w:val="single" w:color="B7C6DA" w:sz="1"/>
+              <w:left w:val="single" w:color="B7C6DA" w:sz="1"/>
+              <w:bottom w:val="single" w:color="B7C6DA" w:sz="1"/>
+              <w:right w:val="single" w:color="B7C6DA" w:sz="1"/>
+            </w:tcBorders>
+            <w:shd w:fill="1F3864" w:val="clear"/>
+            <w:tcMar>
+              <w:top w:type="dxa" w:w="60"/>
+              <w:left w:type="dxa" w:w="110"/>
+              <w:bottom w:type="dxa" w:w="60"/>
+              <w:right w:type="dxa" w:w="110"/>
+            </w:tcMar>
+            <w:vAlign w:val="center"/>
+          </w:tcPr>
+          <w:p>
+            <w:r>
+              <w:rPr>
+                <w:b/>
+                <w:bCs/>
+                <w:color w:val="FFFFFF"/>
+                <w:sz w:val="18"/>
+                <w:szCs w:val="18"/>
+              </w:rPr>
+              <w:t xml:space="preserve">DRG leverage</w:t>
+            </w:r>
+          </w:p>
+        </w:tc>
+        <w:tc>
+          <w:tcPr>
+            <w:tcW w:type="dxa" w:w="2500"/>
+            <w:tcBorders>
+              <w:top w:val="single" w:color="B7C6DA" w:sz="1"/>
+              <w:left w:val="single" w:color="B7C6DA" w:sz="1"/>
+              <w:bottom w:val="single" w:color="B7C6DA" w:sz="1"/>
+              <w:right w:val="single" w:color="B7C6DA" w:sz="1"/>
+            </w:tcBorders>
+            <w:shd w:fill="1F3864" w:val="clear"/>
+            <w:tcMar>
+              <w:top w:type="dxa" w:w="60"/>
+              <w:left w:type="dxa" w:w="110"/>
+              <w:bottom w:type="dxa" w:w="60"/>
+              <w:right w:type="dxa" w:w="110"/>
+            </w:tcMar>
+            <w:vAlign w:val="center"/>
+          </w:tcPr>
+          <w:p>
+            <w:r>
+              <w:rPr>
+                <w:b/>
+                <w:bCs/>
+                <w:color w:val="FFFFFF"/>
+                <w:sz w:val="18"/>
+                <w:szCs w:val="18"/>
+              </w:rPr>
+              <w:t xml:space="preserve">Document this</w:t>
+            </w:r>
+          </w:p>
+        </w:tc>
+      </w:tr>
+      <w:tr>
+        <w:tc>
+          <w:tcPr>
+            <w:tcW w:type="dxa" w:w="2300"/>
+            <w:tcBorders>
+              <w:top w:val="single" w:color="B7C6DA" w:sz="1"/>
+              <w:left w:val="single" w:color="B7C6DA" w:sz="1"/>
+              <w:bottom w:val="single" w:color="B7C6DA" w:sz="1"/>
+              <w:right w:val="single" w:color="B7C6DA" w:sz="1"/>
+            </w:tcBorders>
+            <w:shd w:fill="FFFFFF" w:val="clear"/>
+            <w:tcMar>
+              <w:top w:type="dxa" w:w="60"/>
+              <w:left w:type="dxa" w:w="110"/>
+              <w:bottom w:type="dxa" w:w="60"/>
+              <w:right w:type="dxa" w:w="110"/>
+            </w:tcMar>
+            <w:vAlign w:val="center"/>
+          </w:tcPr>
+          <w:p>
+            <w:r>
+              <w:rPr>
+                <w:b/>
+                <w:bCs/>
+                <w:sz w:val="18"/>
+                <w:szCs w:val="18"/>
+              </w:rPr>
+              <w:t xml:space="preserve">Tracheostomy</w:t>
+            </w:r>
+          </w:p>
+        </w:tc>
+        <w:tc>
+          <w:tcPr>
+            <w:tcW w:type="dxa" w:w="2660"/>
+            <w:tcBorders>
+              <w:top w:val="single" w:color="B7C6DA" w:sz="1"/>
+              <w:left w:val="single" w:color="B7C6DA" w:sz="1"/>
+              <w:bottom w:val="single" w:color="B7C6DA" w:sz="1"/>
+              <w:right w:val="single" w:color="B7C6DA" w:sz="1"/>
+            </w:tcBorders>
+            <w:shd w:fill="FFFFFF" w:val="clear"/>
+            <w:tcMar>
+              <w:top w:type="dxa" w:w="60"/>
+              <w:left w:type="dxa" w:w="110"/>
+              <w:bottom w:type="dxa" w:w="60"/>
+              <w:right w:type="dxa" w:w="110"/>
+            </w:tcMar>
+            <w:vAlign w:val="center"/>
+          </w:tcPr>
+          <w:p>
+            <w:r>
+              <w:rPr>
+                <w:b w:val="false"/>
+                <w:bCs w:val="false"/>
+                <w:sz w:val="18"/>
+                <w:szCs w:val="18"/>
+              </w:rPr>
+              <w:t xml:space="preserve">0B110F4 open / 0B113F4 perc</w:t>
+            </w:r>
+          </w:p>
+        </w:tc>
+        <w:tc>
+          <w:tcPr>
+            <w:tcW w:type="dxa" w:w="1900"/>
+            <w:tcBorders>
+              <w:top w:val="single" w:color="B7C6DA" w:sz="1"/>
+              <w:left w:val="single" w:color="B7C6DA" w:sz="1"/>
+              <w:bottom w:val="single" w:color="B7C6DA" w:sz="1"/>
+              <w:right w:val="single" w:color="B7C6DA" w:sz="1"/>
+            </w:tcBorders>
+            <w:shd w:fill="FFFFFF" w:val="clear"/>
+            <w:tcMar>
+              <w:top w:type="dxa" w:w="60"/>
+              <w:left w:type="dxa" w:w="110"/>
+              <w:bottom w:type="dxa" w:w="60"/>
+              <w:right w:type="dxa" w:w="110"/>
+            </w:tcMar>
+            <w:vAlign w:val="center"/>
+          </w:tcPr>
+          <w:p>
+            <w:r>
+              <w:rPr>
+                <w:b w:val="false"/>
+                <w:bCs w:val="false"/>
+                <w:sz w:val="18"/>
+                <w:szCs w:val="18"/>
+              </w:rPr>
+              <w:t xml:space="preserve">Pre-MDC 003/004 (wt 21.2 / 13.9)</w:t>
+            </w:r>
+          </w:p>
+        </w:tc>
+        <w:tc>
+          <w:tcPr>
+            <w:tcW w:type="dxa" w:w="2500"/>
+            <w:tcBorders>
+              <w:top w:val="single" w:color="B7C6DA" w:sz="1"/>
+              <w:left w:val="single" w:color="B7C6DA" w:sz="1"/>
+              <w:bottom w:val="single" w:color="B7C6DA" w:sz="1"/>
+              <w:right w:val="single" w:color="B7C6DA" w:sz="1"/>
+            </w:tcBorders>
+            <w:shd w:fill="FFFFFF" w:val="clear"/>
+            <w:tcMar>
+              <w:top w:type="dxa" w:w="60"/>
+              <w:left w:type="dxa" w:w="110"/>
+              <w:bottom w:type="dxa" w:w="60"/>
+              <w:right w:type="dxa" w:w="110"/>
+            </w:tcMar>
+            <w:vAlign w:val="center"/>
+          </w:tcPr>
+          <w:p>
+            <w:r>
+              <w:rPr>
+                <w:b w:val="false"/>
+                <w:bCs w:val="false"/>
+                <w:sz w:val="18"/>
+                <w:szCs w:val="18"/>
+              </w:rPr>
+              <w:t xml:space="preserve">Date, approach, device placed, new vs pre-existing</w:t>
+            </w:r>
+          </w:p>
+        </w:tc>
+      </w:tr>
+      <w:tr>
+        <w:tc>
+          <w:tcPr>
+            <w:tcW w:type="dxa" w:w="2300"/>
+            <w:tcBorders>
+              <w:top w:val="single" w:color="B7C6DA" w:sz="1"/>
+              <w:left w:val="single" w:color="B7C6DA" w:sz="1"/>
+              <w:bottom w:val="single" w:color="B7C6DA" w:sz="1"/>
+              <w:right w:val="single" w:color="B7C6DA" w:sz="1"/>
+            </w:tcBorders>
+            <w:shd w:fill="EAF1F8" w:val="clear"/>
+            <w:tcMar>
+              <w:top w:type="dxa" w:w="60"/>
+              <w:left w:type="dxa" w:w="110"/>
+              <w:bottom w:type="dxa" w:w="60"/>
+              <w:right w:type="dxa" w:w="110"/>
+            </w:tcMar>
+            <w:vAlign w:val="center"/>
+          </w:tcPr>
+          <w:p>
+            <w:r>
+              <w:rPr>
+                <w:b/>
+                <w:bCs/>
+                <w:sz w:val="18"/>
+                <w:szCs w:val="18"/>
+              </w:rPr>
+              <w:t xml:space="preserve">ECMO</w:t>
+            </w:r>
+          </w:p>
+        </w:tc>
+        <w:tc>
+          <w:tcPr>
+            <w:tcW w:type="dxa" w:w="2660"/>
+            <w:tcBorders>
+              <w:top w:val="single" w:color="B7C6DA" w:sz="1"/>
+              <w:left w:val="single" w:color="B7C6DA" w:sz="1"/>
+              <w:bottom w:val="single" w:color="B7C6DA" w:sz="1"/>
+              <w:right w:val="single" w:color="B7C6DA" w:sz="1"/>
+            </w:tcBorders>
+            <w:shd w:fill="EAF1F8" w:val="clear"/>
+            <w:tcMar>
+              <w:top w:type="dxa" w:w="60"/>
+              <w:left w:type="dxa" w:w="110"/>
+              <w:bottom w:type="dxa" w:w="60"/>
+              <w:right w:type="dxa" w:w="110"/>
+            </w:tcMar>
+            <w:vAlign w:val="center"/>
+          </w:tcPr>
+          <w:p>
+            <w:r>
+              <w:rPr>
+                <w:b w:val="false"/>
+                <w:bCs w:val="false"/>
+                <w:sz w:val="18"/>
+                <w:szCs w:val="18"/>
+              </w:rPr>
+              <w:t xml:space="preserve">5A1522F/G/H (central / VA / VV)</w:t>
+            </w:r>
+          </w:p>
+        </w:tc>
+        <w:tc>
+          <w:tcPr>
+            <w:tcW w:type="dxa" w:w="1900"/>
+            <w:tcBorders>
+              <w:top w:val="single" w:color="B7C6DA" w:sz="1"/>
+              <w:left w:val="single" w:color="B7C6DA" w:sz="1"/>
+              <w:bottom w:val="single" w:color="B7C6DA" w:sz="1"/>
+              <w:right w:val="single" w:color="B7C6DA" w:sz="1"/>
+            </w:tcBorders>
+            <w:shd w:fill="EAF1F8" w:val="clear"/>
+            <w:tcMar>
+              <w:top w:type="dxa" w:w="60"/>
+              <w:left w:type="dxa" w:w="110"/>
+              <w:bottom w:type="dxa" w:w="60"/>
+              <w:right w:type="dxa" w:w="110"/>
+            </w:tcMar>
+            <w:vAlign w:val="center"/>
+          </w:tcPr>
+          <w:p>
+            <w:r>
+              <w:rPr>
+                <w:b w:val="false"/>
+                <w:bCs w:val="false"/>
+                <w:sz w:val="18"/>
+                <w:szCs w:val="18"/>
+              </w:rPr>
+              <w:t xml:space="preserve">Pre-MDC 003 (wt 21.2)</w:t>
+            </w:r>
+          </w:p>
+        </w:tc>
+        <w:tc>
+          <w:tcPr>
+            <w:tcW w:type="dxa" w:w="2500"/>
+            <w:tcBorders>
+              <w:top w:val="single" w:color="B7C6DA" w:sz="1"/>
+              <w:left w:val="single" w:color="B7C6DA" w:sz="1"/>
+              <w:bottom w:val="single" w:color="B7C6DA" w:sz="1"/>
+              <w:right w:val="single" w:color="B7C6DA" w:sz="1"/>
+            </w:tcBorders>
+            <w:shd w:fill="EAF1F8" w:val="clear"/>
+            <w:tcMar>
+              <w:top w:type="dxa" w:w="60"/>
+              <w:left w:type="dxa" w:w="110"/>
+              <w:bottom w:type="dxa" w:w="60"/>
+              <w:right w:type="dxa" w:w="110"/>
+            </w:tcMar>
+            <w:vAlign w:val="center"/>
+          </w:tcPr>
+          <w:p>
+            <w:r>
+              <w:rPr>
+                <w:b w:val="false"/>
+                <w:bCs w:val="false"/>
+                <w:sz w:val="18"/>
+                <w:szCs w:val="18"/>
+              </w:rPr>
+              <w:t xml:space="preserve">Configuration (VA/VV, central/peripheral), cannulation &amp; decannulation times</w:t>
+            </w:r>
+          </w:p>
+        </w:tc>
+      </w:tr>
+      <w:tr>
+        <w:tc>
+          <w:tcPr>
+            <w:tcW w:type="dxa" w:w="2300"/>
+            <w:tcBorders>
+              <w:top w:val="single" w:color="B7C6DA" w:sz="1"/>
+              <w:left w:val="single" w:color="B7C6DA" w:sz="1"/>
+              <w:bottom w:val="single" w:color="B7C6DA" w:sz="1"/>
+              <w:right w:val="single" w:color="B7C6DA" w:sz="1"/>
+            </w:tcBorders>
+            <w:shd w:fill="FFFFFF" w:val="clear"/>
+            <w:tcMar>
+              <w:top w:type="dxa" w:w="60"/>
+              <w:left w:type="dxa" w:w="110"/>
+              <w:bottom w:type="dxa" w:w="60"/>
+              <w:right w:type="dxa" w:w="110"/>
+            </w:tcMar>
+            <w:vAlign w:val="center"/>
+          </w:tcPr>
+          <w:p>
+            <w:r>
+              <w:rPr>
+                <w:b/>
+                <w:bCs/>
+                <w:sz w:val="18"/>
+                <w:szCs w:val="18"/>
+              </w:rPr>
+              <w:t xml:space="preserve">Mechanical circulatory support</w:t>
+            </w:r>
+          </w:p>
+        </w:tc>
+        <w:tc>
+          <w:tcPr>
+            <w:tcW w:type="dxa" w:w="2660"/>
+            <w:tcBorders>
+              <w:top w:val="single" w:color="B7C6DA" w:sz="1"/>
+              <w:left w:val="single" w:color="B7C6DA" w:sz="1"/>
+              <w:bottom w:val="single" w:color="B7C6DA" w:sz="1"/>
+              <w:right w:val="single" w:color="B7C6DA" w:sz="1"/>
+            </w:tcBorders>
+            <w:shd w:fill="FFFFFF" w:val="clear"/>
+            <w:tcMar>
+              <w:top w:type="dxa" w:w="60"/>
+              <w:left w:type="dxa" w:w="110"/>
+              <w:bottom w:type="dxa" w:w="60"/>
+              <w:right w:type="dxa" w:w="110"/>
+            </w:tcMar>
+            <w:vAlign w:val="center"/>
+          </w:tcPr>
+          <w:p>
+            <w:r>
+              <w:rPr>
+                <w:b w:val="false"/>
+                <w:bCs w:val="false"/>
+                <w:sz w:val="18"/>
+                <w:szCs w:val="18"/>
+              </w:rPr>
+              <w:t xml:space="preserve">5A02… (IABP/Impella/pVAD; verify)</w:t>
+            </w:r>
+          </w:p>
+        </w:tc>
+        <w:tc>
+          <w:tcPr>
+            <w:tcW w:type="dxa" w:w="1900"/>
+            <w:tcBorders>
+              <w:top w:val="single" w:color="B7C6DA" w:sz="1"/>
+              <w:left w:val="single" w:color="B7C6DA" w:sz="1"/>
+              <w:bottom w:val="single" w:color="B7C6DA" w:sz="1"/>
+              <w:right w:val="single" w:color="B7C6DA" w:sz="1"/>
+            </w:tcBorders>
+            <w:shd w:fill="FFFFFF" w:val="clear"/>
+            <w:tcMar>
+              <w:top w:type="dxa" w:w="60"/>
+              <w:left w:type="dxa" w:w="110"/>
+              <w:bottom w:type="dxa" w:w="60"/>
+              <w:right w:type="dxa" w:w="110"/>
+            </w:tcMar>
+            <w:vAlign w:val="center"/>
+          </w:tcPr>
+          <w:p>
+            <w:r>
+              <w:rPr>
+                <w:b w:val="false"/>
+                <w:bCs w:val="false"/>
+                <w:sz w:val="18"/>
+                <w:szCs w:val="18"/>
+              </w:rPr>
+              <w:t xml:space="preserve">High cardiac DRGs</w:t>
+            </w:r>
+          </w:p>
+        </w:tc>
+        <w:tc>
+          <w:tcPr>
+            <w:tcW w:type="dxa" w:w="2500"/>
+            <w:tcBorders>
+              <w:top w:val="single" w:color="B7C6DA" w:sz="1"/>
+              <w:left w:val="single" w:color="B7C6DA" w:sz="1"/>
+              <w:bottom w:val="single" w:color="B7C6DA" w:sz="1"/>
+              <w:right w:val="single" w:color="B7C6DA" w:sz="1"/>
+            </w:tcBorders>
+            <w:shd w:fill="FFFFFF" w:val="clear"/>
+            <w:tcMar>
+              <w:top w:type="dxa" w:w="60"/>
+              <w:left w:type="dxa" w:w="110"/>
+              <w:bottom w:type="dxa" w:w="60"/>
+              <w:right w:type="dxa" w:w="110"/>
+            </w:tcMar>
+            <w:vAlign w:val="center"/>
+          </w:tcPr>
+          <w:p>
+            <w:r>
+              <w:rPr>
+                <w:b w:val="false"/>
+                <w:bCs w:val="false"/>
+                <w:sz w:val="18"/>
+                <w:szCs w:val="18"/>
+              </w:rPr>
+              <w:t xml:space="preserve">Device type, intermittent vs continuous, insertion/removal times</w:t>
+            </w:r>
+          </w:p>
+        </w:tc>
+      </w:tr>
+      <w:tr>
+        <w:tc>
+          <w:tcPr>
+            <w:tcW w:type="dxa" w:w="2300"/>
+            <w:tcBorders>
+              <w:top w:val="single" w:color="B7C6DA" w:sz="1"/>
+              <w:left w:val="single" w:color="B7C6DA" w:sz="1"/>
+              <w:bottom w:val="single" w:color="B7C6DA" w:sz="1"/>
+              <w:right w:val="single" w:color="B7C6DA" w:sz="1"/>
+            </w:tcBorders>
+            <w:shd w:fill="EAF1F8" w:val="clear"/>
+            <w:tcMar>
+              <w:top w:type="dxa" w:w="60"/>
+              <w:left w:type="dxa" w:w="110"/>
+              <w:bottom w:type="dxa" w:w="60"/>
+              <w:right w:type="dxa" w:w="110"/>
+            </w:tcMar>
+            <w:vAlign w:val="center"/>
+          </w:tcPr>
+          <w:p>
+            <w:r>
+              <w:rPr>
+                <w:b/>
+                <w:bCs/>
+                <w:sz w:val="18"/>
+                <w:szCs w:val="18"/>
+              </w:rPr>
+              <w:t xml:space="preserve">Mechanical ventilation</w:t>
+            </w:r>
+          </w:p>
+        </w:tc>
+        <w:tc>
+          <w:tcPr>
+            <w:tcW w:type="dxa" w:w="2660"/>
+            <w:tcBorders>
+              <w:top w:val="single" w:color="B7C6DA" w:sz="1"/>
+              <w:left w:val="single" w:color="B7C6DA" w:sz="1"/>
+              <w:bottom w:val="single" w:color="B7C6DA" w:sz="1"/>
+              <w:right w:val="single" w:color="B7C6DA" w:sz="1"/>
+            </w:tcBorders>
+            <w:shd w:fill="EAF1F8" w:val="clear"/>
+            <w:tcMar>
+              <w:top w:type="dxa" w:w="60"/>
+              <w:left w:type="dxa" w:w="110"/>
+              <w:bottom w:type="dxa" w:w="60"/>
+              <w:right w:type="dxa" w:w="110"/>
+            </w:tcMar>
+            <w:vAlign w:val="center"/>
+          </w:tcPr>
+          <w:p>
+            <w:r>
+              <w:rPr>
+                <w:b w:val="false"/>
+                <w:bCs w:val="false"/>
+                <w:sz w:val="18"/>
+                <w:szCs w:val="18"/>
+              </w:rPr>
+              <w:t xml:space="preserve">5A1935Z / 45Z / 55Z (&lt;24 / 24–96 / &gt;96h)</w:t>
+            </w:r>
+          </w:p>
+        </w:tc>
+        <w:tc>
+          <w:tcPr>
+            <w:tcW w:type="dxa" w:w="1900"/>
+            <w:tcBorders>
+              <w:top w:val="single" w:color="B7C6DA" w:sz="1"/>
+              <w:left w:val="single" w:color="B7C6DA" w:sz="1"/>
+              <w:bottom w:val="single" w:color="B7C6DA" w:sz="1"/>
+              <w:right w:val="single" w:color="B7C6DA" w:sz="1"/>
+            </w:tcBorders>
+            <w:shd w:fill="EAF1F8" w:val="clear"/>
+            <w:tcMar>
+              <w:top w:type="dxa" w:w="60"/>
+              <w:left w:type="dxa" w:w="110"/>
+              <w:bottom w:type="dxa" w:w="60"/>
+              <w:right w:type="dxa" w:w="110"/>
+            </w:tcMar>
+            <w:vAlign w:val="center"/>
+          </w:tcPr>
+          <w:p>
+            <w:r>
+              <w:rPr>
+                <w:b w:val="false"/>
+                <w:bCs w:val="false"/>
+                <w:sz w:val="18"/>
+                <w:szCs w:val="18"/>
+              </w:rPr>
+              <w:t xml:space="preserve">DRG 207 vs 208; feeds 003/004/870</w:t>
+            </w:r>
+          </w:p>
+        </w:tc>
+        <w:tc>
+          <w:tcPr>
+            <w:tcW w:type="dxa" w:w="2500"/>
+            <w:tcBorders>
+              <w:top w:val="single" w:color="B7C6DA" w:sz="1"/>
+              <w:left w:val="single" w:color="B7C6DA" w:sz="1"/>
+              <w:bottom w:val="single" w:color="B7C6DA" w:sz="1"/>
+              <w:right w:val="single" w:color="B7C6DA" w:sz="1"/>
+            </w:tcBorders>
+            <w:shd w:fill="EAF1F8" w:val="clear"/>
+            <w:tcMar>
+              <w:top w:type="dxa" w:w="60"/>
+              <w:left w:type="dxa" w:w="110"/>
+              <w:bottom w:type="dxa" w:w="60"/>
+              <w:right w:type="dxa" w:w="110"/>
+            </w:tcMar>
+            <w:vAlign w:val="center"/>
+          </w:tcPr>
+          <w:p>
+            <w:r>
+              <w:rPr>
+                <w:b w:val="false"/>
+                <w:bCs w:val="false"/>
+                <w:sz w:val="18"/>
+                <w:szCs w:val="18"/>
+              </w:rPr>
+              <w:t xml:space="preserve">Intubation &amp; extubation times; invasive vs BiPAP</w:t>
+            </w:r>
+          </w:p>
+        </w:tc>
+      </w:tr>
+      <w:tr>
+        <w:tc>
+          <w:tcPr>
+            <w:tcW w:type="dxa" w:w="2300"/>
+            <w:tcBorders>
+              <w:top w:val="single" w:color="B7C6DA" w:sz="1"/>
+              <w:left w:val="single" w:color="B7C6DA" w:sz="1"/>
+              <w:bottom w:val="single" w:color="B7C6DA" w:sz="1"/>
+              <w:right w:val="single" w:color="B7C6DA" w:sz="1"/>
+            </w:tcBorders>
+            <w:shd w:fill="FFFFFF" w:val="clear"/>
+            <w:tcMar>
+              <w:top w:type="dxa" w:w="60"/>
+              <w:left w:type="dxa" w:w="110"/>
+              <w:bottom w:type="dxa" w:w="60"/>
+              <w:right w:type="dxa" w:w="110"/>
+            </w:tcMar>
+            <w:vAlign w:val="center"/>
+          </w:tcPr>
+          <w:p>
+            <w:r>
+              <w:rPr>
+                <w:b/>
+                <w:bCs/>
+                <w:sz w:val="18"/>
+                <w:szCs w:val="18"/>
+              </w:rPr>
+              <w:t xml:space="preserve">CRRT / dialysis</w:t>
+            </w:r>
+          </w:p>
+        </w:tc>
+        <w:tc>
+          <w:tcPr>
+            <w:tcW w:type="dxa" w:w="2660"/>
+            <w:tcBorders>
+              <w:top w:val="single" w:color="B7C6DA" w:sz="1"/>
+              <w:left w:val="single" w:color="B7C6DA" w:sz="1"/>
+              <w:bottom w:val="single" w:color="B7C6DA" w:sz="1"/>
+              <w:right w:val="single" w:color="B7C6DA" w:sz="1"/>
+            </w:tcBorders>
+            <w:shd w:fill="FFFFFF" w:val="clear"/>
+            <w:tcMar>
+              <w:top w:type="dxa" w:w="60"/>
+              <w:left w:type="dxa" w:w="110"/>
+              <w:bottom w:type="dxa" w:w="60"/>
+              <w:right w:type="dxa" w:w="110"/>
+            </w:tcMar>
+            <w:vAlign w:val="center"/>
+          </w:tcPr>
+          <w:p>
+            <w:r>
+              <w:rPr>
+                <w:b w:val="false"/>
+                <w:bCs w:val="false"/>
+                <w:sz w:val="18"/>
+                <w:szCs w:val="18"/>
+              </w:rPr>
+              <w:t xml:space="preserve">5A1D90Z continuous / 5A1D70Z intermittent</w:t>
+            </w:r>
+          </w:p>
+        </w:tc>
+        <w:tc>
+          <w:tcPr>
+            <w:tcW w:type="dxa" w:w="1900"/>
+            <w:tcBorders>
+              <w:top w:val="single" w:color="B7C6DA" w:sz="1"/>
+              <w:left w:val="single" w:color="B7C6DA" w:sz="1"/>
+              <w:bottom w:val="single" w:color="B7C6DA" w:sz="1"/>
+              <w:right w:val="single" w:color="B7C6DA" w:sz="1"/>
+            </w:tcBorders>
+            <w:shd w:fill="FFFFFF" w:val="clear"/>
+            <w:tcMar>
+              <w:top w:type="dxa" w:w="60"/>
+              <w:left w:type="dxa" w:w="110"/>
+              <w:bottom w:type="dxa" w:w="60"/>
+              <w:right w:type="dxa" w:w="110"/>
+            </w:tcMar>
+            <w:vAlign w:val="center"/>
+          </w:tcPr>
+          <w:p>
+            <w:r>
+              <w:rPr>
+                <w:b w:val="false"/>
+                <w:bCs w:val="false"/>
+                <w:sz w:val="18"/>
+                <w:szCs w:val="18"/>
+              </w:rPr>
+              <w:t xml:space="preserve">Supports N17 (CC); low standalone</w:t>
+            </w:r>
+          </w:p>
+        </w:tc>
+        <w:tc>
+          <w:tcPr>
+            <w:tcW w:type="dxa" w:w="2500"/>
+            <w:tcBorders>
+              <w:top w:val="single" w:color="B7C6DA" w:sz="1"/>
+              <w:left w:val="single" w:color="B7C6DA" w:sz="1"/>
+              <w:bottom w:val="single" w:color="B7C6DA" w:sz="1"/>
+              <w:right w:val="single" w:color="B7C6DA" w:sz="1"/>
+            </w:tcBorders>
+            <w:shd w:fill="FFFFFF" w:val="clear"/>
+            <w:tcMar>
+              <w:top w:type="dxa" w:w="60"/>
+              <w:left w:type="dxa" w:w="110"/>
+              <w:bottom w:type="dxa" w:w="60"/>
+              <w:right w:type="dxa" w:w="110"/>
+            </w:tcMar>
+            <w:vAlign w:val="center"/>
+          </w:tcPr>
+          <w:p>
+            <w:r>
+              <w:rPr>
+                <w:b w:val="false"/>
+                <w:bCs w:val="false"/>
+                <w:sz w:val="18"/>
+                <w:szCs w:val="18"/>
+              </w:rPr>
+              <w:t xml:space="preserve">Modality, continuous &gt;18h, link to acute kidney failure</w:t>
+            </w:r>
+          </w:p>
+        </w:tc>
+      </w:tr>
+      <w:tr>
+        <w:tc>
+          <w:tcPr>
+            <w:tcW w:type="dxa" w:w="2300"/>
+            <w:tcBorders>
+              <w:top w:val="single" w:color="B7C6DA" w:sz="1"/>
+              <w:left w:val="single" w:color="B7C6DA" w:sz="1"/>
+              <w:bottom w:val="single" w:color="B7C6DA" w:sz="1"/>
+              <w:right w:val="single" w:color="B7C6DA" w:sz="1"/>
+            </w:tcBorders>
+            <w:shd w:fill="EAF1F8" w:val="clear"/>
+            <w:tcMar>
+              <w:top w:type="dxa" w:w="60"/>
+              <w:left w:type="dxa" w:w="110"/>
+              <w:bottom w:type="dxa" w:w="60"/>
+              <w:right w:type="dxa" w:w="110"/>
+            </w:tcMar>
+            <w:vAlign w:val="center"/>
+          </w:tcPr>
+          <w:p>
+            <w:r>
+              <w:rPr>
+                <w:b/>
+                <w:bCs/>
+                <w:sz w:val="18"/>
+                <w:szCs w:val="18"/>
+              </w:rPr>
+              <w:t xml:space="preserve">Therapeutic hypothermia / TTM</w:t>
+            </w:r>
+          </w:p>
+        </w:tc>
+        <w:tc>
+          <w:tcPr>
+            <w:tcW w:type="dxa" w:w="2660"/>
+            <w:tcBorders>
+              <w:top w:val="single" w:color="B7C6DA" w:sz="1"/>
+              <w:left w:val="single" w:color="B7C6DA" w:sz="1"/>
+              <w:bottom w:val="single" w:color="B7C6DA" w:sz="1"/>
+              <w:right w:val="single" w:color="B7C6DA" w:sz="1"/>
+            </w:tcBorders>
+            <w:shd w:fill="EAF1F8" w:val="clear"/>
+            <w:tcMar>
+              <w:top w:type="dxa" w:w="60"/>
+              <w:left w:type="dxa" w:w="110"/>
+              <w:bottom w:type="dxa" w:w="60"/>
+              <w:right w:type="dxa" w:w="110"/>
+            </w:tcMar>
+            <w:vAlign w:val="center"/>
+          </w:tcPr>
+          <w:p>
+            <w:r>
+              <w:rPr>
+                <w:b w:val="false"/>
+                <w:bCs w:val="false"/>
+                <w:sz w:val="18"/>
+                <w:szCs w:val="18"/>
+              </w:rPr>
+              <w:t xml:space="preserve">6A4Z0ZZ / 6A4Z1ZZ</w:t>
+            </w:r>
+          </w:p>
+        </w:tc>
+        <w:tc>
+          <w:tcPr>
+            <w:tcW w:type="dxa" w:w="1900"/>
+            <w:tcBorders>
+              <w:top w:val="single" w:color="B7C6DA" w:sz="1"/>
+              <w:left w:val="single" w:color="B7C6DA" w:sz="1"/>
+              <w:bottom w:val="single" w:color="B7C6DA" w:sz="1"/>
+              <w:right w:val="single" w:color="B7C6DA" w:sz="1"/>
+            </w:tcBorders>
+            <w:shd w:fill="EAF1F8" w:val="clear"/>
+            <w:tcMar>
+              <w:top w:type="dxa" w:w="60"/>
+              <w:left w:type="dxa" w:w="110"/>
+              <w:bottom w:type="dxa" w:w="60"/>
+              <w:right w:type="dxa" w:w="110"/>
+            </w:tcMar>
+            <w:vAlign w:val="center"/>
+          </w:tcPr>
+          <w:p>
+            <w:r>
+              <w:rPr>
+                <w:b w:val="false"/>
+                <w:bCs w:val="false"/>
+                <w:sz w:val="18"/>
+                <w:szCs w:val="18"/>
+              </w:rPr>
+              <w:t xml:space="preserve">Supportive</w:t>
+            </w:r>
+          </w:p>
+        </w:tc>
+        <w:tc>
+          <w:tcPr>
+            <w:tcW w:type="dxa" w:w="2500"/>
+            <w:tcBorders>
+              <w:top w:val="single" w:color="B7C6DA" w:sz="1"/>
+              <w:left w:val="single" w:color="B7C6DA" w:sz="1"/>
+              <w:bottom w:val="single" w:color="B7C6DA" w:sz="1"/>
+              <w:right w:val="single" w:color="B7C6DA" w:sz="1"/>
+            </w:tcBorders>
+            <w:shd w:fill="EAF1F8" w:val="clear"/>
+            <w:tcMar>
+              <w:top w:type="dxa" w:w="60"/>
+              <w:left w:type="dxa" w:w="110"/>
+              <w:bottom w:type="dxa" w:w="60"/>
+              <w:right w:type="dxa" w:w="110"/>
+            </w:tcMar>
+            <w:vAlign w:val="center"/>
+          </w:tcPr>
+          <w:p>
+            <w:r>
+              <w:rPr>
+                <w:b w:val="false"/>
+                <w:bCs w:val="false"/>
+                <w:sz w:val="18"/>
+                <w:szCs w:val="18"/>
+              </w:rPr>
+              <w:t xml:space="preserve">Indication (post-arrest), single vs multiple</w:t>
+            </w:r>
+          </w:p>
+        </w:tc>
+      </w:tr>
+    </w:tbl>
+    <w:p>
+      <w:pPr>
+        <w:spacing w:after="80"/>
+      </w:pPr>
+      <w:r>
+        <w:rPr>
+          <w:b w:val="false"/>
+          <w:bCs w:val="false"/>
+          <w:i/>
+          <w:iCs/>
+          <w:sz w:val="16"/>
+          <w:szCs w:val="16"/>
+        </w:rPr>
+        <w:t xml:space="preserve">Weights are FY2026 MS-DRG relative weights (CMS IPPS Final Rule, Table 5). Trach and ECMO are Pre-MDC (grouped before organ system) — the richest cases in the ICU. Mechanical circulatory support codes vary by device; verify the exact code and current grouper.</w:t>
+      </w:r>
+    </w:p>
+    <w:p>
+      <w:pPr>
+        <w:pStyle w:val="Heading2"/>
+      </w:pPr>
+      <w:r>
+        <w:t xml:space="preserve">How to write the note so it's captured</w:t>
+      </w:r>
+    </w:p>
+    <w:p>
+      <w:pPr>
+        <w:spacing w:after="40"/>
+      </w:pPr>
+      <w:r>
+        <w:rPr>
+          <w:b w:val="false"/>
+          <w:bCs w:val="false"/>
+          <w:i w:val="false"/>
+          <w:iCs w:val="false"/>
+          <w:sz w:val="20"/>
+          <w:szCs w:val="20"/>
+        </w:rPr>
+        <w:t xml:space="preserve">Drop a dated, structured one-liner in the procedure note and carry it forward in the daily assessment — each line gives the coder the axes they need (approach, device, configuration, timestamps):</w:t>
+      </w:r>
+    </w:p>
+    <w:p>
+      <w:pPr>
+        <w:pBdr>
+          <w:left w:val="single" w:color="2E75B6" w:sz="18" w:space="6"/>
+        </w:pBdr>
+        <w:shd w:fill="EAF1F8" w:val="clear"/>
+        <w:spacing w:after="160" w:before="40"/>
+      </w:pPr>
+      <w:r>
+        <w:rPr>
+          <w:i/>
+          <w:iCs/>
+          <w:sz w:val="20"/>
+          <w:szCs w:val="20"/>
+        </w:rPr>
+        <w:t xml:space="preserve">“Invasive mechanical ventilation via ETT, continuous since [date/time]; remains ventilated (or extubated [date/time]).”</w:t>
+      </w:r>
+      <w:r>
+        <w:rPr>
+          <w:i/>
+          <w:iCs/>
+          <w:sz w:val="20"/>
+          <w:szCs w:val="20"/>
+        </w:rPr>
+        <w:br/>
+        <w:t xml:space="preserve">“CRRT (CVVHDF), continuous, initiated [date/time], for acute kidney failure / ATN.”</w:t>
+      </w:r>
+      <w:r>
+        <w:rPr>
+          <w:i/>
+          <w:iCs/>
+          <w:sz w:val="20"/>
+          <w:szCs w:val="20"/>
+        </w:rPr>
+        <w:br/>
+        <w:t xml:space="preserve">“Percutaneous tracheostomy performed [date]; tracheostomy tube placed.”</w:t>
+      </w:r>
+      <w:r>
+        <w:rPr>
+          <w:i/>
+          <w:iCs/>
+          <w:sz w:val="20"/>
+          <w:szCs w:val="20"/>
+        </w:rPr>
+        <w:br/>
+        <w:t xml:space="preserve">“VV ECMO, peripheral cannulation, initiated [date/time]; ongoing.”</w:t>
+      </w:r>
+    </w:p>
+    <w:p>
+      <w:pPr>
+        <w:pStyle w:val="ListParagraph"/>
+        <w:numPr>
+          <w:ilvl w:val="0"/>
+          <w:numId w:val="2"/>
+        </w:numPr>
+        <w:spacing w:after="60"/>
+      </w:pPr>
+      <w:r>
+        <w:rPr>
+          <w:b/>
+          <w:bCs/>
+          <w:i w:val="false"/>
+          <w:iCs w:val="false"/>
+          <w:sz w:val="20"/>
+          <w:szCs w:val="20"/>
+        </w:rPr>
+        <w:t xml:space="preserve">Timestamps over adjectives. </w:t>
+      </w:r>
+      <w:r>
+        <w:rPr>
+          <w:b w:val="false"/>
+          <w:bCs w:val="false"/>
+          <w:i w:val="false"/>
+          <w:iCs w:val="false"/>
+          <w:sz w:val="20"/>
+          <w:szCs w:val="20"/>
+        </w:rPr>
+        <w:t xml:space="preserve">Every vent/ECMO/CRRT duration code is computed from documented start/stop times.</w:t>
+      </w:r>
+    </w:p>
+    <w:p>
+      <w:pPr>
+        <w:pStyle w:val="ListParagraph"/>
+        <w:numPr>
+          <w:ilvl w:val="0"/>
+          <w:numId w:val="2"/>
+        </w:numPr>
+        <w:spacing w:after="60"/>
+      </w:pPr>
+      <w:r>
+        <w:rPr>
+          <w:b/>
+          <w:bCs/>
+          <w:i w:val="false"/>
+          <w:iCs w:val="false"/>
+          <w:sz w:val="20"/>
+          <w:szCs w:val="20"/>
+        </w:rPr>
+        <w:t xml:space="preserve">Name the modality. </w:t>
+      </w:r>
+      <w:r>
+        <w:rPr>
+          <w:b w:val="false"/>
+          <w:bCs w:val="false"/>
+          <w:i w:val="false"/>
+          <w:iCs w:val="false"/>
+          <w:sz w:val="20"/>
+          <w:szCs w:val="20"/>
+        </w:rPr>
+        <w:t xml:space="preserve">Continuous CRRT vs intermittent HD; invasive ventilation vs BiPAP; VA vs VV ECMO.</w:t>
+      </w:r>
+    </w:p>
+    <w:p>
+      <w:pPr>
+        <w:pStyle w:val="ListParagraph"/>
+        <w:numPr>
+          <w:ilvl w:val="0"/>
+          <w:numId w:val="2"/>
+        </w:numPr>
+        <w:spacing w:after="60"/>
+      </w:pPr>
+      <w:r>
+        <w:rPr>
+          <w:b/>
+          <w:bCs/>
+          <w:i w:val="false"/>
+          <w:iCs w:val="false"/>
+          <w:sz w:val="20"/>
+          <w:szCs w:val="20"/>
+        </w:rPr>
+        <w:t xml:space="preserve">Link the procedure to its diagnosis. </w:t>
+      </w:r>
+      <w:r>
+        <w:rPr>
+          <w:b w:val="false"/>
+          <w:bCs w:val="false"/>
+          <w:i w:val="false"/>
+          <w:iCs w:val="false"/>
+          <w:sz w:val="20"/>
+          <w:szCs w:val="20"/>
+        </w:rPr>
+        <w:t xml:space="preserve">CRRT only earns its keep when the acute kidney failure (N17, a CC) is documented and coded.</w:t>
+      </w:r>
+    </w:p>
+    <w:p>
+      <w:pPr>
+        <w:pStyle w:val="ListParagraph"/>
+        <w:numPr>
+          <w:ilvl w:val="0"/>
+          <w:numId w:val="2"/>
+        </w:numPr>
+        <w:spacing w:after="60"/>
+      </w:pPr>
+      <w:r>
+        <w:rPr>
+          <w:b/>
+          <w:bCs/>
+          <w:i w:val="false"/>
+          <w:iCs w:val="false"/>
+          <w:sz w:val="20"/>
+          <w:szCs w:val="20"/>
+        </w:rPr>
+        <w:t xml:space="preserve">New procedure vs chronic status. </w:t>
+      </w:r>
+      <w:r>
+        <w:rPr>
+          <w:b w:val="false"/>
+          <w:bCs w:val="false"/>
+          <w:i w:val="false"/>
+          <w:iCs w:val="false"/>
+          <w:sz w:val="20"/>
+          <w:szCs w:val="20"/>
+        </w:rPr>
+        <w:t xml:space="preserve">A trach placed this stay drives 003/004; “chronically trached/vented at baseline” is a status code and does not.</w:t>
+      </w:r>
+    </w:p>
+    <w:p>
+      <w:pPr>
+        <w:spacing w:after="120"/>
+      </w:pPr>
+      <w:r>
+        <w:rPr>
+          <w:b w:val="false"/>
+          <w:bCs w:val="false"/>
+          <w:i/>
+          <w:iCs/>
+          <w:sz w:val="16"/>
+          <w:szCs w:val="16"/>
+        </w:rPr>
+        <w:t xml:space="preserve">PCS-to-DRG assignment changes annually; verify codes against the current ICD-10-PCS tables, the FY2026 MS-DRG Definitions Manual, and AHA Coding Clinic (which governs ventilation hour-counting and reintubation).</w:t>
+      </w:r>
+    </w:p>
+    <w:p>
+      <w:r>
+        <w:br w:type="page"/>
+      </w:r>
+    </w:p>
+    <w:p>
+      <w:pPr>
+        <w:pStyle w:val="Heading1"/>
+      </w:pPr>
+      <w:r>
+        <w:t xml:space="preserve">7. Common ICU Diagnoses (ICD-10) &amp; Specificity</w:t>
       </w:r>
     </w:p>
     <w:p>
@@ -9498,6 +12859,40 @@
           <w:szCs w:val="20"/>
         </w:rPr>
         <w:t xml:space="preserve">CodingIntel — CPT vs CMS critical care rules; AAPC / FindACode code references; FastRVU 2026 per-code RVU pages</w:t>
+      </w:r>
+    </w:p>
+    <w:p>
+      <w:pPr>
+        <w:pStyle w:val="ListParagraph"/>
+        <w:numPr>
+          <w:ilvl w:val="0"/>
+          <w:numId w:val="2"/>
+        </w:numPr>
+        <w:spacing w:after="60"/>
+      </w:pPr>
+      <w:r>
+        <w:rPr>
+          <w:sz w:val="20"/>
+          <w:szCs w:val="20"/>
+        </w:rPr>
+        <w:t xml:space="preserve">CMS — ICD-10 MS-DRG Definitions Manual v43.0 (FY2026) and FY2026 IPPS Final Rule Table 5 (DRG relative weights); CMS ICD-10-PCS code tables and reference manual.</w:t>
+      </w:r>
+    </w:p>
+    <w:p>
+      <w:pPr>
+        <w:pStyle w:val="ListParagraph"/>
+        <w:numPr>
+          <w:ilvl w:val="0"/>
+          <w:numId w:val="2"/>
+        </w:numPr>
+        <w:spacing w:after="60"/>
+      </w:pPr>
+      <w:r>
+        <w:rPr>
+          <w:sz w:val="20"/>
+          <w:szCs w:val="20"/>
+        </w:rPr>
+        <w:t xml:space="preserve">AHA Coding Clinic for ICD-10-CM/PCS — mechanical ventilation hour counting, tracheostomy, ECMO, and renal replacement therapy coding.</w:t>
       </w:r>
     </w:p>
     <w:sectPr>

</xml_diff>

<commit_message>
Update cheat sheet, add .nojekyll, trim README
- Refresh Critical Care Billing Cheat Sheet 2026 (.docx)
- Add .nojekyll so GitHub Pages serves files as-is
- Remove deploy/preview sections from README
- Normalize trailing newline in styles.css

Co-Authored-By: Claude Opus 4.8 (1M context) <noreply@anthropic.com>
</commit_message>
<xml_diff>
--- a/downloads/Critical_Care_Billing_Cheat_Sheet_2026.docx
+++ b/downloads/Critical_Care_Billing_Cheat_Sheet_2026.docx
@@ -212,166 +212,6 @@
           <w:szCs w:val="20"/>
         </w:rPr>
         <w:t xml:space="preserve">The dollar figures throughout this sheet use national, unadjusted total facility RVUs × $33.40. Your local payment will vary with GPCI. wRVU columns are what most productivity / compensation models track.</w:t>
-      </w:r>
-    </w:p>
-    <w:p>
-      <w:pPr>
-        <w:pStyle w:val="Heading2"/>
-      </w:pPr>
-      <w:r>
-        <w:t xml:space="preserve">Facility vs professional — two separate money streams</w:t>
-      </w:r>
-    </w:p>
-    <w:p>
-      <w:pPr>
-        <w:spacing w:after="80"/>
-      </w:pPr>
-      <w:r>
-        <w:rPr>
-          <w:b w:val="false"/>
-          <w:bCs w:val="false"/>
-          <w:i w:val="false"/>
-          <w:iCs w:val="false"/>
-          <w:sz w:val="20"/>
-          <w:szCs w:val="20"/>
-        </w:rPr>
-        <w:t xml:space="preserve">One ICU stay generates two independent bills that never come out of each other. The hospital is paid one MS-DRG under Medicare Part A (IPPS); your professional work is billed separately under Medicare Part B (Physician Fee Schedule, CPT codes). Two claims, separate deductibles — the physician fee is not carved out of the DRG.</w:t>
-      </w:r>
-    </w:p>
-    <w:p>
-      <w:pPr>
-        <w:pStyle w:val="Heading2"/>
-      </w:pPr>
-      <w:r>
-        <w:t xml:space="preserve">Common questions — facility vs professional</w:t>
-      </w:r>
-    </w:p>
-    <w:p>
-      <w:pPr>
-        <w:spacing w:after="40"/>
-      </w:pPr>
-      <w:r>
-        <w:rPr>
-          <w:b/>
-          <w:bCs/>
-          <w:i w:val="false"/>
-          <w:iCs w:val="false"/>
-          <w:sz w:val="20"/>
-          <w:szCs w:val="20"/>
-        </w:rPr>
-        <w:t xml:space="preserve">Can a hospital be reimbursed for multiple DRGs in one hospitalization?</w:t>
-      </w:r>
-    </w:p>
-    <w:p>
-      <w:pPr>
-        <w:spacing w:after="100"/>
-      </w:pPr>
-      <w:r>
-        <w:rPr>
-          <w:b w:val="false"/>
-          <w:bCs w:val="false"/>
-          <w:i w:val="false"/>
-          <w:iCs w:val="false"/>
-          <w:sz w:val="20"/>
-          <w:szCs w:val="20"/>
-        </w:rPr>
-        <w:t xml:space="preserve">Generally no — one MS-DRG per discharge. The entire stay groups to a single DRG. Outlier payments, New Technology Add-On Payments (NTAP), and DSH/IME adjustments can increase that one payment but are not additional DRGs. Genuinely separate admissions are separate DRGs; a same-day, same-hospital readmission for a related condition must be combined onto one claim; a transferring hospital is usually paid a reduced per-diem rather than the full DRG.</w:t>
-      </w:r>
-    </w:p>
-    <w:p>
-      <w:pPr>
-        <w:spacing w:after="40"/>
-      </w:pPr>
-      <w:r>
-        <w:rPr>
-          <w:b/>
-          <w:bCs/>
-          <w:i w:val="false"/>
-          <w:iCs w:val="false"/>
-          <w:sz w:val="20"/>
-          <w:szCs w:val="20"/>
-        </w:rPr>
-        <w:t xml:space="preserve">Is the DRG billed separately from the physician component, or does the physician fee come out of the DRG?</w:t>
-      </w:r>
-    </w:p>
-    <w:p>
-      <w:pPr>
-        <w:spacing w:after="100"/>
-      </w:pPr>
-      <w:r>
-        <w:rPr>
-          <w:b w:val="false"/>
-          <w:bCs w:val="false"/>
-          <w:i w:val="false"/>
-          <w:iCs w:val="false"/>
-          <w:sz w:val="20"/>
-          <w:szCs w:val="20"/>
-        </w:rPr>
-        <w:t xml:space="preserve">Separate — the physician fee does not come out of the DRG. The DRG is the hospital's facility payment under Part A; your professional work is billed independently under Part B. As an employed academic attending, your Part B payment may flow to the faculty practice plan, but it is still a distinct claim, never part of the DRG.</w:t>
-      </w:r>
-    </w:p>
-    <w:p>
-      <w:pPr>
-        <w:spacing w:after="40"/>
-      </w:pPr>
-      <w:r>
-        <w:rPr>
-          <w:b/>
-          <w:bCs/>
-          <w:i w:val="false"/>
-          <w:iCs w:val="false"/>
-          <w:sz w:val="20"/>
-          <w:szCs w:val="20"/>
-        </w:rPr>
-        <w:t xml:space="preserve">What costs come out of the DRG?</w:t>
-      </w:r>
-    </w:p>
-    <w:p>
-      <w:pPr>
-        <w:spacing w:after="100"/>
-      </w:pPr>
-      <w:r>
-        <w:rPr>
-          <w:b w:val="false"/>
-          <w:bCs w:val="false"/>
-          <w:i w:val="false"/>
-          <w:iCs w:val="false"/>
-          <w:sz w:val="20"/>
-          <w:szCs w:val="20"/>
-        </w:rPr>
-        <w:t xml:space="preserve">The facility's cost of the stay: room/bed and ICU overhead, nursing, drugs and supplies, blood products, implanted devices, and the technical component of labs and imaging. NOT physician professional services, which are billed separately under Part B.</w:t>
-      </w:r>
-    </w:p>
-    <w:p>
-      <w:pPr>
-        <w:spacing w:after="40"/>
-      </w:pPr>
-      <w:r>
-        <w:rPr>
-          <w:b/>
-          <w:bCs/>
-          <w:i w:val="false"/>
-          <w:iCs w:val="false"/>
-          <w:sz w:val="20"/>
-          <w:szCs w:val="20"/>
-        </w:rPr>
-        <w:t xml:space="preserve">Once you've captured a single MCC, is there any point to capturing more CCs?</w:t>
-      </w:r>
-    </w:p>
-    <w:p>
-      <w:pPr>
-        <w:spacing w:after="100"/>
-      </w:pPr>
-      <w:r>
-        <w:rPr>
-          <w:b w:val="false"/>
-          <w:bCs w:val="false"/>
-          <w:i w:val="false"/>
-          <w:iCs w:val="false"/>
-          <w:sz w:val="20"/>
-          <w:szCs w:val="20"/>
-        </w:rPr>
-        <w:t xml:space="preserve">For this stay's Medicare MS-DRG payment, no extra dollars — one MCC already maxes the severity tier. But keep capturing them: APR-DRG / SOI-ROM systems (many commercial, Medicaid, and pediatric payers) escalate with each additional secondary diagnosis; risk adjustment, expected mortality, O:E ratios and profiling depend on full comorbidity capture; and a second MCC/CC protects the tier if the first is denied, recoded, or turns out to be the principal diagnosis.</w:t>
       </w:r>
     </w:p>
     <w:p>
@@ -7470,3208 +7310,7 @@
         <w:pStyle w:val="Heading1"/>
       </w:pPr>
       <w:r>
-        <w:t xml:space="preserve">6. Procedures That Drive the DRG — ICD-10-PCS</w:t>
-      </w:r>
-    </w:p>
-    <w:p>
-      <w:pPr>
-        <w:spacing w:after="80"/>
-      </w:pPr>
-      <w:r>
-        <w:rPr>
-          <w:b w:val="false"/>
-          <w:bCs w:val="false"/>
-          <w:i w:val="false"/>
-          <w:iCs w:val="false"/>
-          <w:sz w:val="20"/>
-          <w:szCs w:val="20"/>
-        </w:rPr>
-        <w:t xml:space="preserve">ICD-10-PCS is the facility procedure code set on the hospital claim — separate from the CPT codes you bill professionally (the same event, e.g. intubation, can carry both). Every PCS code is 7 characters, each an independent axis: section, body system, root operation, body part, approach, device/duration, qualifier. The coder builds it only from provider documentation and cannot infer a missing axis — so what you write decides which code lands and which DRG the case reaches.</w:t>
-      </w:r>
-    </w:p>
-    <w:p>
-      <w:pPr>
-        <w:pStyle w:val="Heading2"/>
-      </w:pPr>
-      <w:r>
-        <w:t xml:space="preserve">Worked example 1 — mechanical ventilation (5A1955Z, &gt;96h)</w:t>
-      </w:r>
-    </w:p>
-    <w:tbl>
-      <w:tblPr>
-        <w:tblW w:type="dxa" w:w="9360"/>
-        <w:tblBorders>
-          <w:top w:val="single" w:color="auto" w:sz="4"/>
-          <w:left w:val="single" w:color="auto" w:sz="4"/>
-          <w:bottom w:val="single" w:color="auto" w:sz="4"/>
-          <w:right w:val="single" w:color="auto" w:sz="4"/>
-          <w:insideH w:val="single" w:color="auto" w:sz="4"/>
-          <w:insideV w:val="single" w:color="auto" w:sz="4"/>
-        </w:tblBorders>
-      </w:tblPr>
-      <w:tblGrid>
-        <w:gridCol w:w="700"/>
-        <w:gridCol w:w="700"/>
-        <w:gridCol w:w="2200"/>
-        <w:gridCol w:w="5760"/>
-      </w:tblGrid>
-      <w:tr>
-        <w:trPr>
-          <w:tblHeader/>
-        </w:trPr>
-        <w:tc>
-          <w:tcPr>
-            <w:tcW w:type="dxa" w:w="700"/>
-            <w:tcBorders>
-              <w:top w:val="single" w:color="B7C6DA" w:sz="1"/>
-              <w:left w:val="single" w:color="B7C6DA" w:sz="1"/>
-              <w:bottom w:val="single" w:color="B7C6DA" w:sz="1"/>
-              <w:right w:val="single" w:color="B7C6DA" w:sz="1"/>
-            </w:tcBorders>
-            <w:shd w:fill="1F3864" w:val="clear"/>
-            <w:tcMar>
-              <w:top w:type="dxa" w:w="60"/>
-              <w:left w:type="dxa" w:w="110"/>
-              <w:bottom w:type="dxa" w:w="60"/>
-              <w:right w:type="dxa" w:w="110"/>
-            </w:tcMar>
-            <w:vAlign w:val="center"/>
-          </w:tcPr>
-          <w:p>
-            <w:r>
-              <w:rPr>
-                <w:b/>
-                <w:bCs/>
-                <w:color w:val="FFFFFF"/>
-                <w:sz w:val="18"/>
-                <w:szCs w:val="18"/>
-              </w:rPr>
-              <w:t xml:space="preserve">Char</w:t>
-            </w:r>
-          </w:p>
-        </w:tc>
-        <w:tc>
-          <w:tcPr>
-            <w:tcW w:type="dxa" w:w="700"/>
-            <w:tcBorders>
-              <w:top w:val="single" w:color="B7C6DA" w:sz="1"/>
-              <w:left w:val="single" w:color="B7C6DA" w:sz="1"/>
-              <w:bottom w:val="single" w:color="B7C6DA" w:sz="1"/>
-              <w:right w:val="single" w:color="B7C6DA" w:sz="1"/>
-            </w:tcBorders>
-            <w:shd w:fill="1F3864" w:val="clear"/>
-            <w:tcMar>
-              <w:top w:type="dxa" w:w="60"/>
-              <w:left w:type="dxa" w:w="110"/>
-              <w:bottom w:type="dxa" w:w="60"/>
-              <w:right w:type="dxa" w:w="110"/>
-            </w:tcMar>
-            <w:vAlign w:val="center"/>
-          </w:tcPr>
-          <w:p>
-            <w:r>
-              <w:rPr>
-                <w:b/>
-                <w:bCs/>
-                <w:color w:val="FFFFFF"/>
-                <w:sz w:val="18"/>
-                <w:szCs w:val="18"/>
-              </w:rPr>
-              <w:t xml:space="preserve">Value</w:t>
-            </w:r>
-          </w:p>
-        </w:tc>
-        <w:tc>
-          <w:tcPr>
-            <w:tcW w:type="dxa" w:w="2200"/>
-            <w:tcBorders>
-              <w:top w:val="single" w:color="B7C6DA" w:sz="1"/>
-              <w:left w:val="single" w:color="B7C6DA" w:sz="1"/>
-              <w:bottom w:val="single" w:color="B7C6DA" w:sz="1"/>
-              <w:right w:val="single" w:color="B7C6DA" w:sz="1"/>
-            </w:tcBorders>
-            <w:shd w:fill="1F3864" w:val="clear"/>
-            <w:tcMar>
-              <w:top w:type="dxa" w:w="60"/>
-              <w:left w:type="dxa" w:w="110"/>
-              <w:bottom w:type="dxa" w:w="60"/>
-              <w:right w:type="dxa" w:w="110"/>
-            </w:tcMar>
-            <w:vAlign w:val="center"/>
-          </w:tcPr>
-          <w:p>
-            <w:r>
-              <w:rPr>
-                <w:b/>
-                <w:bCs/>
-                <w:color w:val="FFFFFF"/>
-                <w:sz w:val="18"/>
-                <w:szCs w:val="18"/>
-              </w:rPr>
-              <w:t xml:space="preserve">Axis</w:t>
-            </w:r>
-          </w:p>
-        </w:tc>
-        <w:tc>
-          <w:tcPr>
-            <w:tcW w:type="dxa" w:w="5760"/>
-            <w:tcBorders>
-              <w:top w:val="single" w:color="B7C6DA" w:sz="1"/>
-              <w:left w:val="single" w:color="B7C6DA" w:sz="1"/>
-              <w:bottom w:val="single" w:color="B7C6DA" w:sz="1"/>
-              <w:right w:val="single" w:color="B7C6DA" w:sz="1"/>
-            </w:tcBorders>
-            <w:shd w:fill="1F3864" w:val="clear"/>
-            <w:tcMar>
-              <w:top w:type="dxa" w:w="60"/>
-              <w:left w:type="dxa" w:w="110"/>
-              <w:bottom w:type="dxa" w:w="60"/>
-              <w:right w:type="dxa" w:w="110"/>
-            </w:tcMar>
-            <w:vAlign w:val="center"/>
-          </w:tcPr>
-          <w:p>
-            <w:r>
-              <w:rPr>
-                <w:b/>
-                <w:bCs/>
-                <w:color w:val="FFFFFF"/>
-                <w:sz w:val="18"/>
-                <w:szCs w:val="18"/>
-              </w:rPr>
-              <w:t xml:space="preserve">Meaning</w:t>
-            </w:r>
-          </w:p>
-        </w:tc>
-      </w:tr>
-      <w:tr>
-        <w:tc>
-          <w:tcPr>
-            <w:tcW w:type="dxa" w:w="700"/>
-            <w:tcBorders>
-              <w:top w:val="single" w:color="B7C6DA" w:sz="1"/>
-              <w:left w:val="single" w:color="B7C6DA" w:sz="1"/>
-              <w:bottom w:val="single" w:color="B7C6DA" w:sz="1"/>
-              <w:right w:val="single" w:color="B7C6DA" w:sz="1"/>
-            </w:tcBorders>
-            <w:shd w:fill="FFFFFF" w:val="clear"/>
-            <w:tcMar>
-              <w:top w:type="dxa" w:w="60"/>
-              <w:left w:type="dxa" w:w="110"/>
-              <w:bottom w:type="dxa" w:w="60"/>
-              <w:right w:type="dxa" w:w="110"/>
-            </w:tcMar>
-            <w:vAlign w:val="center"/>
-          </w:tcPr>
-          <w:p>
-            <w:r>
-              <w:rPr>
-                <w:b w:val="false"/>
-                <w:bCs w:val="false"/>
-                <w:sz w:val="18"/>
-                <w:szCs w:val="18"/>
-              </w:rPr>
-              <w:t xml:space="preserve">1</w:t>
-            </w:r>
-          </w:p>
-        </w:tc>
-        <w:tc>
-          <w:tcPr>
-            <w:tcW w:type="dxa" w:w="700"/>
-            <w:tcBorders>
-              <w:top w:val="single" w:color="B7C6DA" w:sz="1"/>
-              <w:left w:val="single" w:color="B7C6DA" w:sz="1"/>
-              <w:bottom w:val="single" w:color="B7C6DA" w:sz="1"/>
-              <w:right w:val="single" w:color="B7C6DA" w:sz="1"/>
-            </w:tcBorders>
-            <w:shd w:fill="FFFFFF" w:val="clear"/>
-            <w:tcMar>
-              <w:top w:type="dxa" w:w="60"/>
-              <w:left w:type="dxa" w:w="110"/>
-              <w:bottom w:type="dxa" w:w="60"/>
-              <w:right w:type="dxa" w:w="110"/>
-            </w:tcMar>
-            <w:vAlign w:val="center"/>
-          </w:tcPr>
-          <w:p>
-            <w:r>
-              <w:rPr>
-                <w:b w:val="false"/>
-                <w:bCs w:val="false"/>
-                <w:sz w:val="18"/>
-                <w:szCs w:val="18"/>
-              </w:rPr>
-              <w:t xml:space="preserve">5</w:t>
-            </w:r>
-          </w:p>
-        </w:tc>
-        <w:tc>
-          <w:tcPr>
-            <w:tcW w:type="dxa" w:w="2200"/>
-            <w:tcBorders>
-              <w:top w:val="single" w:color="B7C6DA" w:sz="1"/>
-              <w:left w:val="single" w:color="B7C6DA" w:sz="1"/>
-              <w:bottom w:val="single" w:color="B7C6DA" w:sz="1"/>
-              <w:right w:val="single" w:color="B7C6DA" w:sz="1"/>
-            </w:tcBorders>
-            <w:shd w:fill="FFFFFF" w:val="clear"/>
-            <w:tcMar>
-              <w:top w:type="dxa" w:w="60"/>
-              <w:left w:type="dxa" w:w="110"/>
-              <w:bottom w:type="dxa" w:w="60"/>
-              <w:right w:type="dxa" w:w="110"/>
-            </w:tcMar>
-            <w:vAlign w:val="center"/>
-          </w:tcPr>
-          <w:p>
-            <w:r>
-              <w:rPr>
-                <w:b w:val="false"/>
-                <w:bCs w:val="false"/>
-                <w:sz w:val="18"/>
-                <w:szCs w:val="18"/>
-              </w:rPr>
-              <w:t xml:space="preserve">Section</w:t>
-            </w:r>
-          </w:p>
-        </w:tc>
-        <w:tc>
-          <w:tcPr>
-            <w:tcW w:type="dxa" w:w="5760"/>
-            <w:tcBorders>
-              <w:top w:val="single" w:color="B7C6DA" w:sz="1"/>
-              <w:left w:val="single" w:color="B7C6DA" w:sz="1"/>
-              <w:bottom w:val="single" w:color="B7C6DA" w:sz="1"/>
-              <w:right w:val="single" w:color="B7C6DA" w:sz="1"/>
-            </w:tcBorders>
-            <w:shd w:fill="FFFFFF" w:val="clear"/>
-            <w:tcMar>
-              <w:top w:type="dxa" w:w="60"/>
-              <w:left w:type="dxa" w:w="110"/>
-              <w:bottom w:type="dxa" w:w="60"/>
-              <w:right w:type="dxa" w:w="110"/>
-            </w:tcMar>
-            <w:vAlign w:val="center"/>
-          </w:tcPr>
-          <w:p>
-            <w:r>
-              <w:rPr>
-                <w:b w:val="false"/>
-                <w:bCs w:val="false"/>
-                <w:sz w:val="18"/>
-                <w:szCs w:val="18"/>
-              </w:rPr>
-              <w:t xml:space="preserve">Extracorporeal or Systemic Assistance and Performance</w:t>
-            </w:r>
-          </w:p>
-        </w:tc>
-      </w:tr>
-      <w:tr>
-        <w:tc>
-          <w:tcPr>
-            <w:tcW w:type="dxa" w:w="700"/>
-            <w:tcBorders>
-              <w:top w:val="single" w:color="B7C6DA" w:sz="1"/>
-              <w:left w:val="single" w:color="B7C6DA" w:sz="1"/>
-              <w:bottom w:val="single" w:color="B7C6DA" w:sz="1"/>
-              <w:right w:val="single" w:color="B7C6DA" w:sz="1"/>
-            </w:tcBorders>
-            <w:shd w:fill="EAF1F8" w:val="clear"/>
-            <w:tcMar>
-              <w:top w:type="dxa" w:w="60"/>
-              <w:left w:type="dxa" w:w="110"/>
-              <w:bottom w:type="dxa" w:w="60"/>
-              <w:right w:type="dxa" w:w="110"/>
-            </w:tcMar>
-            <w:vAlign w:val="center"/>
-          </w:tcPr>
-          <w:p>
-            <w:r>
-              <w:rPr>
-                <w:b w:val="false"/>
-                <w:bCs w:val="false"/>
-                <w:sz w:val="18"/>
-                <w:szCs w:val="18"/>
-              </w:rPr>
-              <w:t xml:space="preserve">2</w:t>
-            </w:r>
-          </w:p>
-        </w:tc>
-        <w:tc>
-          <w:tcPr>
-            <w:tcW w:type="dxa" w:w="700"/>
-            <w:tcBorders>
-              <w:top w:val="single" w:color="B7C6DA" w:sz="1"/>
-              <w:left w:val="single" w:color="B7C6DA" w:sz="1"/>
-              <w:bottom w:val="single" w:color="B7C6DA" w:sz="1"/>
-              <w:right w:val="single" w:color="B7C6DA" w:sz="1"/>
-            </w:tcBorders>
-            <w:shd w:fill="EAF1F8" w:val="clear"/>
-            <w:tcMar>
-              <w:top w:type="dxa" w:w="60"/>
-              <w:left w:type="dxa" w:w="110"/>
-              <w:bottom w:type="dxa" w:w="60"/>
-              <w:right w:type="dxa" w:w="110"/>
-            </w:tcMar>
-            <w:vAlign w:val="center"/>
-          </w:tcPr>
-          <w:p>
-            <w:r>
-              <w:rPr>
-                <w:b w:val="false"/>
-                <w:bCs w:val="false"/>
-                <w:sz w:val="18"/>
-                <w:szCs w:val="18"/>
-              </w:rPr>
-              <w:t xml:space="preserve">A</w:t>
-            </w:r>
-          </w:p>
-        </w:tc>
-        <w:tc>
-          <w:tcPr>
-            <w:tcW w:type="dxa" w:w="2200"/>
-            <w:tcBorders>
-              <w:top w:val="single" w:color="B7C6DA" w:sz="1"/>
-              <w:left w:val="single" w:color="B7C6DA" w:sz="1"/>
-              <w:bottom w:val="single" w:color="B7C6DA" w:sz="1"/>
-              <w:right w:val="single" w:color="B7C6DA" w:sz="1"/>
-            </w:tcBorders>
-            <w:shd w:fill="EAF1F8" w:val="clear"/>
-            <w:tcMar>
-              <w:top w:type="dxa" w:w="60"/>
-              <w:left w:type="dxa" w:w="110"/>
-              <w:bottom w:type="dxa" w:w="60"/>
-              <w:right w:type="dxa" w:w="110"/>
-            </w:tcMar>
-            <w:vAlign w:val="center"/>
-          </w:tcPr>
-          <w:p>
-            <w:r>
-              <w:rPr>
-                <w:b w:val="false"/>
-                <w:bCs w:val="false"/>
-                <w:sz w:val="18"/>
-                <w:szCs w:val="18"/>
-              </w:rPr>
-              <w:t xml:space="preserve">Body System</w:t>
-            </w:r>
-          </w:p>
-        </w:tc>
-        <w:tc>
-          <w:tcPr>
-            <w:tcW w:type="dxa" w:w="5760"/>
-            <w:tcBorders>
-              <w:top w:val="single" w:color="B7C6DA" w:sz="1"/>
-              <w:left w:val="single" w:color="B7C6DA" w:sz="1"/>
-              <w:bottom w:val="single" w:color="B7C6DA" w:sz="1"/>
-              <w:right w:val="single" w:color="B7C6DA" w:sz="1"/>
-            </w:tcBorders>
-            <w:shd w:fill="EAF1F8" w:val="clear"/>
-            <w:tcMar>
-              <w:top w:type="dxa" w:w="60"/>
-              <w:left w:type="dxa" w:w="110"/>
-              <w:bottom w:type="dxa" w:w="60"/>
-              <w:right w:type="dxa" w:w="110"/>
-            </w:tcMar>
-            <w:vAlign w:val="center"/>
-          </w:tcPr>
-          <w:p>
-            <w:r>
-              <w:rPr>
-                <w:b w:val="false"/>
-                <w:bCs w:val="false"/>
-                <w:sz w:val="18"/>
-                <w:szCs w:val="18"/>
-              </w:rPr>
-              <w:t xml:space="preserve">Physiological Systems</w:t>
-            </w:r>
-          </w:p>
-        </w:tc>
-      </w:tr>
-      <w:tr>
-        <w:tc>
-          <w:tcPr>
-            <w:tcW w:type="dxa" w:w="700"/>
-            <w:tcBorders>
-              <w:top w:val="single" w:color="B7C6DA" w:sz="1"/>
-              <w:left w:val="single" w:color="B7C6DA" w:sz="1"/>
-              <w:bottom w:val="single" w:color="B7C6DA" w:sz="1"/>
-              <w:right w:val="single" w:color="B7C6DA" w:sz="1"/>
-            </w:tcBorders>
-            <w:shd w:fill="FFFFFF" w:val="clear"/>
-            <w:tcMar>
-              <w:top w:type="dxa" w:w="60"/>
-              <w:left w:type="dxa" w:w="110"/>
-              <w:bottom w:type="dxa" w:w="60"/>
-              <w:right w:type="dxa" w:w="110"/>
-            </w:tcMar>
-            <w:vAlign w:val="center"/>
-          </w:tcPr>
-          <w:p>
-            <w:r>
-              <w:rPr>
-                <w:b w:val="false"/>
-                <w:bCs w:val="false"/>
-                <w:sz w:val="18"/>
-                <w:szCs w:val="18"/>
-              </w:rPr>
-              <w:t xml:space="preserve">3</w:t>
-            </w:r>
-          </w:p>
-        </w:tc>
-        <w:tc>
-          <w:tcPr>
-            <w:tcW w:type="dxa" w:w="700"/>
-            <w:tcBorders>
-              <w:top w:val="single" w:color="B7C6DA" w:sz="1"/>
-              <w:left w:val="single" w:color="B7C6DA" w:sz="1"/>
-              <w:bottom w:val="single" w:color="B7C6DA" w:sz="1"/>
-              <w:right w:val="single" w:color="B7C6DA" w:sz="1"/>
-            </w:tcBorders>
-            <w:shd w:fill="FFFFFF" w:val="clear"/>
-            <w:tcMar>
-              <w:top w:type="dxa" w:w="60"/>
-              <w:left w:type="dxa" w:w="110"/>
-              <w:bottom w:type="dxa" w:w="60"/>
-              <w:right w:type="dxa" w:w="110"/>
-            </w:tcMar>
-            <w:vAlign w:val="center"/>
-          </w:tcPr>
-          <w:p>
-            <w:r>
-              <w:rPr>
-                <w:b w:val="false"/>
-                <w:bCs w:val="false"/>
-                <w:sz w:val="18"/>
-                <w:szCs w:val="18"/>
-              </w:rPr>
-              <w:t xml:space="preserve">1</w:t>
-            </w:r>
-          </w:p>
-        </w:tc>
-        <w:tc>
-          <w:tcPr>
-            <w:tcW w:type="dxa" w:w="2200"/>
-            <w:tcBorders>
-              <w:top w:val="single" w:color="B7C6DA" w:sz="1"/>
-              <w:left w:val="single" w:color="B7C6DA" w:sz="1"/>
-              <w:bottom w:val="single" w:color="B7C6DA" w:sz="1"/>
-              <w:right w:val="single" w:color="B7C6DA" w:sz="1"/>
-            </w:tcBorders>
-            <w:shd w:fill="FFFFFF" w:val="clear"/>
-            <w:tcMar>
-              <w:top w:type="dxa" w:w="60"/>
-              <w:left w:type="dxa" w:w="110"/>
-              <w:bottom w:type="dxa" w:w="60"/>
-              <w:right w:type="dxa" w:w="110"/>
-            </w:tcMar>
-            <w:vAlign w:val="center"/>
-          </w:tcPr>
-          <w:p>
-            <w:r>
-              <w:rPr>
-                <w:b w:val="false"/>
-                <w:bCs w:val="false"/>
-                <w:sz w:val="18"/>
-                <w:szCs w:val="18"/>
-              </w:rPr>
-              <w:t xml:space="preserve">Root Operation</w:t>
-            </w:r>
-          </w:p>
-        </w:tc>
-        <w:tc>
-          <w:tcPr>
-            <w:tcW w:type="dxa" w:w="5760"/>
-            <w:tcBorders>
-              <w:top w:val="single" w:color="B7C6DA" w:sz="1"/>
-              <w:left w:val="single" w:color="B7C6DA" w:sz="1"/>
-              <w:bottom w:val="single" w:color="B7C6DA" w:sz="1"/>
-              <w:right w:val="single" w:color="B7C6DA" w:sz="1"/>
-            </w:tcBorders>
-            <w:shd w:fill="FFFFFF" w:val="clear"/>
-            <w:tcMar>
-              <w:top w:type="dxa" w:w="60"/>
-              <w:left w:type="dxa" w:w="110"/>
-              <w:bottom w:type="dxa" w:w="60"/>
-              <w:right w:type="dxa" w:w="110"/>
-            </w:tcMar>
-            <w:vAlign w:val="center"/>
-          </w:tcPr>
-          <w:p>
-            <w:r>
-              <w:rPr>
-                <w:b w:val="false"/>
-                <w:bCs w:val="false"/>
-                <w:sz w:val="18"/>
-                <w:szCs w:val="18"/>
-              </w:rPr>
-              <w:t xml:space="preserve">Performance</w:t>
-            </w:r>
-          </w:p>
-        </w:tc>
-      </w:tr>
-      <w:tr>
-        <w:tc>
-          <w:tcPr>
-            <w:tcW w:type="dxa" w:w="700"/>
-            <w:tcBorders>
-              <w:top w:val="single" w:color="B7C6DA" w:sz="1"/>
-              <w:left w:val="single" w:color="B7C6DA" w:sz="1"/>
-              <w:bottom w:val="single" w:color="B7C6DA" w:sz="1"/>
-              <w:right w:val="single" w:color="B7C6DA" w:sz="1"/>
-            </w:tcBorders>
-            <w:shd w:fill="EAF1F8" w:val="clear"/>
-            <w:tcMar>
-              <w:top w:type="dxa" w:w="60"/>
-              <w:left w:type="dxa" w:w="110"/>
-              <w:bottom w:type="dxa" w:w="60"/>
-              <w:right w:type="dxa" w:w="110"/>
-            </w:tcMar>
-            <w:vAlign w:val="center"/>
-          </w:tcPr>
-          <w:p>
-            <w:r>
-              <w:rPr>
-                <w:b w:val="false"/>
-                <w:bCs w:val="false"/>
-                <w:sz w:val="18"/>
-                <w:szCs w:val="18"/>
-              </w:rPr>
-              <w:t xml:space="preserve">4</w:t>
-            </w:r>
-          </w:p>
-        </w:tc>
-        <w:tc>
-          <w:tcPr>
-            <w:tcW w:type="dxa" w:w="700"/>
-            <w:tcBorders>
-              <w:top w:val="single" w:color="B7C6DA" w:sz="1"/>
-              <w:left w:val="single" w:color="B7C6DA" w:sz="1"/>
-              <w:bottom w:val="single" w:color="B7C6DA" w:sz="1"/>
-              <w:right w:val="single" w:color="B7C6DA" w:sz="1"/>
-            </w:tcBorders>
-            <w:shd w:fill="EAF1F8" w:val="clear"/>
-            <w:tcMar>
-              <w:top w:type="dxa" w:w="60"/>
-              <w:left w:type="dxa" w:w="110"/>
-              <w:bottom w:type="dxa" w:w="60"/>
-              <w:right w:type="dxa" w:w="110"/>
-            </w:tcMar>
-            <w:vAlign w:val="center"/>
-          </w:tcPr>
-          <w:p>
-            <w:r>
-              <w:rPr>
-                <w:b w:val="false"/>
-                <w:bCs w:val="false"/>
-                <w:sz w:val="18"/>
-                <w:szCs w:val="18"/>
-              </w:rPr>
-              <w:t xml:space="preserve">9</w:t>
-            </w:r>
-          </w:p>
-        </w:tc>
-        <w:tc>
-          <w:tcPr>
-            <w:tcW w:type="dxa" w:w="2200"/>
-            <w:tcBorders>
-              <w:top w:val="single" w:color="B7C6DA" w:sz="1"/>
-              <w:left w:val="single" w:color="B7C6DA" w:sz="1"/>
-              <w:bottom w:val="single" w:color="B7C6DA" w:sz="1"/>
-              <w:right w:val="single" w:color="B7C6DA" w:sz="1"/>
-            </w:tcBorders>
-            <w:shd w:fill="EAF1F8" w:val="clear"/>
-            <w:tcMar>
-              <w:top w:type="dxa" w:w="60"/>
-              <w:left w:type="dxa" w:w="110"/>
-              <w:bottom w:type="dxa" w:w="60"/>
-              <w:right w:type="dxa" w:w="110"/>
-            </w:tcMar>
-            <w:vAlign w:val="center"/>
-          </w:tcPr>
-          <w:p>
-            <w:r>
-              <w:rPr>
-                <w:b w:val="false"/>
-                <w:bCs w:val="false"/>
-                <w:sz w:val="18"/>
-                <w:szCs w:val="18"/>
-              </w:rPr>
-              <w:t xml:space="preserve">Body Function</w:t>
-            </w:r>
-          </w:p>
-        </w:tc>
-        <w:tc>
-          <w:tcPr>
-            <w:tcW w:type="dxa" w:w="5760"/>
-            <w:tcBorders>
-              <w:top w:val="single" w:color="B7C6DA" w:sz="1"/>
-              <w:left w:val="single" w:color="B7C6DA" w:sz="1"/>
-              <w:bottom w:val="single" w:color="B7C6DA" w:sz="1"/>
-              <w:right w:val="single" w:color="B7C6DA" w:sz="1"/>
-            </w:tcBorders>
-            <w:shd w:fill="EAF1F8" w:val="clear"/>
-            <w:tcMar>
-              <w:top w:type="dxa" w:w="60"/>
-              <w:left w:type="dxa" w:w="110"/>
-              <w:bottom w:type="dxa" w:w="60"/>
-              <w:right w:type="dxa" w:w="110"/>
-            </w:tcMar>
-            <w:vAlign w:val="center"/>
-          </w:tcPr>
-          <w:p>
-            <w:r>
-              <w:rPr>
-                <w:b w:val="false"/>
-                <w:bCs w:val="false"/>
-                <w:sz w:val="18"/>
-                <w:szCs w:val="18"/>
-              </w:rPr>
-              <w:t xml:space="preserve">Respiratory</w:t>
-            </w:r>
-          </w:p>
-        </w:tc>
-      </w:tr>
-      <w:tr>
-        <w:tc>
-          <w:tcPr>
-            <w:tcW w:type="dxa" w:w="700"/>
-            <w:tcBorders>
-              <w:top w:val="single" w:color="B7C6DA" w:sz="1"/>
-              <w:left w:val="single" w:color="B7C6DA" w:sz="1"/>
-              <w:bottom w:val="single" w:color="B7C6DA" w:sz="1"/>
-              <w:right w:val="single" w:color="B7C6DA" w:sz="1"/>
-            </w:tcBorders>
-            <w:shd w:fill="FFFFFF" w:val="clear"/>
-            <w:tcMar>
-              <w:top w:type="dxa" w:w="60"/>
-              <w:left w:type="dxa" w:w="110"/>
-              <w:bottom w:type="dxa" w:w="60"/>
-              <w:right w:type="dxa" w:w="110"/>
-            </w:tcMar>
-            <w:vAlign w:val="center"/>
-          </w:tcPr>
-          <w:p>
-            <w:r>
-              <w:rPr>
-                <w:b/>
-                <w:bCs/>
-                <w:sz w:val="18"/>
-                <w:szCs w:val="18"/>
-              </w:rPr>
-              <w:t xml:space="preserve">5</w:t>
-            </w:r>
-          </w:p>
-        </w:tc>
-        <w:tc>
-          <w:tcPr>
-            <w:tcW w:type="dxa" w:w="700"/>
-            <w:tcBorders>
-              <w:top w:val="single" w:color="B7C6DA" w:sz="1"/>
-              <w:left w:val="single" w:color="B7C6DA" w:sz="1"/>
-              <w:bottom w:val="single" w:color="B7C6DA" w:sz="1"/>
-              <w:right w:val="single" w:color="B7C6DA" w:sz="1"/>
-            </w:tcBorders>
-            <w:shd w:fill="FFFFFF" w:val="clear"/>
-            <w:tcMar>
-              <w:top w:type="dxa" w:w="60"/>
-              <w:left w:type="dxa" w:w="110"/>
-              <w:bottom w:type="dxa" w:w="60"/>
-              <w:right w:type="dxa" w:w="110"/>
-            </w:tcMar>
-            <w:vAlign w:val="center"/>
-          </w:tcPr>
-          <w:p>
-            <w:r>
-              <w:rPr>
-                <w:b/>
-                <w:bCs/>
-                <w:sz w:val="18"/>
-                <w:szCs w:val="18"/>
-              </w:rPr>
-              <w:t xml:space="preserve">5</w:t>
-            </w:r>
-          </w:p>
-        </w:tc>
-        <w:tc>
-          <w:tcPr>
-            <w:tcW w:type="dxa" w:w="2200"/>
-            <w:tcBorders>
-              <w:top w:val="single" w:color="B7C6DA" w:sz="1"/>
-              <w:left w:val="single" w:color="B7C6DA" w:sz="1"/>
-              <w:bottom w:val="single" w:color="B7C6DA" w:sz="1"/>
-              <w:right w:val="single" w:color="B7C6DA" w:sz="1"/>
-            </w:tcBorders>
-            <w:shd w:fill="FFFFFF" w:val="clear"/>
-            <w:tcMar>
-              <w:top w:type="dxa" w:w="60"/>
-              <w:left w:type="dxa" w:w="110"/>
-              <w:bottom w:type="dxa" w:w="60"/>
-              <w:right w:type="dxa" w:w="110"/>
-            </w:tcMar>
-            <w:vAlign w:val="center"/>
-          </w:tcPr>
-          <w:p>
-            <w:r>
-              <w:rPr>
-                <w:b/>
-                <w:bCs/>
-                <w:sz w:val="18"/>
-                <w:szCs w:val="18"/>
-              </w:rPr>
-              <w:t xml:space="preserve">Duration</w:t>
-            </w:r>
-          </w:p>
-        </w:tc>
-        <w:tc>
-          <w:tcPr>
-            <w:tcW w:type="dxa" w:w="5760"/>
-            <w:tcBorders>
-              <w:top w:val="single" w:color="B7C6DA" w:sz="1"/>
-              <w:left w:val="single" w:color="B7C6DA" w:sz="1"/>
-              <w:bottom w:val="single" w:color="B7C6DA" w:sz="1"/>
-              <w:right w:val="single" w:color="B7C6DA" w:sz="1"/>
-            </w:tcBorders>
-            <w:shd w:fill="FFFFFF" w:val="clear"/>
-            <w:tcMar>
-              <w:top w:type="dxa" w:w="60"/>
-              <w:left w:type="dxa" w:w="110"/>
-              <w:bottom w:type="dxa" w:w="60"/>
-              <w:right w:type="dxa" w:w="110"/>
-            </w:tcMar>
-            <w:vAlign w:val="center"/>
-          </w:tcPr>
-          <w:p>
-            <w:r>
-              <w:rPr>
-                <w:b/>
-                <w:bCs/>
-                <w:sz w:val="18"/>
-                <w:szCs w:val="18"/>
-              </w:rPr>
-              <w:t xml:space="preserve">&gt;96 consecutive hours  ← the lever</w:t>
-            </w:r>
-          </w:p>
-        </w:tc>
-      </w:tr>
-      <w:tr>
-        <w:tc>
-          <w:tcPr>
-            <w:tcW w:type="dxa" w:w="700"/>
-            <w:tcBorders>
-              <w:top w:val="single" w:color="B7C6DA" w:sz="1"/>
-              <w:left w:val="single" w:color="B7C6DA" w:sz="1"/>
-              <w:bottom w:val="single" w:color="B7C6DA" w:sz="1"/>
-              <w:right w:val="single" w:color="B7C6DA" w:sz="1"/>
-            </w:tcBorders>
-            <w:shd w:fill="EAF1F8" w:val="clear"/>
-            <w:tcMar>
-              <w:top w:type="dxa" w:w="60"/>
-              <w:left w:type="dxa" w:w="110"/>
-              <w:bottom w:type="dxa" w:w="60"/>
-              <w:right w:type="dxa" w:w="110"/>
-            </w:tcMar>
-            <w:vAlign w:val="center"/>
-          </w:tcPr>
-          <w:p>
-            <w:r>
-              <w:rPr>
-                <w:b w:val="false"/>
-                <w:bCs w:val="false"/>
-                <w:sz w:val="18"/>
-                <w:szCs w:val="18"/>
-              </w:rPr>
-              <w:t xml:space="preserve">6</w:t>
-            </w:r>
-          </w:p>
-        </w:tc>
-        <w:tc>
-          <w:tcPr>
-            <w:tcW w:type="dxa" w:w="700"/>
-            <w:tcBorders>
-              <w:top w:val="single" w:color="B7C6DA" w:sz="1"/>
-              <w:left w:val="single" w:color="B7C6DA" w:sz="1"/>
-              <w:bottom w:val="single" w:color="B7C6DA" w:sz="1"/>
-              <w:right w:val="single" w:color="B7C6DA" w:sz="1"/>
-            </w:tcBorders>
-            <w:shd w:fill="EAF1F8" w:val="clear"/>
-            <w:tcMar>
-              <w:top w:type="dxa" w:w="60"/>
-              <w:left w:type="dxa" w:w="110"/>
-              <w:bottom w:type="dxa" w:w="60"/>
-              <w:right w:type="dxa" w:w="110"/>
-            </w:tcMar>
-            <w:vAlign w:val="center"/>
-          </w:tcPr>
-          <w:p>
-            <w:r>
-              <w:rPr>
-                <w:b w:val="false"/>
-                <w:bCs w:val="false"/>
-                <w:sz w:val="18"/>
-                <w:szCs w:val="18"/>
-              </w:rPr>
-              <w:t xml:space="preserve">5</w:t>
-            </w:r>
-          </w:p>
-        </w:tc>
-        <w:tc>
-          <w:tcPr>
-            <w:tcW w:type="dxa" w:w="2200"/>
-            <w:tcBorders>
-              <w:top w:val="single" w:color="B7C6DA" w:sz="1"/>
-              <w:left w:val="single" w:color="B7C6DA" w:sz="1"/>
-              <w:bottom w:val="single" w:color="B7C6DA" w:sz="1"/>
-              <w:right w:val="single" w:color="B7C6DA" w:sz="1"/>
-            </w:tcBorders>
-            <w:shd w:fill="EAF1F8" w:val="clear"/>
-            <w:tcMar>
-              <w:top w:type="dxa" w:w="60"/>
-              <w:left w:type="dxa" w:w="110"/>
-              <w:bottom w:type="dxa" w:w="60"/>
-              <w:right w:type="dxa" w:w="110"/>
-            </w:tcMar>
-            <w:vAlign w:val="center"/>
-          </w:tcPr>
-          <w:p>
-            <w:r>
-              <w:rPr>
-                <w:b w:val="false"/>
-                <w:bCs w:val="false"/>
-                <w:sz w:val="18"/>
-                <w:szCs w:val="18"/>
-              </w:rPr>
-              <w:t xml:space="preserve">Function</w:t>
-            </w:r>
-          </w:p>
-        </w:tc>
-        <w:tc>
-          <w:tcPr>
-            <w:tcW w:type="dxa" w:w="5760"/>
-            <w:tcBorders>
-              <w:top w:val="single" w:color="B7C6DA" w:sz="1"/>
-              <w:left w:val="single" w:color="B7C6DA" w:sz="1"/>
-              <w:bottom w:val="single" w:color="B7C6DA" w:sz="1"/>
-              <w:right w:val="single" w:color="B7C6DA" w:sz="1"/>
-            </w:tcBorders>
-            <w:shd w:fill="EAF1F8" w:val="clear"/>
-            <w:tcMar>
-              <w:top w:type="dxa" w:w="60"/>
-              <w:left w:type="dxa" w:w="110"/>
-              <w:bottom w:type="dxa" w:w="60"/>
-              <w:right w:type="dxa" w:w="110"/>
-            </w:tcMar>
-            <w:vAlign w:val="center"/>
-          </w:tcPr>
-          <w:p>
-            <w:r>
-              <w:rPr>
-                <w:b w:val="false"/>
-                <w:bCs w:val="false"/>
-                <w:sz w:val="18"/>
-                <w:szCs w:val="18"/>
-              </w:rPr>
-              <w:t xml:space="preserve">Ventilation</w:t>
-            </w:r>
-          </w:p>
-        </w:tc>
-      </w:tr>
-      <w:tr>
-        <w:tc>
-          <w:tcPr>
-            <w:tcW w:type="dxa" w:w="700"/>
-            <w:tcBorders>
-              <w:top w:val="single" w:color="B7C6DA" w:sz="1"/>
-              <w:left w:val="single" w:color="B7C6DA" w:sz="1"/>
-              <w:bottom w:val="single" w:color="B7C6DA" w:sz="1"/>
-              <w:right w:val="single" w:color="B7C6DA" w:sz="1"/>
-            </w:tcBorders>
-            <w:shd w:fill="FFFFFF" w:val="clear"/>
-            <w:tcMar>
-              <w:top w:type="dxa" w:w="60"/>
-              <w:left w:type="dxa" w:w="110"/>
-              <w:bottom w:type="dxa" w:w="60"/>
-              <w:right w:type="dxa" w:w="110"/>
-            </w:tcMar>
-            <w:vAlign w:val="center"/>
-          </w:tcPr>
-          <w:p>
-            <w:r>
-              <w:rPr>
-                <w:b w:val="false"/>
-                <w:bCs w:val="false"/>
-                <w:sz w:val="18"/>
-                <w:szCs w:val="18"/>
-              </w:rPr>
-              <w:t xml:space="preserve">7</w:t>
-            </w:r>
-          </w:p>
-        </w:tc>
-        <w:tc>
-          <w:tcPr>
-            <w:tcW w:type="dxa" w:w="700"/>
-            <w:tcBorders>
-              <w:top w:val="single" w:color="B7C6DA" w:sz="1"/>
-              <w:left w:val="single" w:color="B7C6DA" w:sz="1"/>
-              <w:bottom w:val="single" w:color="B7C6DA" w:sz="1"/>
-              <w:right w:val="single" w:color="B7C6DA" w:sz="1"/>
-            </w:tcBorders>
-            <w:shd w:fill="FFFFFF" w:val="clear"/>
-            <w:tcMar>
-              <w:top w:type="dxa" w:w="60"/>
-              <w:left w:type="dxa" w:w="110"/>
-              <w:bottom w:type="dxa" w:w="60"/>
-              <w:right w:type="dxa" w:w="110"/>
-            </w:tcMar>
-            <w:vAlign w:val="center"/>
-          </w:tcPr>
-          <w:p>
-            <w:r>
-              <w:rPr>
-                <w:b w:val="false"/>
-                <w:bCs w:val="false"/>
-                <w:sz w:val="18"/>
-                <w:szCs w:val="18"/>
-              </w:rPr>
-              <w:t xml:space="preserve">Z</w:t>
-            </w:r>
-          </w:p>
-        </w:tc>
-        <w:tc>
-          <w:tcPr>
-            <w:tcW w:type="dxa" w:w="2200"/>
-            <w:tcBorders>
-              <w:top w:val="single" w:color="B7C6DA" w:sz="1"/>
-              <w:left w:val="single" w:color="B7C6DA" w:sz="1"/>
-              <w:bottom w:val="single" w:color="B7C6DA" w:sz="1"/>
-              <w:right w:val="single" w:color="B7C6DA" w:sz="1"/>
-            </w:tcBorders>
-            <w:shd w:fill="FFFFFF" w:val="clear"/>
-            <w:tcMar>
-              <w:top w:type="dxa" w:w="60"/>
-              <w:left w:type="dxa" w:w="110"/>
-              <w:bottom w:type="dxa" w:w="60"/>
-              <w:right w:type="dxa" w:w="110"/>
-            </w:tcMar>
-            <w:vAlign w:val="center"/>
-          </w:tcPr>
-          <w:p>
-            <w:r>
-              <w:rPr>
-                <w:b w:val="false"/>
-                <w:bCs w:val="false"/>
-                <w:sz w:val="18"/>
-                <w:szCs w:val="18"/>
-              </w:rPr>
-              <w:t xml:space="preserve">Qualifier</w:t>
-            </w:r>
-          </w:p>
-        </w:tc>
-        <w:tc>
-          <w:tcPr>
-            <w:tcW w:type="dxa" w:w="5760"/>
-            <w:tcBorders>
-              <w:top w:val="single" w:color="B7C6DA" w:sz="1"/>
-              <w:left w:val="single" w:color="B7C6DA" w:sz="1"/>
-              <w:bottom w:val="single" w:color="B7C6DA" w:sz="1"/>
-              <w:right w:val="single" w:color="B7C6DA" w:sz="1"/>
-            </w:tcBorders>
-            <w:shd w:fill="FFFFFF" w:val="clear"/>
-            <w:tcMar>
-              <w:top w:type="dxa" w:w="60"/>
-              <w:left w:type="dxa" w:w="110"/>
-              <w:bottom w:type="dxa" w:w="60"/>
-              <w:right w:type="dxa" w:w="110"/>
-            </w:tcMar>
-            <w:vAlign w:val="center"/>
-          </w:tcPr>
-          <w:p>
-            <w:r>
-              <w:rPr>
-                <w:b w:val="false"/>
-                <w:bCs w:val="false"/>
-                <w:sz w:val="18"/>
-                <w:szCs w:val="18"/>
-              </w:rPr>
-              <w:t xml:space="preserve">None</w:t>
-            </w:r>
-          </w:p>
-        </w:tc>
-      </w:tr>
-    </w:tbl>
-    <w:p>
-      <w:pPr>
-        <w:spacing w:after="100"/>
-      </w:pPr>
-      <w:r>
-        <w:rPr>
-          <w:b w:val="false"/>
-          <w:bCs w:val="false"/>
-          <w:i/>
-          <w:iCs/>
-          <w:sz w:val="20"/>
-          <w:szCs w:val="20"/>
-        </w:rPr>
-        <w:t xml:space="preserve">Character 5 alone moves the DRG. With a respiratory principal diagnosis: &gt;96h → MS-DRG 207 (FY2026 weight 6.4347 ≈ $43,450) vs ≤96h → MS-DRG 208 (weight 2.7487 ≈ $18,562) at a $6,752.61 base rate — about a $24,900 swing at the 96-hour line. Count continuous hours from intubation to extubation; the note needs times, not “on the vent for days.” BiPAP/NIPPV is a different code and does not count toward these hours.</w:t>
-      </w:r>
-    </w:p>
-    <w:p>
-      <w:pPr>
-        <w:pStyle w:val="Heading2"/>
-      </w:pPr>
-      <w:r>
-        <w:t xml:space="preserve">Worked example 2 — CRRT (5A1D90Z, continuous)</w:t>
-      </w:r>
-    </w:p>
-    <w:tbl>
-      <w:tblPr>
-        <w:tblW w:type="dxa" w:w="9360"/>
-        <w:tblBorders>
-          <w:top w:val="single" w:color="auto" w:sz="4"/>
-          <w:left w:val="single" w:color="auto" w:sz="4"/>
-          <w:bottom w:val="single" w:color="auto" w:sz="4"/>
-          <w:right w:val="single" w:color="auto" w:sz="4"/>
-          <w:insideH w:val="single" w:color="auto" w:sz="4"/>
-          <w:insideV w:val="single" w:color="auto" w:sz="4"/>
-        </w:tblBorders>
-      </w:tblPr>
-      <w:tblGrid>
-        <w:gridCol w:w="700"/>
-        <w:gridCol w:w="700"/>
-        <w:gridCol w:w="2200"/>
-        <w:gridCol w:w="5760"/>
-      </w:tblGrid>
-      <w:tr>
-        <w:trPr>
-          <w:tblHeader/>
-        </w:trPr>
-        <w:tc>
-          <w:tcPr>
-            <w:tcW w:type="dxa" w:w="700"/>
-            <w:tcBorders>
-              <w:top w:val="single" w:color="B7C6DA" w:sz="1"/>
-              <w:left w:val="single" w:color="B7C6DA" w:sz="1"/>
-              <w:bottom w:val="single" w:color="B7C6DA" w:sz="1"/>
-              <w:right w:val="single" w:color="B7C6DA" w:sz="1"/>
-            </w:tcBorders>
-            <w:shd w:fill="1F3864" w:val="clear"/>
-            <w:tcMar>
-              <w:top w:type="dxa" w:w="60"/>
-              <w:left w:type="dxa" w:w="110"/>
-              <w:bottom w:type="dxa" w:w="60"/>
-              <w:right w:type="dxa" w:w="110"/>
-            </w:tcMar>
-            <w:vAlign w:val="center"/>
-          </w:tcPr>
-          <w:p>
-            <w:r>
-              <w:rPr>
-                <w:b/>
-                <w:bCs/>
-                <w:color w:val="FFFFFF"/>
-                <w:sz w:val="18"/>
-                <w:szCs w:val="18"/>
-              </w:rPr>
-              <w:t xml:space="preserve">Char</w:t>
-            </w:r>
-          </w:p>
-        </w:tc>
-        <w:tc>
-          <w:tcPr>
-            <w:tcW w:type="dxa" w:w="700"/>
-            <w:tcBorders>
-              <w:top w:val="single" w:color="B7C6DA" w:sz="1"/>
-              <w:left w:val="single" w:color="B7C6DA" w:sz="1"/>
-              <w:bottom w:val="single" w:color="B7C6DA" w:sz="1"/>
-              <w:right w:val="single" w:color="B7C6DA" w:sz="1"/>
-            </w:tcBorders>
-            <w:shd w:fill="1F3864" w:val="clear"/>
-            <w:tcMar>
-              <w:top w:type="dxa" w:w="60"/>
-              <w:left w:type="dxa" w:w="110"/>
-              <w:bottom w:type="dxa" w:w="60"/>
-              <w:right w:type="dxa" w:w="110"/>
-            </w:tcMar>
-            <w:vAlign w:val="center"/>
-          </w:tcPr>
-          <w:p>
-            <w:r>
-              <w:rPr>
-                <w:b/>
-                <w:bCs/>
-                <w:color w:val="FFFFFF"/>
-                <w:sz w:val="18"/>
-                <w:szCs w:val="18"/>
-              </w:rPr>
-              <w:t xml:space="preserve">Value</w:t>
-            </w:r>
-          </w:p>
-        </w:tc>
-        <w:tc>
-          <w:tcPr>
-            <w:tcW w:type="dxa" w:w="2200"/>
-            <w:tcBorders>
-              <w:top w:val="single" w:color="B7C6DA" w:sz="1"/>
-              <w:left w:val="single" w:color="B7C6DA" w:sz="1"/>
-              <w:bottom w:val="single" w:color="B7C6DA" w:sz="1"/>
-              <w:right w:val="single" w:color="B7C6DA" w:sz="1"/>
-            </w:tcBorders>
-            <w:shd w:fill="1F3864" w:val="clear"/>
-            <w:tcMar>
-              <w:top w:type="dxa" w:w="60"/>
-              <w:left w:type="dxa" w:w="110"/>
-              <w:bottom w:type="dxa" w:w="60"/>
-              <w:right w:type="dxa" w:w="110"/>
-            </w:tcMar>
-            <w:vAlign w:val="center"/>
-          </w:tcPr>
-          <w:p>
-            <w:r>
-              <w:rPr>
-                <w:b/>
-                <w:bCs/>
-                <w:color w:val="FFFFFF"/>
-                <w:sz w:val="18"/>
-                <w:szCs w:val="18"/>
-              </w:rPr>
-              <w:t xml:space="preserve">Axis</w:t>
-            </w:r>
-          </w:p>
-        </w:tc>
-        <w:tc>
-          <w:tcPr>
-            <w:tcW w:type="dxa" w:w="5760"/>
-            <w:tcBorders>
-              <w:top w:val="single" w:color="B7C6DA" w:sz="1"/>
-              <w:left w:val="single" w:color="B7C6DA" w:sz="1"/>
-              <w:bottom w:val="single" w:color="B7C6DA" w:sz="1"/>
-              <w:right w:val="single" w:color="B7C6DA" w:sz="1"/>
-            </w:tcBorders>
-            <w:shd w:fill="1F3864" w:val="clear"/>
-            <w:tcMar>
-              <w:top w:type="dxa" w:w="60"/>
-              <w:left w:type="dxa" w:w="110"/>
-              <w:bottom w:type="dxa" w:w="60"/>
-              <w:right w:type="dxa" w:w="110"/>
-            </w:tcMar>
-            <w:vAlign w:val="center"/>
-          </w:tcPr>
-          <w:p>
-            <w:r>
-              <w:rPr>
-                <w:b/>
-                <w:bCs/>
-                <w:color w:val="FFFFFF"/>
-                <w:sz w:val="18"/>
-                <w:szCs w:val="18"/>
-              </w:rPr>
-              <w:t xml:space="preserve">Meaning</w:t>
-            </w:r>
-          </w:p>
-        </w:tc>
-      </w:tr>
-      <w:tr>
-        <w:tc>
-          <w:tcPr>
-            <w:tcW w:type="dxa" w:w="700"/>
-            <w:tcBorders>
-              <w:top w:val="single" w:color="B7C6DA" w:sz="1"/>
-              <w:left w:val="single" w:color="B7C6DA" w:sz="1"/>
-              <w:bottom w:val="single" w:color="B7C6DA" w:sz="1"/>
-              <w:right w:val="single" w:color="B7C6DA" w:sz="1"/>
-            </w:tcBorders>
-            <w:shd w:fill="FFFFFF" w:val="clear"/>
-            <w:tcMar>
-              <w:top w:type="dxa" w:w="60"/>
-              <w:left w:type="dxa" w:w="110"/>
-              <w:bottom w:type="dxa" w:w="60"/>
-              <w:right w:type="dxa" w:w="110"/>
-            </w:tcMar>
-            <w:vAlign w:val="center"/>
-          </w:tcPr>
-          <w:p>
-            <w:r>
-              <w:rPr>
-                <w:b w:val="false"/>
-                <w:bCs w:val="false"/>
-                <w:sz w:val="18"/>
-                <w:szCs w:val="18"/>
-              </w:rPr>
-              <w:t xml:space="preserve">1</w:t>
-            </w:r>
-          </w:p>
-        </w:tc>
-        <w:tc>
-          <w:tcPr>
-            <w:tcW w:type="dxa" w:w="700"/>
-            <w:tcBorders>
-              <w:top w:val="single" w:color="B7C6DA" w:sz="1"/>
-              <w:left w:val="single" w:color="B7C6DA" w:sz="1"/>
-              <w:bottom w:val="single" w:color="B7C6DA" w:sz="1"/>
-              <w:right w:val="single" w:color="B7C6DA" w:sz="1"/>
-            </w:tcBorders>
-            <w:shd w:fill="FFFFFF" w:val="clear"/>
-            <w:tcMar>
-              <w:top w:type="dxa" w:w="60"/>
-              <w:left w:type="dxa" w:w="110"/>
-              <w:bottom w:type="dxa" w:w="60"/>
-              <w:right w:type="dxa" w:w="110"/>
-            </w:tcMar>
-            <w:vAlign w:val="center"/>
-          </w:tcPr>
-          <w:p>
-            <w:r>
-              <w:rPr>
-                <w:b w:val="false"/>
-                <w:bCs w:val="false"/>
-                <w:sz w:val="18"/>
-                <w:szCs w:val="18"/>
-              </w:rPr>
-              <w:t xml:space="preserve">5</w:t>
-            </w:r>
-          </w:p>
-        </w:tc>
-        <w:tc>
-          <w:tcPr>
-            <w:tcW w:type="dxa" w:w="2200"/>
-            <w:tcBorders>
-              <w:top w:val="single" w:color="B7C6DA" w:sz="1"/>
-              <w:left w:val="single" w:color="B7C6DA" w:sz="1"/>
-              <w:bottom w:val="single" w:color="B7C6DA" w:sz="1"/>
-              <w:right w:val="single" w:color="B7C6DA" w:sz="1"/>
-            </w:tcBorders>
-            <w:shd w:fill="FFFFFF" w:val="clear"/>
-            <w:tcMar>
-              <w:top w:type="dxa" w:w="60"/>
-              <w:left w:type="dxa" w:w="110"/>
-              <w:bottom w:type="dxa" w:w="60"/>
-              <w:right w:type="dxa" w:w="110"/>
-            </w:tcMar>
-            <w:vAlign w:val="center"/>
-          </w:tcPr>
-          <w:p>
-            <w:r>
-              <w:rPr>
-                <w:b w:val="false"/>
-                <w:bCs w:val="false"/>
-                <w:sz w:val="18"/>
-                <w:szCs w:val="18"/>
-              </w:rPr>
-              <w:t xml:space="preserve">Section</w:t>
-            </w:r>
-          </w:p>
-        </w:tc>
-        <w:tc>
-          <w:tcPr>
-            <w:tcW w:type="dxa" w:w="5760"/>
-            <w:tcBorders>
-              <w:top w:val="single" w:color="B7C6DA" w:sz="1"/>
-              <w:left w:val="single" w:color="B7C6DA" w:sz="1"/>
-              <w:bottom w:val="single" w:color="B7C6DA" w:sz="1"/>
-              <w:right w:val="single" w:color="B7C6DA" w:sz="1"/>
-            </w:tcBorders>
-            <w:shd w:fill="FFFFFF" w:val="clear"/>
-            <w:tcMar>
-              <w:top w:type="dxa" w:w="60"/>
-              <w:left w:type="dxa" w:w="110"/>
-              <w:bottom w:type="dxa" w:w="60"/>
-              <w:right w:type="dxa" w:w="110"/>
-            </w:tcMar>
-            <w:vAlign w:val="center"/>
-          </w:tcPr>
-          <w:p>
-            <w:r>
-              <w:rPr>
-                <w:b w:val="false"/>
-                <w:bCs w:val="false"/>
-                <w:sz w:val="18"/>
-                <w:szCs w:val="18"/>
-              </w:rPr>
-              <w:t xml:space="preserve">Extracorporeal or Systemic Assistance and Performance</w:t>
-            </w:r>
-          </w:p>
-        </w:tc>
-      </w:tr>
-      <w:tr>
-        <w:tc>
-          <w:tcPr>
-            <w:tcW w:type="dxa" w:w="700"/>
-            <w:tcBorders>
-              <w:top w:val="single" w:color="B7C6DA" w:sz="1"/>
-              <w:left w:val="single" w:color="B7C6DA" w:sz="1"/>
-              <w:bottom w:val="single" w:color="B7C6DA" w:sz="1"/>
-              <w:right w:val="single" w:color="B7C6DA" w:sz="1"/>
-            </w:tcBorders>
-            <w:shd w:fill="EAF1F8" w:val="clear"/>
-            <w:tcMar>
-              <w:top w:type="dxa" w:w="60"/>
-              <w:left w:type="dxa" w:w="110"/>
-              <w:bottom w:type="dxa" w:w="60"/>
-              <w:right w:type="dxa" w:w="110"/>
-            </w:tcMar>
-            <w:vAlign w:val="center"/>
-          </w:tcPr>
-          <w:p>
-            <w:r>
-              <w:rPr>
-                <w:b w:val="false"/>
-                <w:bCs w:val="false"/>
-                <w:sz w:val="18"/>
-                <w:szCs w:val="18"/>
-              </w:rPr>
-              <w:t xml:space="preserve">2</w:t>
-            </w:r>
-          </w:p>
-        </w:tc>
-        <w:tc>
-          <w:tcPr>
-            <w:tcW w:type="dxa" w:w="700"/>
-            <w:tcBorders>
-              <w:top w:val="single" w:color="B7C6DA" w:sz="1"/>
-              <w:left w:val="single" w:color="B7C6DA" w:sz="1"/>
-              <w:bottom w:val="single" w:color="B7C6DA" w:sz="1"/>
-              <w:right w:val="single" w:color="B7C6DA" w:sz="1"/>
-            </w:tcBorders>
-            <w:shd w:fill="EAF1F8" w:val="clear"/>
-            <w:tcMar>
-              <w:top w:type="dxa" w:w="60"/>
-              <w:left w:type="dxa" w:w="110"/>
-              <w:bottom w:type="dxa" w:w="60"/>
-              <w:right w:type="dxa" w:w="110"/>
-            </w:tcMar>
-            <w:vAlign w:val="center"/>
-          </w:tcPr>
-          <w:p>
-            <w:r>
-              <w:rPr>
-                <w:b w:val="false"/>
-                <w:bCs w:val="false"/>
-                <w:sz w:val="18"/>
-                <w:szCs w:val="18"/>
-              </w:rPr>
-              <w:t xml:space="preserve">A</w:t>
-            </w:r>
-          </w:p>
-        </w:tc>
-        <w:tc>
-          <w:tcPr>
-            <w:tcW w:type="dxa" w:w="2200"/>
-            <w:tcBorders>
-              <w:top w:val="single" w:color="B7C6DA" w:sz="1"/>
-              <w:left w:val="single" w:color="B7C6DA" w:sz="1"/>
-              <w:bottom w:val="single" w:color="B7C6DA" w:sz="1"/>
-              <w:right w:val="single" w:color="B7C6DA" w:sz="1"/>
-            </w:tcBorders>
-            <w:shd w:fill="EAF1F8" w:val="clear"/>
-            <w:tcMar>
-              <w:top w:type="dxa" w:w="60"/>
-              <w:left w:type="dxa" w:w="110"/>
-              <w:bottom w:type="dxa" w:w="60"/>
-              <w:right w:type="dxa" w:w="110"/>
-            </w:tcMar>
-            <w:vAlign w:val="center"/>
-          </w:tcPr>
-          <w:p>
-            <w:r>
-              <w:rPr>
-                <w:b w:val="false"/>
-                <w:bCs w:val="false"/>
-                <w:sz w:val="18"/>
-                <w:szCs w:val="18"/>
-              </w:rPr>
-              <w:t xml:space="preserve">Body System</w:t>
-            </w:r>
-          </w:p>
-        </w:tc>
-        <w:tc>
-          <w:tcPr>
-            <w:tcW w:type="dxa" w:w="5760"/>
-            <w:tcBorders>
-              <w:top w:val="single" w:color="B7C6DA" w:sz="1"/>
-              <w:left w:val="single" w:color="B7C6DA" w:sz="1"/>
-              <w:bottom w:val="single" w:color="B7C6DA" w:sz="1"/>
-              <w:right w:val="single" w:color="B7C6DA" w:sz="1"/>
-            </w:tcBorders>
-            <w:shd w:fill="EAF1F8" w:val="clear"/>
-            <w:tcMar>
-              <w:top w:type="dxa" w:w="60"/>
-              <w:left w:type="dxa" w:w="110"/>
-              <w:bottom w:type="dxa" w:w="60"/>
-              <w:right w:type="dxa" w:w="110"/>
-            </w:tcMar>
-            <w:vAlign w:val="center"/>
-          </w:tcPr>
-          <w:p>
-            <w:r>
-              <w:rPr>
-                <w:b w:val="false"/>
-                <w:bCs w:val="false"/>
-                <w:sz w:val="18"/>
-                <w:szCs w:val="18"/>
-              </w:rPr>
-              <w:t xml:space="preserve">Physiological Systems</w:t>
-            </w:r>
-          </w:p>
-        </w:tc>
-      </w:tr>
-      <w:tr>
-        <w:tc>
-          <w:tcPr>
-            <w:tcW w:type="dxa" w:w="700"/>
-            <w:tcBorders>
-              <w:top w:val="single" w:color="B7C6DA" w:sz="1"/>
-              <w:left w:val="single" w:color="B7C6DA" w:sz="1"/>
-              <w:bottom w:val="single" w:color="B7C6DA" w:sz="1"/>
-              <w:right w:val="single" w:color="B7C6DA" w:sz="1"/>
-            </w:tcBorders>
-            <w:shd w:fill="FFFFFF" w:val="clear"/>
-            <w:tcMar>
-              <w:top w:type="dxa" w:w="60"/>
-              <w:left w:type="dxa" w:w="110"/>
-              <w:bottom w:type="dxa" w:w="60"/>
-              <w:right w:type="dxa" w:w="110"/>
-            </w:tcMar>
-            <w:vAlign w:val="center"/>
-          </w:tcPr>
-          <w:p>
-            <w:r>
-              <w:rPr>
-                <w:b w:val="false"/>
-                <w:bCs w:val="false"/>
-                <w:sz w:val="18"/>
-                <w:szCs w:val="18"/>
-              </w:rPr>
-              <w:t xml:space="preserve">3</w:t>
-            </w:r>
-          </w:p>
-        </w:tc>
-        <w:tc>
-          <w:tcPr>
-            <w:tcW w:type="dxa" w:w="700"/>
-            <w:tcBorders>
-              <w:top w:val="single" w:color="B7C6DA" w:sz="1"/>
-              <w:left w:val="single" w:color="B7C6DA" w:sz="1"/>
-              <w:bottom w:val="single" w:color="B7C6DA" w:sz="1"/>
-              <w:right w:val="single" w:color="B7C6DA" w:sz="1"/>
-            </w:tcBorders>
-            <w:shd w:fill="FFFFFF" w:val="clear"/>
-            <w:tcMar>
-              <w:top w:type="dxa" w:w="60"/>
-              <w:left w:type="dxa" w:w="110"/>
-              <w:bottom w:type="dxa" w:w="60"/>
-              <w:right w:type="dxa" w:w="110"/>
-            </w:tcMar>
-            <w:vAlign w:val="center"/>
-          </w:tcPr>
-          <w:p>
-            <w:r>
-              <w:rPr>
-                <w:b w:val="false"/>
-                <w:bCs w:val="false"/>
-                <w:sz w:val="18"/>
-                <w:szCs w:val="18"/>
-              </w:rPr>
-              <w:t xml:space="preserve">1</w:t>
-            </w:r>
-          </w:p>
-        </w:tc>
-        <w:tc>
-          <w:tcPr>
-            <w:tcW w:type="dxa" w:w="2200"/>
-            <w:tcBorders>
-              <w:top w:val="single" w:color="B7C6DA" w:sz="1"/>
-              <w:left w:val="single" w:color="B7C6DA" w:sz="1"/>
-              <w:bottom w:val="single" w:color="B7C6DA" w:sz="1"/>
-              <w:right w:val="single" w:color="B7C6DA" w:sz="1"/>
-            </w:tcBorders>
-            <w:shd w:fill="FFFFFF" w:val="clear"/>
-            <w:tcMar>
-              <w:top w:type="dxa" w:w="60"/>
-              <w:left w:type="dxa" w:w="110"/>
-              <w:bottom w:type="dxa" w:w="60"/>
-              <w:right w:type="dxa" w:w="110"/>
-            </w:tcMar>
-            <w:vAlign w:val="center"/>
-          </w:tcPr>
-          <w:p>
-            <w:r>
-              <w:rPr>
-                <w:b w:val="false"/>
-                <w:bCs w:val="false"/>
-                <w:sz w:val="18"/>
-                <w:szCs w:val="18"/>
-              </w:rPr>
-              <w:t xml:space="preserve">Root Operation</w:t>
-            </w:r>
-          </w:p>
-        </w:tc>
-        <w:tc>
-          <w:tcPr>
-            <w:tcW w:type="dxa" w:w="5760"/>
-            <w:tcBorders>
-              <w:top w:val="single" w:color="B7C6DA" w:sz="1"/>
-              <w:left w:val="single" w:color="B7C6DA" w:sz="1"/>
-              <w:bottom w:val="single" w:color="B7C6DA" w:sz="1"/>
-              <w:right w:val="single" w:color="B7C6DA" w:sz="1"/>
-            </w:tcBorders>
-            <w:shd w:fill="FFFFFF" w:val="clear"/>
-            <w:tcMar>
-              <w:top w:type="dxa" w:w="60"/>
-              <w:left w:type="dxa" w:w="110"/>
-              <w:bottom w:type="dxa" w:w="60"/>
-              <w:right w:type="dxa" w:w="110"/>
-            </w:tcMar>
-            <w:vAlign w:val="center"/>
-          </w:tcPr>
-          <w:p>
-            <w:r>
-              <w:rPr>
-                <w:b w:val="false"/>
-                <w:bCs w:val="false"/>
-                <w:sz w:val="18"/>
-                <w:szCs w:val="18"/>
-              </w:rPr>
-              <w:t xml:space="preserve">Performance</w:t>
-            </w:r>
-          </w:p>
-        </w:tc>
-      </w:tr>
-      <w:tr>
-        <w:tc>
-          <w:tcPr>
-            <w:tcW w:type="dxa" w:w="700"/>
-            <w:tcBorders>
-              <w:top w:val="single" w:color="B7C6DA" w:sz="1"/>
-              <w:left w:val="single" w:color="B7C6DA" w:sz="1"/>
-              <w:bottom w:val="single" w:color="B7C6DA" w:sz="1"/>
-              <w:right w:val="single" w:color="B7C6DA" w:sz="1"/>
-            </w:tcBorders>
-            <w:shd w:fill="EAF1F8" w:val="clear"/>
-            <w:tcMar>
-              <w:top w:type="dxa" w:w="60"/>
-              <w:left w:type="dxa" w:w="110"/>
-              <w:bottom w:type="dxa" w:w="60"/>
-              <w:right w:type="dxa" w:w="110"/>
-            </w:tcMar>
-            <w:vAlign w:val="center"/>
-          </w:tcPr>
-          <w:p>
-            <w:r>
-              <w:rPr>
-                <w:b w:val="false"/>
-                <w:bCs w:val="false"/>
-                <w:sz w:val="18"/>
-                <w:szCs w:val="18"/>
-              </w:rPr>
-              <w:t xml:space="preserve">4</w:t>
-            </w:r>
-          </w:p>
-        </w:tc>
-        <w:tc>
-          <w:tcPr>
-            <w:tcW w:type="dxa" w:w="700"/>
-            <w:tcBorders>
-              <w:top w:val="single" w:color="B7C6DA" w:sz="1"/>
-              <w:left w:val="single" w:color="B7C6DA" w:sz="1"/>
-              <w:bottom w:val="single" w:color="B7C6DA" w:sz="1"/>
-              <w:right w:val="single" w:color="B7C6DA" w:sz="1"/>
-            </w:tcBorders>
-            <w:shd w:fill="EAF1F8" w:val="clear"/>
-            <w:tcMar>
-              <w:top w:type="dxa" w:w="60"/>
-              <w:left w:type="dxa" w:w="110"/>
-              <w:bottom w:type="dxa" w:w="60"/>
-              <w:right w:type="dxa" w:w="110"/>
-            </w:tcMar>
-            <w:vAlign w:val="center"/>
-          </w:tcPr>
-          <w:p>
-            <w:r>
-              <w:rPr>
-                <w:b w:val="false"/>
-                <w:bCs w:val="false"/>
-                <w:sz w:val="18"/>
-                <w:szCs w:val="18"/>
-              </w:rPr>
-              <w:t xml:space="preserve">D</w:t>
-            </w:r>
-          </w:p>
-        </w:tc>
-        <w:tc>
-          <w:tcPr>
-            <w:tcW w:type="dxa" w:w="2200"/>
-            <w:tcBorders>
-              <w:top w:val="single" w:color="B7C6DA" w:sz="1"/>
-              <w:left w:val="single" w:color="B7C6DA" w:sz="1"/>
-              <w:bottom w:val="single" w:color="B7C6DA" w:sz="1"/>
-              <w:right w:val="single" w:color="B7C6DA" w:sz="1"/>
-            </w:tcBorders>
-            <w:shd w:fill="EAF1F8" w:val="clear"/>
-            <w:tcMar>
-              <w:top w:type="dxa" w:w="60"/>
-              <w:left w:type="dxa" w:w="110"/>
-              <w:bottom w:type="dxa" w:w="60"/>
-              <w:right w:type="dxa" w:w="110"/>
-            </w:tcMar>
-            <w:vAlign w:val="center"/>
-          </w:tcPr>
-          <w:p>
-            <w:r>
-              <w:rPr>
-                <w:b w:val="false"/>
-                <w:bCs w:val="false"/>
-                <w:sz w:val="18"/>
-                <w:szCs w:val="18"/>
-              </w:rPr>
-              <w:t xml:space="preserve">Body System</w:t>
-            </w:r>
-          </w:p>
-        </w:tc>
-        <w:tc>
-          <w:tcPr>
-            <w:tcW w:type="dxa" w:w="5760"/>
-            <w:tcBorders>
-              <w:top w:val="single" w:color="B7C6DA" w:sz="1"/>
-              <w:left w:val="single" w:color="B7C6DA" w:sz="1"/>
-              <w:bottom w:val="single" w:color="B7C6DA" w:sz="1"/>
-              <w:right w:val="single" w:color="B7C6DA" w:sz="1"/>
-            </w:tcBorders>
-            <w:shd w:fill="EAF1F8" w:val="clear"/>
-            <w:tcMar>
-              <w:top w:type="dxa" w:w="60"/>
-              <w:left w:type="dxa" w:w="110"/>
-              <w:bottom w:type="dxa" w:w="60"/>
-              <w:right w:type="dxa" w:w="110"/>
-            </w:tcMar>
-            <w:vAlign w:val="center"/>
-          </w:tcPr>
-          <w:p>
-            <w:r>
-              <w:rPr>
-                <w:b w:val="false"/>
-                <w:bCs w:val="false"/>
-                <w:sz w:val="18"/>
-                <w:szCs w:val="18"/>
-              </w:rPr>
-              <w:t xml:space="preserve">Urinary</w:t>
-            </w:r>
-          </w:p>
-        </w:tc>
-      </w:tr>
-      <w:tr>
-        <w:tc>
-          <w:tcPr>
-            <w:tcW w:type="dxa" w:w="700"/>
-            <w:tcBorders>
-              <w:top w:val="single" w:color="B7C6DA" w:sz="1"/>
-              <w:left w:val="single" w:color="B7C6DA" w:sz="1"/>
-              <w:bottom w:val="single" w:color="B7C6DA" w:sz="1"/>
-              <w:right w:val="single" w:color="B7C6DA" w:sz="1"/>
-            </w:tcBorders>
-            <w:shd w:fill="FFFFFF" w:val="clear"/>
-            <w:tcMar>
-              <w:top w:type="dxa" w:w="60"/>
-              <w:left w:type="dxa" w:w="110"/>
-              <w:bottom w:type="dxa" w:w="60"/>
-              <w:right w:type="dxa" w:w="110"/>
-            </w:tcMar>
-            <w:vAlign w:val="center"/>
-          </w:tcPr>
-          <w:p>
-            <w:r>
-              <w:rPr>
-                <w:b/>
-                <w:bCs/>
-                <w:sz w:val="18"/>
-                <w:szCs w:val="18"/>
-              </w:rPr>
-              <w:t xml:space="preserve">5</w:t>
-            </w:r>
-          </w:p>
-        </w:tc>
-        <w:tc>
-          <w:tcPr>
-            <w:tcW w:type="dxa" w:w="700"/>
-            <w:tcBorders>
-              <w:top w:val="single" w:color="B7C6DA" w:sz="1"/>
-              <w:left w:val="single" w:color="B7C6DA" w:sz="1"/>
-              <w:bottom w:val="single" w:color="B7C6DA" w:sz="1"/>
-              <w:right w:val="single" w:color="B7C6DA" w:sz="1"/>
-            </w:tcBorders>
-            <w:shd w:fill="FFFFFF" w:val="clear"/>
-            <w:tcMar>
-              <w:top w:type="dxa" w:w="60"/>
-              <w:left w:type="dxa" w:w="110"/>
-              <w:bottom w:type="dxa" w:w="60"/>
-              <w:right w:type="dxa" w:w="110"/>
-            </w:tcMar>
-            <w:vAlign w:val="center"/>
-          </w:tcPr>
-          <w:p>
-            <w:r>
-              <w:rPr>
-                <w:b/>
-                <w:bCs/>
-                <w:sz w:val="18"/>
-                <w:szCs w:val="18"/>
-              </w:rPr>
-              <w:t xml:space="preserve">9</w:t>
-            </w:r>
-          </w:p>
-        </w:tc>
-        <w:tc>
-          <w:tcPr>
-            <w:tcW w:type="dxa" w:w="2200"/>
-            <w:tcBorders>
-              <w:top w:val="single" w:color="B7C6DA" w:sz="1"/>
-              <w:left w:val="single" w:color="B7C6DA" w:sz="1"/>
-              <w:bottom w:val="single" w:color="B7C6DA" w:sz="1"/>
-              <w:right w:val="single" w:color="B7C6DA" w:sz="1"/>
-            </w:tcBorders>
-            <w:shd w:fill="FFFFFF" w:val="clear"/>
-            <w:tcMar>
-              <w:top w:type="dxa" w:w="60"/>
-              <w:left w:type="dxa" w:w="110"/>
-              <w:bottom w:type="dxa" w:w="60"/>
-              <w:right w:type="dxa" w:w="110"/>
-            </w:tcMar>
-            <w:vAlign w:val="center"/>
-          </w:tcPr>
-          <w:p>
-            <w:r>
-              <w:rPr>
-                <w:b/>
-                <w:bCs/>
-                <w:sz w:val="18"/>
-                <w:szCs w:val="18"/>
-              </w:rPr>
-              <w:t xml:space="preserve">Duration</w:t>
-            </w:r>
-          </w:p>
-        </w:tc>
-        <w:tc>
-          <w:tcPr>
-            <w:tcW w:type="dxa" w:w="5760"/>
-            <w:tcBorders>
-              <w:top w:val="single" w:color="B7C6DA" w:sz="1"/>
-              <w:left w:val="single" w:color="B7C6DA" w:sz="1"/>
-              <w:bottom w:val="single" w:color="B7C6DA" w:sz="1"/>
-              <w:right w:val="single" w:color="B7C6DA" w:sz="1"/>
-            </w:tcBorders>
-            <w:shd w:fill="FFFFFF" w:val="clear"/>
-            <w:tcMar>
-              <w:top w:type="dxa" w:w="60"/>
-              <w:left w:type="dxa" w:w="110"/>
-              <w:bottom w:type="dxa" w:w="60"/>
-              <w:right w:type="dxa" w:w="110"/>
-            </w:tcMar>
-            <w:vAlign w:val="center"/>
-          </w:tcPr>
-          <w:p>
-            <w:r>
-              <w:rPr>
-                <w:b/>
-                <w:bCs/>
-                <w:sz w:val="18"/>
-                <w:szCs w:val="18"/>
-              </w:rPr>
-              <w:t xml:space="preserve">Continuous (&gt;18 hrs/day)  ← intermittent = 7</w:t>
-            </w:r>
-          </w:p>
-        </w:tc>
-      </w:tr>
-      <w:tr>
-        <w:tc>
-          <w:tcPr>
-            <w:tcW w:type="dxa" w:w="700"/>
-            <w:tcBorders>
-              <w:top w:val="single" w:color="B7C6DA" w:sz="1"/>
-              <w:left w:val="single" w:color="B7C6DA" w:sz="1"/>
-              <w:bottom w:val="single" w:color="B7C6DA" w:sz="1"/>
-              <w:right w:val="single" w:color="B7C6DA" w:sz="1"/>
-            </w:tcBorders>
-            <w:shd w:fill="EAF1F8" w:val="clear"/>
-            <w:tcMar>
-              <w:top w:type="dxa" w:w="60"/>
-              <w:left w:type="dxa" w:w="110"/>
-              <w:bottom w:type="dxa" w:w="60"/>
-              <w:right w:type="dxa" w:w="110"/>
-            </w:tcMar>
-            <w:vAlign w:val="center"/>
-          </w:tcPr>
-          <w:p>
-            <w:r>
-              <w:rPr>
-                <w:b w:val="false"/>
-                <w:bCs w:val="false"/>
-                <w:sz w:val="18"/>
-                <w:szCs w:val="18"/>
-              </w:rPr>
-              <w:t xml:space="preserve">6</w:t>
-            </w:r>
-          </w:p>
-        </w:tc>
-        <w:tc>
-          <w:tcPr>
-            <w:tcW w:type="dxa" w:w="700"/>
-            <w:tcBorders>
-              <w:top w:val="single" w:color="B7C6DA" w:sz="1"/>
-              <w:left w:val="single" w:color="B7C6DA" w:sz="1"/>
-              <w:bottom w:val="single" w:color="B7C6DA" w:sz="1"/>
-              <w:right w:val="single" w:color="B7C6DA" w:sz="1"/>
-            </w:tcBorders>
-            <w:shd w:fill="EAF1F8" w:val="clear"/>
-            <w:tcMar>
-              <w:top w:type="dxa" w:w="60"/>
-              <w:left w:type="dxa" w:w="110"/>
-              <w:bottom w:type="dxa" w:w="60"/>
-              <w:right w:type="dxa" w:w="110"/>
-            </w:tcMar>
-            <w:vAlign w:val="center"/>
-          </w:tcPr>
-          <w:p>
-            <w:r>
-              <w:rPr>
-                <w:b w:val="false"/>
-                <w:bCs w:val="false"/>
-                <w:sz w:val="18"/>
-                <w:szCs w:val="18"/>
-              </w:rPr>
-              <w:t xml:space="preserve">0</w:t>
-            </w:r>
-          </w:p>
-        </w:tc>
-        <w:tc>
-          <w:tcPr>
-            <w:tcW w:type="dxa" w:w="2200"/>
-            <w:tcBorders>
-              <w:top w:val="single" w:color="B7C6DA" w:sz="1"/>
-              <w:left w:val="single" w:color="B7C6DA" w:sz="1"/>
-              <w:bottom w:val="single" w:color="B7C6DA" w:sz="1"/>
-              <w:right w:val="single" w:color="B7C6DA" w:sz="1"/>
-            </w:tcBorders>
-            <w:shd w:fill="EAF1F8" w:val="clear"/>
-            <w:tcMar>
-              <w:top w:type="dxa" w:w="60"/>
-              <w:left w:type="dxa" w:w="110"/>
-              <w:bottom w:type="dxa" w:w="60"/>
-              <w:right w:type="dxa" w:w="110"/>
-            </w:tcMar>
-            <w:vAlign w:val="center"/>
-          </w:tcPr>
-          <w:p>
-            <w:r>
-              <w:rPr>
-                <w:b w:val="false"/>
-                <w:bCs w:val="false"/>
-                <w:sz w:val="18"/>
-                <w:szCs w:val="18"/>
-              </w:rPr>
-              <w:t xml:space="preserve">Function</w:t>
-            </w:r>
-          </w:p>
-        </w:tc>
-        <w:tc>
-          <w:tcPr>
-            <w:tcW w:type="dxa" w:w="5760"/>
-            <w:tcBorders>
-              <w:top w:val="single" w:color="B7C6DA" w:sz="1"/>
-              <w:left w:val="single" w:color="B7C6DA" w:sz="1"/>
-              <w:bottom w:val="single" w:color="B7C6DA" w:sz="1"/>
-              <w:right w:val="single" w:color="B7C6DA" w:sz="1"/>
-            </w:tcBorders>
-            <w:shd w:fill="EAF1F8" w:val="clear"/>
-            <w:tcMar>
-              <w:top w:type="dxa" w:w="60"/>
-              <w:left w:type="dxa" w:w="110"/>
-              <w:bottom w:type="dxa" w:w="60"/>
-              <w:right w:type="dxa" w:w="110"/>
-            </w:tcMar>
-            <w:vAlign w:val="center"/>
-          </w:tcPr>
-          <w:p>
-            <w:r>
-              <w:rPr>
-                <w:b w:val="false"/>
-                <w:bCs w:val="false"/>
-                <w:sz w:val="18"/>
-                <w:szCs w:val="18"/>
-              </w:rPr>
-              <w:t xml:space="preserve">Filtration</w:t>
-            </w:r>
-          </w:p>
-        </w:tc>
-      </w:tr>
-      <w:tr>
-        <w:tc>
-          <w:tcPr>
-            <w:tcW w:type="dxa" w:w="700"/>
-            <w:tcBorders>
-              <w:top w:val="single" w:color="B7C6DA" w:sz="1"/>
-              <w:left w:val="single" w:color="B7C6DA" w:sz="1"/>
-              <w:bottom w:val="single" w:color="B7C6DA" w:sz="1"/>
-              <w:right w:val="single" w:color="B7C6DA" w:sz="1"/>
-            </w:tcBorders>
-            <w:shd w:fill="FFFFFF" w:val="clear"/>
-            <w:tcMar>
-              <w:top w:type="dxa" w:w="60"/>
-              <w:left w:type="dxa" w:w="110"/>
-              <w:bottom w:type="dxa" w:w="60"/>
-              <w:right w:type="dxa" w:w="110"/>
-            </w:tcMar>
-            <w:vAlign w:val="center"/>
-          </w:tcPr>
-          <w:p>
-            <w:r>
-              <w:rPr>
-                <w:b w:val="false"/>
-                <w:bCs w:val="false"/>
-                <w:sz w:val="18"/>
-                <w:szCs w:val="18"/>
-              </w:rPr>
-              <w:t xml:space="preserve">7</w:t>
-            </w:r>
-          </w:p>
-        </w:tc>
-        <w:tc>
-          <w:tcPr>
-            <w:tcW w:type="dxa" w:w="700"/>
-            <w:tcBorders>
-              <w:top w:val="single" w:color="B7C6DA" w:sz="1"/>
-              <w:left w:val="single" w:color="B7C6DA" w:sz="1"/>
-              <w:bottom w:val="single" w:color="B7C6DA" w:sz="1"/>
-              <w:right w:val="single" w:color="B7C6DA" w:sz="1"/>
-            </w:tcBorders>
-            <w:shd w:fill="FFFFFF" w:val="clear"/>
-            <w:tcMar>
-              <w:top w:type="dxa" w:w="60"/>
-              <w:left w:type="dxa" w:w="110"/>
-              <w:bottom w:type="dxa" w:w="60"/>
-              <w:right w:type="dxa" w:w="110"/>
-            </w:tcMar>
-            <w:vAlign w:val="center"/>
-          </w:tcPr>
-          <w:p>
-            <w:r>
-              <w:rPr>
-                <w:b w:val="false"/>
-                <w:bCs w:val="false"/>
-                <w:sz w:val="18"/>
-                <w:szCs w:val="18"/>
-              </w:rPr>
-              <w:t xml:space="preserve">Z</w:t>
-            </w:r>
-          </w:p>
-        </w:tc>
-        <w:tc>
-          <w:tcPr>
-            <w:tcW w:type="dxa" w:w="2200"/>
-            <w:tcBorders>
-              <w:top w:val="single" w:color="B7C6DA" w:sz="1"/>
-              <w:left w:val="single" w:color="B7C6DA" w:sz="1"/>
-              <w:bottom w:val="single" w:color="B7C6DA" w:sz="1"/>
-              <w:right w:val="single" w:color="B7C6DA" w:sz="1"/>
-            </w:tcBorders>
-            <w:shd w:fill="FFFFFF" w:val="clear"/>
-            <w:tcMar>
-              <w:top w:type="dxa" w:w="60"/>
-              <w:left w:type="dxa" w:w="110"/>
-              <w:bottom w:type="dxa" w:w="60"/>
-              <w:right w:type="dxa" w:w="110"/>
-            </w:tcMar>
-            <w:vAlign w:val="center"/>
-          </w:tcPr>
-          <w:p>
-            <w:r>
-              <w:rPr>
-                <w:b w:val="false"/>
-                <w:bCs w:val="false"/>
-                <w:sz w:val="18"/>
-                <w:szCs w:val="18"/>
-              </w:rPr>
-              <w:t xml:space="preserve">Qualifier</w:t>
-            </w:r>
-          </w:p>
-        </w:tc>
-        <w:tc>
-          <w:tcPr>
-            <w:tcW w:type="dxa" w:w="5760"/>
-            <w:tcBorders>
-              <w:top w:val="single" w:color="B7C6DA" w:sz="1"/>
-              <w:left w:val="single" w:color="B7C6DA" w:sz="1"/>
-              <w:bottom w:val="single" w:color="B7C6DA" w:sz="1"/>
-              <w:right w:val="single" w:color="B7C6DA" w:sz="1"/>
-            </w:tcBorders>
-            <w:shd w:fill="FFFFFF" w:val="clear"/>
-            <w:tcMar>
-              <w:top w:type="dxa" w:w="60"/>
-              <w:left w:type="dxa" w:w="110"/>
-              <w:bottom w:type="dxa" w:w="60"/>
-              <w:right w:type="dxa" w:w="110"/>
-            </w:tcMar>
-            <w:vAlign w:val="center"/>
-          </w:tcPr>
-          <w:p>
-            <w:r>
-              <w:rPr>
-                <w:b w:val="false"/>
-                <w:bCs w:val="false"/>
-                <w:sz w:val="18"/>
-                <w:szCs w:val="18"/>
-              </w:rPr>
-              <w:t xml:space="preserve">None</w:t>
-            </w:r>
-          </w:p>
-        </w:tc>
-      </w:tr>
-    </w:tbl>
-    <w:p>
-      <w:pPr>
-        <w:spacing w:after="100"/>
-      </w:pPr>
-      <w:r>
-        <w:rPr>
-          <w:b w:val="false"/>
-          <w:bCs w:val="false"/>
-          <w:i/>
-          <w:iCs/>
-          <w:sz w:val="20"/>
-          <w:szCs w:val="20"/>
-        </w:rPr>
-        <w:t xml:space="preserve">Unlike ventilation, the CRRT procedure is not an O.R. procedure and barely moves the DRG on its own. The lever is the diagnosis it treats: documenting acute kidney failure / ATN (N17.x, a CC) can lift a DRG tier (without CC/MCC → with CC), typically worth ~$1,200–$3,000. So capture both the continuous modality (5A1D90Z vs intermittent 5A1D70Z) and the linked acute kidney failure diagnosis.</w:t>
-      </w:r>
-    </w:p>
-    <w:p>
-      <w:pPr>
-        <w:pStyle w:val="Heading2"/>
-      </w:pPr>
-      <w:r>
-        <w:t xml:space="preserve">ICU procedures ranked by DRG leverage</w:t>
-      </w:r>
-    </w:p>
-    <w:tbl>
-      <w:tblPr>
-        <w:tblW w:type="dxa" w:w="9360"/>
-        <w:tblBorders>
-          <w:top w:val="single" w:color="auto" w:sz="4"/>
-          <w:left w:val="single" w:color="auto" w:sz="4"/>
-          <w:bottom w:val="single" w:color="auto" w:sz="4"/>
-          <w:right w:val="single" w:color="auto" w:sz="4"/>
-          <w:insideH w:val="single" w:color="auto" w:sz="4"/>
-          <w:insideV w:val="single" w:color="auto" w:sz="4"/>
-        </w:tblBorders>
-      </w:tblPr>
-      <w:tblGrid>
-        <w:gridCol w:w="2300"/>
-        <w:gridCol w:w="2660"/>
-        <w:gridCol w:w="1900"/>
-        <w:gridCol w:w="2500"/>
-      </w:tblGrid>
-      <w:tr>
-        <w:trPr>
-          <w:tblHeader/>
-        </w:trPr>
-        <w:tc>
-          <w:tcPr>
-            <w:tcW w:type="dxa" w:w="2300"/>
-            <w:tcBorders>
-              <w:top w:val="single" w:color="B7C6DA" w:sz="1"/>
-              <w:left w:val="single" w:color="B7C6DA" w:sz="1"/>
-              <w:bottom w:val="single" w:color="B7C6DA" w:sz="1"/>
-              <w:right w:val="single" w:color="B7C6DA" w:sz="1"/>
-            </w:tcBorders>
-            <w:shd w:fill="1F3864" w:val="clear"/>
-            <w:tcMar>
-              <w:top w:type="dxa" w:w="60"/>
-              <w:left w:type="dxa" w:w="110"/>
-              <w:bottom w:type="dxa" w:w="60"/>
-              <w:right w:type="dxa" w:w="110"/>
-            </w:tcMar>
-            <w:vAlign w:val="center"/>
-          </w:tcPr>
-          <w:p>
-            <w:r>
-              <w:rPr>
-                <w:b/>
-                <w:bCs/>
-                <w:color w:val="FFFFFF"/>
-                <w:sz w:val="18"/>
-                <w:szCs w:val="18"/>
-              </w:rPr>
-              <w:t xml:space="preserve">Procedure</w:t>
-            </w:r>
-          </w:p>
-        </w:tc>
-        <w:tc>
-          <w:tcPr>
-            <w:tcW w:type="dxa" w:w="2660"/>
-            <w:tcBorders>
-              <w:top w:val="single" w:color="B7C6DA" w:sz="1"/>
-              <w:left w:val="single" w:color="B7C6DA" w:sz="1"/>
-              <w:bottom w:val="single" w:color="B7C6DA" w:sz="1"/>
-              <w:right w:val="single" w:color="B7C6DA" w:sz="1"/>
-            </w:tcBorders>
-            <w:shd w:fill="1F3864" w:val="clear"/>
-            <w:tcMar>
-              <w:top w:type="dxa" w:w="60"/>
-              <w:left w:type="dxa" w:w="110"/>
-              <w:bottom w:type="dxa" w:w="60"/>
-              <w:right w:type="dxa" w:w="110"/>
-            </w:tcMar>
-            <w:vAlign w:val="center"/>
-          </w:tcPr>
-          <w:p>
-            <w:r>
-              <w:rPr>
-                <w:b/>
-                <w:bCs/>
-                <w:color w:val="FFFFFF"/>
-                <w:sz w:val="18"/>
-                <w:szCs w:val="18"/>
-              </w:rPr>
-              <w:t xml:space="preserve">Example PCS code(s)</w:t>
-            </w:r>
-          </w:p>
-        </w:tc>
-        <w:tc>
-          <w:tcPr>
-            <w:tcW w:type="dxa" w:w="1900"/>
-            <w:tcBorders>
-              <w:top w:val="single" w:color="B7C6DA" w:sz="1"/>
-              <w:left w:val="single" w:color="B7C6DA" w:sz="1"/>
-              <w:bottom w:val="single" w:color="B7C6DA" w:sz="1"/>
-              <w:right w:val="single" w:color="B7C6DA" w:sz="1"/>
-            </w:tcBorders>
-            <w:shd w:fill="1F3864" w:val="clear"/>
-            <w:tcMar>
-              <w:top w:type="dxa" w:w="60"/>
-              <w:left w:type="dxa" w:w="110"/>
-              <w:bottom w:type="dxa" w:w="60"/>
-              <w:right w:type="dxa" w:w="110"/>
-            </w:tcMar>
-            <w:vAlign w:val="center"/>
-          </w:tcPr>
-          <w:p>
-            <w:r>
-              <w:rPr>
-                <w:b/>
-                <w:bCs/>
-                <w:color w:val="FFFFFF"/>
-                <w:sz w:val="18"/>
-                <w:szCs w:val="18"/>
-              </w:rPr>
-              <w:t xml:space="preserve">DRG leverage</w:t>
-            </w:r>
-          </w:p>
-        </w:tc>
-        <w:tc>
-          <w:tcPr>
-            <w:tcW w:type="dxa" w:w="2500"/>
-            <w:tcBorders>
-              <w:top w:val="single" w:color="B7C6DA" w:sz="1"/>
-              <w:left w:val="single" w:color="B7C6DA" w:sz="1"/>
-              <w:bottom w:val="single" w:color="B7C6DA" w:sz="1"/>
-              <w:right w:val="single" w:color="B7C6DA" w:sz="1"/>
-            </w:tcBorders>
-            <w:shd w:fill="1F3864" w:val="clear"/>
-            <w:tcMar>
-              <w:top w:type="dxa" w:w="60"/>
-              <w:left w:type="dxa" w:w="110"/>
-              <w:bottom w:type="dxa" w:w="60"/>
-              <w:right w:type="dxa" w:w="110"/>
-            </w:tcMar>
-            <w:vAlign w:val="center"/>
-          </w:tcPr>
-          <w:p>
-            <w:r>
-              <w:rPr>
-                <w:b/>
-                <w:bCs/>
-                <w:color w:val="FFFFFF"/>
-                <w:sz w:val="18"/>
-                <w:szCs w:val="18"/>
-              </w:rPr>
-              <w:t xml:space="preserve">Document this</w:t>
-            </w:r>
-          </w:p>
-        </w:tc>
-      </w:tr>
-      <w:tr>
-        <w:tc>
-          <w:tcPr>
-            <w:tcW w:type="dxa" w:w="2300"/>
-            <w:tcBorders>
-              <w:top w:val="single" w:color="B7C6DA" w:sz="1"/>
-              <w:left w:val="single" w:color="B7C6DA" w:sz="1"/>
-              <w:bottom w:val="single" w:color="B7C6DA" w:sz="1"/>
-              <w:right w:val="single" w:color="B7C6DA" w:sz="1"/>
-            </w:tcBorders>
-            <w:shd w:fill="FFFFFF" w:val="clear"/>
-            <w:tcMar>
-              <w:top w:type="dxa" w:w="60"/>
-              <w:left w:type="dxa" w:w="110"/>
-              <w:bottom w:type="dxa" w:w="60"/>
-              <w:right w:type="dxa" w:w="110"/>
-            </w:tcMar>
-            <w:vAlign w:val="center"/>
-          </w:tcPr>
-          <w:p>
-            <w:r>
-              <w:rPr>
-                <w:b/>
-                <w:bCs/>
-                <w:sz w:val="18"/>
-                <w:szCs w:val="18"/>
-              </w:rPr>
-              <w:t xml:space="preserve">Tracheostomy</w:t>
-            </w:r>
-          </w:p>
-        </w:tc>
-        <w:tc>
-          <w:tcPr>
-            <w:tcW w:type="dxa" w:w="2660"/>
-            <w:tcBorders>
-              <w:top w:val="single" w:color="B7C6DA" w:sz="1"/>
-              <w:left w:val="single" w:color="B7C6DA" w:sz="1"/>
-              <w:bottom w:val="single" w:color="B7C6DA" w:sz="1"/>
-              <w:right w:val="single" w:color="B7C6DA" w:sz="1"/>
-            </w:tcBorders>
-            <w:shd w:fill="FFFFFF" w:val="clear"/>
-            <w:tcMar>
-              <w:top w:type="dxa" w:w="60"/>
-              <w:left w:type="dxa" w:w="110"/>
-              <w:bottom w:type="dxa" w:w="60"/>
-              <w:right w:type="dxa" w:w="110"/>
-            </w:tcMar>
-            <w:vAlign w:val="center"/>
-          </w:tcPr>
-          <w:p>
-            <w:r>
-              <w:rPr>
-                <w:b w:val="false"/>
-                <w:bCs w:val="false"/>
-                <w:sz w:val="18"/>
-                <w:szCs w:val="18"/>
-              </w:rPr>
-              <w:t xml:space="preserve">0B110F4 open / 0B113F4 perc</w:t>
-            </w:r>
-          </w:p>
-        </w:tc>
-        <w:tc>
-          <w:tcPr>
-            <w:tcW w:type="dxa" w:w="1900"/>
-            <w:tcBorders>
-              <w:top w:val="single" w:color="B7C6DA" w:sz="1"/>
-              <w:left w:val="single" w:color="B7C6DA" w:sz="1"/>
-              <w:bottom w:val="single" w:color="B7C6DA" w:sz="1"/>
-              <w:right w:val="single" w:color="B7C6DA" w:sz="1"/>
-            </w:tcBorders>
-            <w:shd w:fill="FFFFFF" w:val="clear"/>
-            <w:tcMar>
-              <w:top w:type="dxa" w:w="60"/>
-              <w:left w:type="dxa" w:w="110"/>
-              <w:bottom w:type="dxa" w:w="60"/>
-              <w:right w:type="dxa" w:w="110"/>
-            </w:tcMar>
-            <w:vAlign w:val="center"/>
-          </w:tcPr>
-          <w:p>
-            <w:r>
-              <w:rPr>
-                <w:b w:val="false"/>
-                <w:bCs w:val="false"/>
-                <w:sz w:val="18"/>
-                <w:szCs w:val="18"/>
-              </w:rPr>
-              <w:t xml:space="preserve">Pre-MDC 003/004 (wt 21.2 / 13.9)</w:t>
-            </w:r>
-          </w:p>
-        </w:tc>
-        <w:tc>
-          <w:tcPr>
-            <w:tcW w:type="dxa" w:w="2500"/>
-            <w:tcBorders>
-              <w:top w:val="single" w:color="B7C6DA" w:sz="1"/>
-              <w:left w:val="single" w:color="B7C6DA" w:sz="1"/>
-              <w:bottom w:val="single" w:color="B7C6DA" w:sz="1"/>
-              <w:right w:val="single" w:color="B7C6DA" w:sz="1"/>
-            </w:tcBorders>
-            <w:shd w:fill="FFFFFF" w:val="clear"/>
-            <w:tcMar>
-              <w:top w:type="dxa" w:w="60"/>
-              <w:left w:type="dxa" w:w="110"/>
-              <w:bottom w:type="dxa" w:w="60"/>
-              <w:right w:type="dxa" w:w="110"/>
-            </w:tcMar>
-            <w:vAlign w:val="center"/>
-          </w:tcPr>
-          <w:p>
-            <w:r>
-              <w:rPr>
-                <w:b w:val="false"/>
-                <w:bCs w:val="false"/>
-                <w:sz w:val="18"/>
-                <w:szCs w:val="18"/>
-              </w:rPr>
-              <w:t xml:space="preserve">Date, approach, device placed, new vs pre-existing</w:t>
-            </w:r>
-          </w:p>
-        </w:tc>
-      </w:tr>
-      <w:tr>
-        <w:tc>
-          <w:tcPr>
-            <w:tcW w:type="dxa" w:w="2300"/>
-            <w:tcBorders>
-              <w:top w:val="single" w:color="B7C6DA" w:sz="1"/>
-              <w:left w:val="single" w:color="B7C6DA" w:sz="1"/>
-              <w:bottom w:val="single" w:color="B7C6DA" w:sz="1"/>
-              <w:right w:val="single" w:color="B7C6DA" w:sz="1"/>
-            </w:tcBorders>
-            <w:shd w:fill="EAF1F8" w:val="clear"/>
-            <w:tcMar>
-              <w:top w:type="dxa" w:w="60"/>
-              <w:left w:type="dxa" w:w="110"/>
-              <w:bottom w:type="dxa" w:w="60"/>
-              <w:right w:type="dxa" w:w="110"/>
-            </w:tcMar>
-            <w:vAlign w:val="center"/>
-          </w:tcPr>
-          <w:p>
-            <w:r>
-              <w:rPr>
-                <w:b/>
-                <w:bCs/>
-                <w:sz w:val="18"/>
-                <w:szCs w:val="18"/>
-              </w:rPr>
-              <w:t xml:space="preserve">ECMO</w:t>
-            </w:r>
-          </w:p>
-        </w:tc>
-        <w:tc>
-          <w:tcPr>
-            <w:tcW w:type="dxa" w:w="2660"/>
-            <w:tcBorders>
-              <w:top w:val="single" w:color="B7C6DA" w:sz="1"/>
-              <w:left w:val="single" w:color="B7C6DA" w:sz="1"/>
-              <w:bottom w:val="single" w:color="B7C6DA" w:sz="1"/>
-              <w:right w:val="single" w:color="B7C6DA" w:sz="1"/>
-            </w:tcBorders>
-            <w:shd w:fill="EAF1F8" w:val="clear"/>
-            <w:tcMar>
-              <w:top w:type="dxa" w:w="60"/>
-              <w:left w:type="dxa" w:w="110"/>
-              <w:bottom w:type="dxa" w:w="60"/>
-              <w:right w:type="dxa" w:w="110"/>
-            </w:tcMar>
-            <w:vAlign w:val="center"/>
-          </w:tcPr>
-          <w:p>
-            <w:r>
-              <w:rPr>
-                <w:b w:val="false"/>
-                <w:bCs w:val="false"/>
-                <w:sz w:val="18"/>
-                <w:szCs w:val="18"/>
-              </w:rPr>
-              <w:t xml:space="preserve">5A1522F/G/H (central / VA / VV)</w:t>
-            </w:r>
-          </w:p>
-        </w:tc>
-        <w:tc>
-          <w:tcPr>
-            <w:tcW w:type="dxa" w:w="1900"/>
-            <w:tcBorders>
-              <w:top w:val="single" w:color="B7C6DA" w:sz="1"/>
-              <w:left w:val="single" w:color="B7C6DA" w:sz="1"/>
-              <w:bottom w:val="single" w:color="B7C6DA" w:sz="1"/>
-              <w:right w:val="single" w:color="B7C6DA" w:sz="1"/>
-            </w:tcBorders>
-            <w:shd w:fill="EAF1F8" w:val="clear"/>
-            <w:tcMar>
-              <w:top w:type="dxa" w:w="60"/>
-              <w:left w:type="dxa" w:w="110"/>
-              <w:bottom w:type="dxa" w:w="60"/>
-              <w:right w:type="dxa" w:w="110"/>
-            </w:tcMar>
-            <w:vAlign w:val="center"/>
-          </w:tcPr>
-          <w:p>
-            <w:r>
-              <w:rPr>
-                <w:b w:val="false"/>
-                <w:bCs w:val="false"/>
-                <w:sz w:val="18"/>
-                <w:szCs w:val="18"/>
-              </w:rPr>
-              <w:t xml:space="preserve">Pre-MDC 003 (wt 21.2)</w:t>
-            </w:r>
-          </w:p>
-        </w:tc>
-        <w:tc>
-          <w:tcPr>
-            <w:tcW w:type="dxa" w:w="2500"/>
-            <w:tcBorders>
-              <w:top w:val="single" w:color="B7C6DA" w:sz="1"/>
-              <w:left w:val="single" w:color="B7C6DA" w:sz="1"/>
-              <w:bottom w:val="single" w:color="B7C6DA" w:sz="1"/>
-              <w:right w:val="single" w:color="B7C6DA" w:sz="1"/>
-            </w:tcBorders>
-            <w:shd w:fill="EAF1F8" w:val="clear"/>
-            <w:tcMar>
-              <w:top w:type="dxa" w:w="60"/>
-              <w:left w:type="dxa" w:w="110"/>
-              <w:bottom w:type="dxa" w:w="60"/>
-              <w:right w:type="dxa" w:w="110"/>
-            </w:tcMar>
-            <w:vAlign w:val="center"/>
-          </w:tcPr>
-          <w:p>
-            <w:r>
-              <w:rPr>
-                <w:b w:val="false"/>
-                <w:bCs w:val="false"/>
-                <w:sz w:val="18"/>
-                <w:szCs w:val="18"/>
-              </w:rPr>
-              <w:t xml:space="preserve">Configuration (VA/VV, central/peripheral), cannulation &amp; decannulation times</w:t>
-            </w:r>
-          </w:p>
-        </w:tc>
-      </w:tr>
-      <w:tr>
-        <w:tc>
-          <w:tcPr>
-            <w:tcW w:type="dxa" w:w="2300"/>
-            <w:tcBorders>
-              <w:top w:val="single" w:color="B7C6DA" w:sz="1"/>
-              <w:left w:val="single" w:color="B7C6DA" w:sz="1"/>
-              <w:bottom w:val="single" w:color="B7C6DA" w:sz="1"/>
-              <w:right w:val="single" w:color="B7C6DA" w:sz="1"/>
-            </w:tcBorders>
-            <w:shd w:fill="FFFFFF" w:val="clear"/>
-            <w:tcMar>
-              <w:top w:type="dxa" w:w="60"/>
-              <w:left w:type="dxa" w:w="110"/>
-              <w:bottom w:type="dxa" w:w="60"/>
-              <w:right w:type="dxa" w:w="110"/>
-            </w:tcMar>
-            <w:vAlign w:val="center"/>
-          </w:tcPr>
-          <w:p>
-            <w:r>
-              <w:rPr>
-                <w:b/>
-                <w:bCs/>
-                <w:sz w:val="18"/>
-                <w:szCs w:val="18"/>
-              </w:rPr>
-              <w:t xml:space="preserve">Mechanical circulatory support</w:t>
-            </w:r>
-          </w:p>
-        </w:tc>
-        <w:tc>
-          <w:tcPr>
-            <w:tcW w:type="dxa" w:w="2660"/>
-            <w:tcBorders>
-              <w:top w:val="single" w:color="B7C6DA" w:sz="1"/>
-              <w:left w:val="single" w:color="B7C6DA" w:sz="1"/>
-              <w:bottom w:val="single" w:color="B7C6DA" w:sz="1"/>
-              <w:right w:val="single" w:color="B7C6DA" w:sz="1"/>
-            </w:tcBorders>
-            <w:shd w:fill="FFFFFF" w:val="clear"/>
-            <w:tcMar>
-              <w:top w:type="dxa" w:w="60"/>
-              <w:left w:type="dxa" w:w="110"/>
-              <w:bottom w:type="dxa" w:w="60"/>
-              <w:right w:type="dxa" w:w="110"/>
-            </w:tcMar>
-            <w:vAlign w:val="center"/>
-          </w:tcPr>
-          <w:p>
-            <w:r>
-              <w:rPr>
-                <w:b w:val="false"/>
-                <w:bCs w:val="false"/>
-                <w:sz w:val="18"/>
-                <w:szCs w:val="18"/>
-              </w:rPr>
-              <w:t xml:space="preserve">5A02… (IABP/Impella/pVAD; verify)</w:t>
-            </w:r>
-          </w:p>
-        </w:tc>
-        <w:tc>
-          <w:tcPr>
-            <w:tcW w:type="dxa" w:w="1900"/>
-            <w:tcBorders>
-              <w:top w:val="single" w:color="B7C6DA" w:sz="1"/>
-              <w:left w:val="single" w:color="B7C6DA" w:sz="1"/>
-              <w:bottom w:val="single" w:color="B7C6DA" w:sz="1"/>
-              <w:right w:val="single" w:color="B7C6DA" w:sz="1"/>
-            </w:tcBorders>
-            <w:shd w:fill="FFFFFF" w:val="clear"/>
-            <w:tcMar>
-              <w:top w:type="dxa" w:w="60"/>
-              <w:left w:type="dxa" w:w="110"/>
-              <w:bottom w:type="dxa" w:w="60"/>
-              <w:right w:type="dxa" w:w="110"/>
-            </w:tcMar>
-            <w:vAlign w:val="center"/>
-          </w:tcPr>
-          <w:p>
-            <w:r>
-              <w:rPr>
-                <w:b w:val="false"/>
-                <w:bCs w:val="false"/>
-                <w:sz w:val="18"/>
-                <w:szCs w:val="18"/>
-              </w:rPr>
-              <w:t xml:space="preserve">High cardiac DRGs</w:t>
-            </w:r>
-          </w:p>
-        </w:tc>
-        <w:tc>
-          <w:tcPr>
-            <w:tcW w:type="dxa" w:w="2500"/>
-            <w:tcBorders>
-              <w:top w:val="single" w:color="B7C6DA" w:sz="1"/>
-              <w:left w:val="single" w:color="B7C6DA" w:sz="1"/>
-              <w:bottom w:val="single" w:color="B7C6DA" w:sz="1"/>
-              <w:right w:val="single" w:color="B7C6DA" w:sz="1"/>
-            </w:tcBorders>
-            <w:shd w:fill="FFFFFF" w:val="clear"/>
-            <w:tcMar>
-              <w:top w:type="dxa" w:w="60"/>
-              <w:left w:type="dxa" w:w="110"/>
-              <w:bottom w:type="dxa" w:w="60"/>
-              <w:right w:type="dxa" w:w="110"/>
-            </w:tcMar>
-            <w:vAlign w:val="center"/>
-          </w:tcPr>
-          <w:p>
-            <w:r>
-              <w:rPr>
-                <w:b w:val="false"/>
-                <w:bCs w:val="false"/>
-                <w:sz w:val="18"/>
-                <w:szCs w:val="18"/>
-              </w:rPr>
-              <w:t xml:space="preserve">Device type, intermittent vs continuous, insertion/removal times</w:t>
-            </w:r>
-          </w:p>
-        </w:tc>
-      </w:tr>
-      <w:tr>
-        <w:tc>
-          <w:tcPr>
-            <w:tcW w:type="dxa" w:w="2300"/>
-            <w:tcBorders>
-              <w:top w:val="single" w:color="B7C6DA" w:sz="1"/>
-              <w:left w:val="single" w:color="B7C6DA" w:sz="1"/>
-              <w:bottom w:val="single" w:color="B7C6DA" w:sz="1"/>
-              <w:right w:val="single" w:color="B7C6DA" w:sz="1"/>
-            </w:tcBorders>
-            <w:shd w:fill="EAF1F8" w:val="clear"/>
-            <w:tcMar>
-              <w:top w:type="dxa" w:w="60"/>
-              <w:left w:type="dxa" w:w="110"/>
-              <w:bottom w:type="dxa" w:w="60"/>
-              <w:right w:type="dxa" w:w="110"/>
-            </w:tcMar>
-            <w:vAlign w:val="center"/>
-          </w:tcPr>
-          <w:p>
-            <w:r>
-              <w:rPr>
-                <w:b/>
-                <w:bCs/>
-                <w:sz w:val="18"/>
-                <w:szCs w:val="18"/>
-              </w:rPr>
-              <w:t xml:space="preserve">Mechanical ventilation</w:t>
-            </w:r>
-          </w:p>
-        </w:tc>
-        <w:tc>
-          <w:tcPr>
-            <w:tcW w:type="dxa" w:w="2660"/>
-            <w:tcBorders>
-              <w:top w:val="single" w:color="B7C6DA" w:sz="1"/>
-              <w:left w:val="single" w:color="B7C6DA" w:sz="1"/>
-              <w:bottom w:val="single" w:color="B7C6DA" w:sz="1"/>
-              <w:right w:val="single" w:color="B7C6DA" w:sz="1"/>
-            </w:tcBorders>
-            <w:shd w:fill="EAF1F8" w:val="clear"/>
-            <w:tcMar>
-              <w:top w:type="dxa" w:w="60"/>
-              <w:left w:type="dxa" w:w="110"/>
-              <w:bottom w:type="dxa" w:w="60"/>
-              <w:right w:type="dxa" w:w="110"/>
-            </w:tcMar>
-            <w:vAlign w:val="center"/>
-          </w:tcPr>
-          <w:p>
-            <w:r>
-              <w:rPr>
-                <w:b w:val="false"/>
-                <w:bCs w:val="false"/>
-                <w:sz w:val="18"/>
-                <w:szCs w:val="18"/>
-              </w:rPr>
-              <w:t xml:space="preserve">5A1935Z / 45Z / 55Z (&lt;24 / 24–96 / &gt;96h)</w:t>
-            </w:r>
-          </w:p>
-        </w:tc>
-        <w:tc>
-          <w:tcPr>
-            <w:tcW w:type="dxa" w:w="1900"/>
-            <w:tcBorders>
-              <w:top w:val="single" w:color="B7C6DA" w:sz="1"/>
-              <w:left w:val="single" w:color="B7C6DA" w:sz="1"/>
-              <w:bottom w:val="single" w:color="B7C6DA" w:sz="1"/>
-              <w:right w:val="single" w:color="B7C6DA" w:sz="1"/>
-            </w:tcBorders>
-            <w:shd w:fill="EAF1F8" w:val="clear"/>
-            <w:tcMar>
-              <w:top w:type="dxa" w:w="60"/>
-              <w:left w:type="dxa" w:w="110"/>
-              <w:bottom w:type="dxa" w:w="60"/>
-              <w:right w:type="dxa" w:w="110"/>
-            </w:tcMar>
-            <w:vAlign w:val="center"/>
-          </w:tcPr>
-          <w:p>
-            <w:r>
-              <w:rPr>
-                <w:b w:val="false"/>
-                <w:bCs w:val="false"/>
-                <w:sz w:val="18"/>
-                <w:szCs w:val="18"/>
-              </w:rPr>
-              <w:t xml:space="preserve">DRG 207 vs 208; feeds 003/004/870</w:t>
-            </w:r>
-          </w:p>
-        </w:tc>
-        <w:tc>
-          <w:tcPr>
-            <w:tcW w:type="dxa" w:w="2500"/>
-            <w:tcBorders>
-              <w:top w:val="single" w:color="B7C6DA" w:sz="1"/>
-              <w:left w:val="single" w:color="B7C6DA" w:sz="1"/>
-              <w:bottom w:val="single" w:color="B7C6DA" w:sz="1"/>
-              <w:right w:val="single" w:color="B7C6DA" w:sz="1"/>
-            </w:tcBorders>
-            <w:shd w:fill="EAF1F8" w:val="clear"/>
-            <w:tcMar>
-              <w:top w:type="dxa" w:w="60"/>
-              <w:left w:type="dxa" w:w="110"/>
-              <w:bottom w:type="dxa" w:w="60"/>
-              <w:right w:type="dxa" w:w="110"/>
-            </w:tcMar>
-            <w:vAlign w:val="center"/>
-          </w:tcPr>
-          <w:p>
-            <w:r>
-              <w:rPr>
-                <w:b w:val="false"/>
-                <w:bCs w:val="false"/>
-                <w:sz w:val="18"/>
-                <w:szCs w:val="18"/>
-              </w:rPr>
-              <w:t xml:space="preserve">Intubation &amp; extubation times; invasive vs BiPAP</w:t>
-            </w:r>
-          </w:p>
-        </w:tc>
-      </w:tr>
-      <w:tr>
-        <w:tc>
-          <w:tcPr>
-            <w:tcW w:type="dxa" w:w="2300"/>
-            <w:tcBorders>
-              <w:top w:val="single" w:color="B7C6DA" w:sz="1"/>
-              <w:left w:val="single" w:color="B7C6DA" w:sz="1"/>
-              <w:bottom w:val="single" w:color="B7C6DA" w:sz="1"/>
-              <w:right w:val="single" w:color="B7C6DA" w:sz="1"/>
-            </w:tcBorders>
-            <w:shd w:fill="FFFFFF" w:val="clear"/>
-            <w:tcMar>
-              <w:top w:type="dxa" w:w="60"/>
-              <w:left w:type="dxa" w:w="110"/>
-              <w:bottom w:type="dxa" w:w="60"/>
-              <w:right w:type="dxa" w:w="110"/>
-            </w:tcMar>
-            <w:vAlign w:val="center"/>
-          </w:tcPr>
-          <w:p>
-            <w:r>
-              <w:rPr>
-                <w:b/>
-                <w:bCs/>
-                <w:sz w:val="18"/>
-                <w:szCs w:val="18"/>
-              </w:rPr>
-              <w:t xml:space="preserve">CRRT / dialysis</w:t>
-            </w:r>
-          </w:p>
-        </w:tc>
-        <w:tc>
-          <w:tcPr>
-            <w:tcW w:type="dxa" w:w="2660"/>
-            <w:tcBorders>
-              <w:top w:val="single" w:color="B7C6DA" w:sz="1"/>
-              <w:left w:val="single" w:color="B7C6DA" w:sz="1"/>
-              <w:bottom w:val="single" w:color="B7C6DA" w:sz="1"/>
-              <w:right w:val="single" w:color="B7C6DA" w:sz="1"/>
-            </w:tcBorders>
-            <w:shd w:fill="FFFFFF" w:val="clear"/>
-            <w:tcMar>
-              <w:top w:type="dxa" w:w="60"/>
-              <w:left w:type="dxa" w:w="110"/>
-              <w:bottom w:type="dxa" w:w="60"/>
-              <w:right w:type="dxa" w:w="110"/>
-            </w:tcMar>
-            <w:vAlign w:val="center"/>
-          </w:tcPr>
-          <w:p>
-            <w:r>
-              <w:rPr>
-                <w:b w:val="false"/>
-                <w:bCs w:val="false"/>
-                <w:sz w:val="18"/>
-                <w:szCs w:val="18"/>
-              </w:rPr>
-              <w:t xml:space="preserve">5A1D90Z continuous / 5A1D70Z intermittent</w:t>
-            </w:r>
-          </w:p>
-        </w:tc>
-        <w:tc>
-          <w:tcPr>
-            <w:tcW w:type="dxa" w:w="1900"/>
-            <w:tcBorders>
-              <w:top w:val="single" w:color="B7C6DA" w:sz="1"/>
-              <w:left w:val="single" w:color="B7C6DA" w:sz="1"/>
-              <w:bottom w:val="single" w:color="B7C6DA" w:sz="1"/>
-              <w:right w:val="single" w:color="B7C6DA" w:sz="1"/>
-            </w:tcBorders>
-            <w:shd w:fill="FFFFFF" w:val="clear"/>
-            <w:tcMar>
-              <w:top w:type="dxa" w:w="60"/>
-              <w:left w:type="dxa" w:w="110"/>
-              <w:bottom w:type="dxa" w:w="60"/>
-              <w:right w:type="dxa" w:w="110"/>
-            </w:tcMar>
-            <w:vAlign w:val="center"/>
-          </w:tcPr>
-          <w:p>
-            <w:r>
-              <w:rPr>
-                <w:b w:val="false"/>
-                <w:bCs w:val="false"/>
-                <w:sz w:val="18"/>
-                <w:szCs w:val="18"/>
-              </w:rPr>
-              <w:t xml:space="preserve">Supports N17 (CC); low standalone</w:t>
-            </w:r>
-          </w:p>
-        </w:tc>
-        <w:tc>
-          <w:tcPr>
-            <w:tcW w:type="dxa" w:w="2500"/>
-            <w:tcBorders>
-              <w:top w:val="single" w:color="B7C6DA" w:sz="1"/>
-              <w:left w:val="single" w:color="B7C6DA" w:sz="1"/>
-              <w:bottom w:val="single" w:color="B7C6DA" w:sz="1"/>
-              <w:right w:val="single" w:color="B7C6DA" w:sz="1"/>
-            </w:tcBorders>
-            <w:shd w:fill="FFFFFF" w:val="clear"/>
-            <w:tcMar>
-              <w:top w:type="dxa" w:w="60"/>
-              <w:left w:type="dxa" w:w="110"/>
-              <w:bottom w:type="dxa" w:w="60"/>
-              <w:right w:type="dxa" w:w="110"/>
-            </w:tcMar>
-            <w:vAlign w:val="center"/>
-          </w:tcPr>
-          <w:p>
-            <w:r>
-              <w:rPr>
-                <w:b w:val="false"/>
-                <w:bCs w:val="false"/>
-                <w:sz w:val="18"/>
-                <w:szCs w:val="18"/>
-              </w:rPr>
-              <w:t xml:space="preserve">Modality, continuous &gt;18h, link to acute kidney failure</w:t>
-            </w:r>
-          </w:p>
-        </w:tc>
-      </w:tr>
-      <w:tr>
-        <w:tc>
-          <w:tcPr>
-            <w:tcW w:type="dxa" w:w="2300"/>
-            <w:tcBorders>
-              <w:top w:val="single" w:color="B7C6DA" w:sz="1"/>
-              <w:left w:val="single" w:color="B7C6DA" w:sz="1"/>
-              <w:bottom w:val="single" w:color="B7C6DA" w:sz="1"/>
-              <w:right w:val="single" w:color="B7C6DA" w:sz="1"/>
-            </w:tcBorders>
-            <w:shd w:fill="EAF1F8" w:val="clear"/>
-            <w:tcMar>
-              <w:top w:type="dxa" w:w="60"/>
-              <w:left w:type="dxa" w:w="110"/>
-              <w:bottom w:type="dxa" w:w="60"/>
-              <w:right w:type="dxa" w:w="110"/>
-            </w:tcMar>
-            <w:vAlign w:val="center"/>
-          </w:tcPr>
-          <w:p>
-            <w:r>
-              <w:rPr>
-                <w:b/>
-                <w:bCs/>
-                <w:sz w:val="18"/>
-                <w:szCs w:val="18"/>
-              </w:rPr>
-              <w:t xml:space="preserve">Therapeutic hypothermia / TTM</w:t>
-            </w:r>
-          </w:p>
-        </w:tc>
-        <w:tc>
-          <w:tcPr>
-            <w:tcW w:type="dxa" w:w="2660"/>
-            <w:tcBorders>
-              <w:top w:val="single" w:color="B7C6DA" w:sz="1"/>
-              <w:left w:val="single" w:color="B7C6DA" w:sz="1"/>
-              <w:bottom w:val="single" w:color="B7C6DA" w:sz="1"/>
-              <w:right w:val="single" w:color="B7C6DA" w:sz="1"/>
-            </w:tcBorders>
-            <w:shd w:fill="EAF1F8" w:val="clear"/>
-            <w:tcMar>
-              <w:top w:type="dxa" w:w="60"/>
-              <w:left w:type="dxa" w:w="110"/>
-              <w:bottom w:type="dxa" w:w="60"/>
-              <w:right w:type="dxa" w:w="110"/>
-            </w:tcMar>
-            <w:vAlign w:val="center"/>
-          </w:tcPr>
-          <w:p>
-            <w:r>
-              <w:rPr>
-                <w:b w:val="false"/>
-                <w:bCs w:val="false"/>
-                <w:sz w:val="18"/>
-                <w:szCs w:val="18"/>
-              </w:rPr>
-              <w:t xml:space="preserve">6A4Z0ZZ / 6A4Z1ZZ</w:t>
-            </w:r>
-          </w:p>
-        </w:tc>
-        <w:tc>
-          <w:tcPr>
-            <w:tcW w:type="dxa" w:w="1900"/>
-            <w:tcBorders>
-              <w:top w:val="single" w:color="B7C6DA" w:sz="1"/>
-              <w:left w:val="single" w:color="B7C6DA" w:sz="1"/>
-              <w:bottom w:val="single" w:color="B7C6DA" w:sz="1"/>
-              <w:right w:val="single" w:color="B7C6DA" w:sz="1"/>
-            </w:tcBorders>
-            <w:shd w:fill="EAF1F8" w:val="clear"/>
-            <w:tcMar>
-              <w:top w:type="dxa" w:w="60"/>
-              <w:left w:type="dxa" w:w="110"/>
-              <w:bottom w:type="dxa" w:w="60"/>
-              <w:right w:type="dxa" w:w="110"/>
-            </w:tcMar>
-            <w:vAlign w:val="center"/>
-          </w:tcPr>
-          <w:p>
-            <w:r>
-              <w:rPr>
-                <w:b w:val="false"/>
-                <w:bCs w:val="false"/>
-                <w:sz w:val="18"/>
-                <w:szCs w:val="18"/>
-              </w:rPr>
-              <w:t xml:space="preserve">Supportive</w:t>
-            </w:r>
-          </w:p>
-        </w:tc>
-        <w:tc>
-          <w:tcPr>
-            <w:tcW w:type="dxa" w:w="2500"/>
-            <w:tcBorders>
-              <w:top w:val="single" w:color="B7C6DA" w:sz="1"/>
-              <w:left w:val="single" w:color="B7C6DA" w:sz="1"/>
-              <w:bottom w:val="single" w:color="B7C6DA" w:sz="1"/>
-              <w:right w:val="single" w:color="B7C6DA" w:sz="1"/>
-            </w:tcBorders>
-            <w:shd w:fill="EAF1F8" w:val="clear"/>
-            <w:tcMar>
-              <w:top w:type="dxa" w:w="60"/>
-              <w:left w:type="dxa" w:w="110"/>
-              <w:bottom w:type="dxa" w:w="60"/>
-              <w:right w:type="dxa" w:w="110"/>
-            </w:tcMar>
-            <w:vAlign w:val="center"/>
-          </w:tcPr>
-          <w:p>
-            <w:r>
-              <w:rPr>
-                <w:b w:val="false"/>
-                <w:bCs w:val="false"/>
-                <w:sz w:val="18"/>
-                <w:szCs w:val="18"/>
-              </w:rPr>
-              <w:t xml:space="preserve">Indication (post-arrest), single vs multiple</w:t>
-            </w:r>
-          </w:p>
-        </w:tc>
-      </w:tr>
-    </w:tbl>
-    <w:p>
-      <w:pPr>
-        <w:spacing w:after="80"/>
-      </w:pPr>
-      <w:r>
-        <w:rPr>
-          <w:b w:val="false"/>
-          <w:bCs w:val="false"/>
-          <w:i/>
-          <w:iCs/>
-          <w:sz w:val="16"/>
-          <w:szCs w:val="16"/>
-        </w:rPr>
-        <w:t xml:space="preserve">Weights are FY2026 MS-DRG relative weights (CMS IPPS Final Rule, Table 5). Trach and ECMO are Pre-MDC (grouped before organ system) — the richest cases in the ICU. Mechanical circulatory support codes vary by device; verify the exact code and current grouper.</w:t>
-      </w:r>
-    </w:p>
-    <w:p>
-      <w:pPr>
-        <w:pStyle w:val="Heading2"/>
-      </w:pPr>
-      <w:r>
-        <w:t xml:space="preserve">How to write the note so it's captured</w:t>
-      </w:r>
-    </w:p>
-    <w:p>
-      <w:pPr>
-        <w:spacing w:after="40"/>
-      </w:pPr>
-      <w:r>
-        <w:rPr>
-          <w:b w:val="false"/>
-          <w:bCs w:val="false"/>
-          <w:i w:val="false"/>
-          <w:iCs w:val="false"/>
-          <w:sz w:val="20"/>
-          <w:szCs w:val="20"/>
-        </w:rPr>
-        <w:t xml:space="preserve">Drop a dated, structured one-liner in the procedure note and carry it forward in the daily assessment — each line gives the coder the axes they need (approach, device, configuration, timestamps):</w:t>
-      </w:r>
-    </w:p>
-    <w:p>
-      <w:pPr>
-        <w:pBdr>
-          <w:left w:val="single" w:color="2E75B6" w:sz="18" w:space="6"/>
-        </w:pBdr>
-        <w:shd w:fill="EAF1F8" w:val="clear"/>
-        <w:spacing w:after="160" w:before="40"/>
-      </w:pPr>
-      <w:r>
-        <w:rPr>
-          <w:i/>
-          <w:iCs/>
-          <w:sz w:val="20"/>
-          <w:szCs w:val="20"/>
-        </w:rPr>
-        <w:t xml:space="preserve">“Invasive mechanical ventilation via ETT, continuous since [date/time]; remains ventilated (or extubated [date/time]).”</w:t>
-      </w:r>
-      <w:r>
-        <w:rPr>
-          <w:i/>
-          <w:iCs/>
-          <w:sz w:val="20"/>
-          <w:szCs w:val="20"/>
-        </w:rPr>
-        <w:br/>
-        <w:t xml:space="preserve">“CRRT (CVVHDF), continuous, initiated [date/time], for acute kidney failure / ATN.”</w:t>
-      </w:r>
-      <w:r>
-        <w:rPr>
-          <w:i/>
-          <w:iCs/>
-          <w:sz w:val="20"/>
-          <w:szCs w:val="20"/>
-        </w:rPr>
-        <w:br/>
-        <w:t xml:space="preserve">“Percutaneous tracheostomy performed [date]; tracheostomy tube placed.”</w:t>
-      </w:r>
-      <w:r>
-        <w:rPr>
-          <w:i/>
-          <w:iCs/>
-          <w:sz w:val="20"/>
-          <w:szCs w:val="20"/>
-        </w:rPr>
-        <w:br/>
-        <w:t xml:space="preserve">“VV ECMO, peripheral cannulation, initiated [date/time]; ongoing.”</w:t>
-      </w:r>
-    </w:p>
-    <w:p>
-      <w:pPr>
-        <w:pStyle w:val="ListParagraph"/>
-        <w:numPr>
-          <w:ilvl w:val="0"/>
-          <w:numId w:val="2"/>
-        </w:numPr>
-        <w:spacing w:after="60"/>
-      </w:pPr>
-      <w:r>
-        <w:rPr>
-          <w:b/>
-          <w:bCs/>
-          <w:i w:val="false"/>
-          <w:iCs w:val="false"/>
-          <w:sz w:val="20"/>
-          <w:szCs w:val="20"/>
-        </w:rPr>
-        <w:t xml:space="preserve">Timestamps over adjectives. </w:t>
-      </w:r>
-      <w:r>
-        <w:rPr>
-          <w:b w:val="false"/>
-          <w:bCs w:val="false"/>
-          <w:i w:val="false"/>
-          <w:iCs w:val="false"/>
-          <w:sz w:val="20"/>
-          <w:szCs w:val="20"/>
-        </w:rPr>
-        <w:t xml:space="preserve">Every vent/ECMO/CRRT duration code is computed from documented start/stop times.</w:t>
-      </w:r>
-    </w:p>
-    <w:p>
-      <w:pPr>
-        <w:pStyle w:val="ListParagraph"/>
-        <w:numPr>
-          <w:ilvl w:val="0"/>
-          <w:numId w:val="2"/>
-        </w:numPr>
-        <w:spacing w:after="60"/>
-      </w:pPr>
-      <w:r>
-        <w:rPr>
-          <w:b/>
-          <w:bCs/>
-          <w:i w:val="false"/>
-          <w:iCs w:val="false"/>
-          <w:sz w:val="20"/>
-          <w:szCs w:val="20"/>
-        </w:rPr>
-        <w:t xml:space="preserve">Name the modality. </w:t>
-      </w:r>
-      <w:r>
-        <w:rPr>
-          <w:b w:val="false"/>
-          <w:bCs w:val="false"/>
-          <w:i w:val="false"/>
-          <w:iCs w:val="false"/>
-          <w:sz w:val="20"/>
-          <w:szCs w:val="20"/>
-        </w:rPr>
-        <w:t xml:space="preserve">Continuous CRRT vs intermittent HD; invasive ventilation vs BiPAP; VA vs VV ECMO.</w:t>
-      </w:r>
-    </w:p>
-    <w:p>
-      <w:pPr>
-        <w:pStyle w:val="ListParagraph"/>
-        <w:numPr>
-          <w:ilvl w:val="0"/>
-          <w:numId w:val="2"/>
-        </w:numPr>
-        <w:spacing w:after="60"/>
-      </w:pPr>
-      <w:r>
-        <w:rPr>
-          <w:b/>
-          <w:bCs/>
-          <w:i w:val="false"/>
-          <w:iCs w:val="false"/>
-          <w:sz w:val="20"/>
-          <w:szCs w:val="20"/>
-        </w:rPr>
-        <w:t xml:space="preserve">Link the procedure to its diagnosis. </w:t>
-      </w:r>
-      <w:r>
-        <w:rPr>
-          <w:b w:val="false"/>
-          <w:bCs w:val="false"/>
-          <w:i w:val="false"/>
-          <w:iCs w:val="false"/>
-          <w:sz w:val="20"/>
-          <w:szCs w:val="20"/>
-        </w:rPr>
-        <w:t xml:space="preserve">CRRT only earns its keep when the acute kidney failure (N17, a CC) is documented and coded.</w:t>
-      </w:r>
-    </w:p>
-    <w:p>
-      <w:pPr>
-        <w:pStyle w:val="ListParagraph"/>
-        <w:numPr>
-          <w:ilvl w:val="0"/>
-          <w:numId w:val="2"/>
-        </w:numPr>
-        <w:spacing w:after="60"/>
-      </w:pPr>
-      <w:r>
-        <w:rPr>
-          <w:b/>
-          <w:bCs/>
-          <w:i w:val="false"/>
-          <w:iCs w:val="false"/>
-          <w:sz w:val="20"/>
-          <w:szCs w:val="20"/>
-        </w:rPr>
-        <w:t xml:space="preserve">New procedure vs chronic status. </w:t>
-      </w:r>
-      <w:r>
-        <w:rPr>
-          <w:b w:val="false"/>
-          <w:bCs w:val="false"/>
-          <w:i w:val="false"/>
-          <w:iCs w:val="false"/>
-          <w:sz w:val="20"/>
-          <w:szCs w:val="20"/>
-        </w:rPr>
-        <w:t xml:space="preserve">A trach placed this stay drives 003/004; “chronically trached/vented at baseline” is a status code and does not.</w:t>
-      </w:r>
-    </w:p>
-    <w:p>
-      <w:pPr>
-        <w:spacing w:after="120"/>
-      </w:pPr>
-      <w:r>
-        <w:rPr>
-          <w:b w:val="false"/>
-          <w:bCs w:val="false"/>
-          <w:i/>
-          <w:iCs/>
-          <w:sz w:val="16"/>
-          <w:szCs w:val="16"/>
-        </w:rPr>
-        <w:t xml:space="preserve">PCS-to-DRG assignment changes annually; verify codes against the current ICD-10-PCS tables, the FY2026 MS-DRG Definitions Manual, and AHA Coding Clinic (which governs ventilation hour-counting and reintubation).</w:t>
-      </w:r>
-    </w:p>
-    <w:p>
-      <w:r>
-        <w:br w:type="page"/>
-      </w:r>
-    </w:p>
-    <w:p>
-      <w:pPr>
-        <w:pStyle w:val="Heading1"/>
-      </w:pPr>
-      <w:r>
-        <w:t xml:space="preserve">7. Common ICU Diagnoses (ICD-10) &amp; Specificity</w:t>
+        <w:t xml:space="preserve">6. Common ICU Diagnoses (ICD-10) &amp; Specificity</w:t>
       </w:r>
     </w:p>
     <w:p>
@@ -12859,40 +9498,6 @@
           <w:szCs w:val="20"/>
         </w:rPr>
         <w:t xml:space="preserve">CodingIntel — CPT vs CMS critical care rules; AAPC / FindACode code references; FastRVU 2026 per-code RVU pages</w:t>
-      </w:r>
-    </w:p>
-    <w:p>
-      <w:pPr>
-        <w:pStyle w:val="ListParagraph"/>
-        <w:numPr>
-          <w:ilvl w:val="0"/>
-          <w:numId w:val="2"/>
-        </w:numPr>
-        <w:spacing w:after="60"/>
-      </w:pPr>
-      <w:r>
-        <w:rPr>
-          <w:sz w:val="20"/>
-          <w:szCs w:val="20"/>
-        </w:rPr>
-        <w:t xml:space="preserve">CMS — ICD-10 MS-DRG Definitions Manual v43.0 (FY2026) and FY2026 IPPS Final Rule Table 5 (DRG relative weights); CMS ICD-10-PCS code tables and reference manual.</w:t>
-      </w:r>
-    </w:p>
-    <w:p>
-      <w:pPr>
-        <w:pStyle w:val="ListParagraph"/>
-        <w:numPr>
-          <w:ilvl w:val="0"/>
-          <w:numId w:val="2"/>
-        </w:numPr>
-        <w:spacing w:after="60"/>
-      </w:pPr>
-      <w:r>
-        <w:rPr>
-          <w:sz w:val="20"/>
-          <w:szCs w:val="20"/>
-        </w:rPr>
-        <w:t xml:space="preserve">AHA Coding Clinic for ICD-10-CM/PCS — mechanical ventilation hour counting, tracheostomy, ECMO, and renal replacement therapy coding.</w:t>
       </w:r>
     </w:p>
     <w:sectPr>

</xml_diff>